<commit_message>
Update file tsconfig.json pada folder api
</commit_message>
<xml_diff>
--- a/Dokumentasi/24382001P_Lorensius Firngadi_Dokumentasi Sesi 3.docx
+++ b/Dokumentasi/24382001P_Lorensius Firngadi_Dokumentasi Sesi 3.docx
@@ -12,21 +12,12 @@
           <w:bCs/>
         </w:rPr>
       </w:pPr>
-      <w:proofErr w:type="spellStart"/>
       <w:r>
         <w:rPr>
           <w:b/>
           <w:bCs/>
         </w:rPr>
-        <w:t>Tugas</w:t>
-      </w:r>
-      <w:proofErr w:type="spellEnd"/>
-      <w:r>
-        <w:rPr>
-          <w:b/>
-          <w:bCs/>
-        </w:rPr>
-        <w:t xml:space="preserve"> Project</w:t>
+        <w:t>Tugas Project</w:t>
       </w:r>
     </w:p>
     <w:p>
@@ -60,39 +51,7 @@
           <w:b/>
           <w:bCs/>
         </w:rPr>
-        <w:t xml:space="preserve"> </w:t>
-      </w:r>
-      <w:proofErr w:type="spellStart"/>
-      <w:r>
-        <w:rPr>
-          <w:b/>
-          <w:bCs/>
-        </w:rPr>
-        <w:t>Pemrograman</w:t>
-      </w:r>
-      <w:proofErr w:type="spellEnd"/>
-      <w:r>
-        <w:rPr>
-          <w:b/>
-          <w:bCs/>
-        </w:rPr>
-        <w:t xml:space="preserve"> </w:t>
-      </w:r>
-      <w:proofErr w:type="spellStart"/>
-      <w:r>
-        <w:rPr>
-          <w:b/>
-          <w:bCs/>
-        </w:rPr>
-        <w:t>Berorientasi</w:t>
-      </w:r>
-      <w:proofErr w:type="spellEnd"/>
-      <w:r>
-        <w:rPr>
-          <w:b/>
-          <w:bCs/>
-        </w:rPr>
-        <w:t xml:space="preserve"> Service (IF 23 E)</w:t>
+        <w:t xml:space="preserve"> Pemrograman Berorientasi Service (IF 23 E)</w:t>
       </w:r>
     </w:p>
     <w:p>
@@ -107,43 +66,17 @@
         <w:contextualSpacing/>
         <w:jc w:val="both"/>
       </w:pPr>
-      <w:proofErr w:type="spellStart"/>
       <w:proofErr w:type="gramStart"/>
       <w:r>
-        <w:t>Kelompok</w:t>
-      </w:r>
-      <w:proofErr w:type="spellEnd"/>
-      <w:r>
-        <w:t xml:space="preserve"> :</w:t>
+        <w:t>Kelompok :</w:t>
       </w:r>
       <w:proofErr w:type="gramEnd"/>
       <w:r>
-        <w:t xml:space="preserve"> Ferdi, </w:t>
-      </w:r>
-      <w:proofErr w:type="spellStart"/>
-      <w:r>
-        <w:t>minum</w:t>
-      </w:r>
-      <w:proofErr w:type="spellEnd"/>
-      <w:r>
-        <w:t xml:space="preserve"> </w:t>
-      </w:r>
-      <w:proofErr w:type="spellStart"/>
-      <w:r>
-        <w:t>Paramex</w:t>
-      </w:r>
-      <w:proofErr w:type="spellEnd"/>
-      <w:r>
-        <w:t xml:space="preserve"> </w:t>
-      </w:r>
-      <w:proofErr w:type="spellStart"/>
+        <w:t xml:space="preserve"> Ferdi, minum Paramex </w:t>
+      </w:r>
       <w:proofErr w:type="gramStart"/>
       <w:r>
-        <w:t>dulu</w:t>
-      </w:r>
-      <w:proofErr w:type="spellEnd"/>
-      <w:r>
-        <w:t xml:space="preserve"> !</w:t>
+        <w:t>dulu !</w:t>
       </w:r>
       <w:proofErr w:type="gramEnd"/>
     </w:p>
@@ -160,22 +93,12 @@
         <w:contextualSpacing/>
         <w:jc w:val="both"/>
       </w:pPr>
-      <w:proofErr w:type="spellStart"/>
-      <w:r>
-        <w:t>Anggota</w:t>
-      </w:r>
-      <w:proofErr w:type="spellEnd"/>
-      <w:r>
-        <w:t xml:space="preserve"> </w:t>
-      </w:r>
-      <w:proofErr w:type="spellStart"/>
+      <w:r>
+        <w:t xml:space="preserve">Anggota </w:t>
+      </w:r>
       <w:proofErr w:type="gramStart"/>
       <w:r>
-        <w:t>Kelompok</w:t>
-      </w:r>
-      <w:proofErr w:type="spellEnd"/>
-      <w:r>
-        <w:t xml:space="preserve"> :</w:t>
+        <w:t>Kelompok :</w:t>
       </w:r>
       <w:proofErr w:type="gramEnd"/>
     </w:p>
@@ -189,29 +112,8 @@
         <w:spacing w:line="240" w:lineRule="auto"/>
         <w:jc w:val="both"/>
       </w:pPr>
-      <w:proofErr w:type="spellStart"/>
-      <w:r>
-        <w:t>Exsa</w:t>
-      </w:r>
-      <w:proofErr w:type="spellEnd"/>
-      <w:r>
-        <w:t xml:space="preserve"> </w:t>
-      </w:r>
-      <w:proofErr w:type="spellStart"/>
-      <w:r>
-        <w:t>Agdi</w:t>
-      </w:r>
-      <w:proofErr w:type="spellEnd"/>
-      <w:r>
-        <w:t xml:space="preserve"> </w:t>
-      </w:r>
-      <w:proofErr w:type="spellStart"/>
-      <w:r>
-        <w:t>Farhensen</w:t>
-      </w:r>
-      <w:proofErr w:type="spellEnd"/>
-      <w:r>
-        <w:t xml:space="preserve"> - 23312176</w:t>
+      <w:r>
+        <w:t>Exsa Agdi Farhensen - 23312176</w:t>
       </w:r>
     </w:p>
     <w:p>
@@ -224,21 +126,8 @@
         <w:spacing w:line="240" w:lineRule="auto"/>
         <w:jc w:val="both"/>
       </w:pPr>
-      <w:proofErr w:type="spellStart"/>
-      <w:r>
-        <w:t>Divka</w:t>
-      </w:r>
-      <w:proofErr w:type="spellEnd"/>
-      <w:r>
-        <w:t xml:space="preserve"> </w:t>
-      </w:r>
-      <w:proofErr w:type="spellStart"/>
-      <w:r>
-        <w:t>Ferdiansyah</w:t>
-      </w:r>
-      <w:proofErr w:type="spellEnd"/>
-      <w:r>
-        <w:t xml:space="preserve"> - 23312173</w:t>
+      <w:r>
+        <w:t>Divka Ferdiansyah - 23312173</w:t>
       </w:r>
     </w:p>
     <w:p>
@@ -251,13 +140,8 @@
         <w:spacing w:line="240" w:lineRule="auto"/>
         <w:jc w:val="both"/>
       </w:pPr>
-      <w:proofErr w:type="spellStart"/>
-      <w:r>
-        <w:t>Lorensius</w:t>
-      </w:r>
-      <w:proofErr w:type="spellEnd"/>
-      <w:r>
-        <w:t xml:space="preserve"> Firngadi - 24382001P</w:t>
+      <w:r>
+        <w:t>Lorensius Firngadi - 24382001P</w:t>
       </w:r>
     </w:p>
     <w:p>
@@ -273,13 +157,8 @@
         <w:contextualSpacing/>
         <w:jc w:val="both"/>
       </w:pPr>
-      <w:proofErr w:type="spellStart"/>
-      <w:r>
-        <w:t>Judul</w:t>
-      </w:r>
-      <w:proofErr w:type="spellEnd"/>
-      <w:r>
-        <w:t xml:space="preserve"> </w:t>
+      <w:r>
+        <w:t xml:space="preserve">Judul </w:t>
       </w:r>
       <w:proofErr w:type="gramStart"/>
       <w:r>
@@ -287,13 +166,8 @@
       </w:r>
       <w:proofErr w:type="gramEnd"/>
       <w:r>
-        <w:t xml:space="preserve"> </w:t>
-      </w:r>
-      <w:proofErr w:type="spellStart"/>
-      <w:r>
-        <w:t>CPMApp</w:t>
-      </w:r>
-      <w:proofErr w:type="spellEnd"/>
+        <w:t xml:space="preserve"> CPMApp</w:t>
+      </w:r>
     </w:p>
     <w:p>
       <w:pPr>
@@ -308,13 +182,8 @@
         <w:contextualSpacing/>
         <w:jc w:val="both"/>
       </w:pPr>
-      <w:proofErr w:type="spellStart"/>
-      <w:r>
-        <w:t>Deskripsi</w:t>
-      </w:r>
-      <w:proofErr w:type="spellEnd"/>
-      <w:r>
-        <w:t xml:space="preserve"> </w:t>
+      <w:r>
+        <w:t xml:space="preserve">Deskripsi </w:t>
       </w:r>
       <w:proofErr w:type="gramStart"/>
       <w:r>
@@ -328,163 +197,9 @@
         <w:contextualSpacing/>
         <w:jc w:val="both"/>
       </w:pPr>
-      <w:proofErr w:type="spellStart"/>
-      <w:r>
-        <w:t>sistem</w:t>
-      </w:r>
-      <w:proofErr w:type="spellEnd"/>
-      <w:r>
-        <w:t xml:space="preserve"> 2 </w:t>
-      </w:r>
-      <w:proofErr w:type="spellStart"/>
-      <w:r>
-        <w:t>pengguna</w:t>
-      </w:r>
-      <w:proofErr w:type="spellEnd"/>
-      <w:r>
-        <w:t xml:space="preserve"> admin dan costumer, admin </w:t>
-      </w:r>
-      <w:proofErr w:type="spellStart"/>
-      <w:r>
-        <w:t>bisa</w:t>
-      </w:r>
-      <w:proofErr w:type="spellEnd"/>
-      <w:r>
-        <w:t xml:space="preserve"> </w:t>
-      </w:r>
-      <w:proofErr w:type="spellStart"/>
-      <w:r>
-        <w:t>menambahkan</w:t>
-      </w:r>
-      <w:proofErr w:type="spellEnd"/>
-      <w:r>
-        <w:t xml:space="preserve"> </w:t>
-      </w:r>
-      <w:proofErr w:type="spellStart"/>
-      <w:r>
-        <w:t>tempat</w:t>
-      </w:r>
-      <w:proofErr w:type="spellEnd"/>
-      <w:r>
-        <w:t xml:space="preserve"> </w:t>
-      </w:r>
-      <w:proofErr w:type="spellStart"/>
-      <w:r>
-        <w:t>wisata</w:t>
-      </w:r>
-      <w:proofErr w:type="spellEnd"/>
-      <w:r>
-        <w:t xml:space="preserve">, </w:t>
-      </w:r>
-      <w:proofErr w:type="spellStart"/>
-      <w:r>
-        <w:t>foto</w:t>
-      </w:r>
-      <w:proofErr w:type="spellEnd"/>
-      <w:r>
-        <w:t xml:space="preserve">, </w:t>
-      </w:r>
-      <w:proofErr w:type="spellStart"/>
-      <w:r>
-        <w:t>deksripsi</w:t>
-      </w:r>
-      <w:proofErr w:type="spellEnd"/>
-      <w:r>
-        <w:t xml:space="preserve">, </w:t>
-      </w:r>
-      <w:proofErr w:type="spellStart"/>
-      <w:r>
-        <w:t>harga</w:t>
-      </w:r>
-      <w:proofErr w:type="spellEnd"/>
-      <w:r>
-        <w:t xml:space="preserve"> </w:t>
-      </w:r>
-      <w:proofErr w:type="spellStart"/>
-      <w:r>
-        <w:t>masuk</w:t>
-      </w:r>
-      <w:proofErr w:type="spellEnd"/>
-      <w:r>
-        <w:t xml:space="preserve">, dan </w:t>
-      </w:r>
-      <w:proofErr w:type="spellStart"/>
-      <w:r>
-        <w:t>menerima</w:t>
-      </w:r>
-      <w:proofErr w:type="spellEnd"/>
-      <w:r>
-        <w:t xml:space="preserve"> review costumer. costumer </w:t>
-      </w:r>
-      <w:proofErr w:type="spellStart"/>
-      <w:r>
-        <w:t>bisa</w:t>
-      </w:r>
-      <w:proofErr w:type="spellEnd"/>
-      <w:r>
-        <w:t xml:space="preserve"> </w:t>
-      </w:r>
-      <w:proofErr w:type="spellStart"/>
-      <w:r>
-        <w:t>melihat</w:t>
-      </w:r>
-      <w:proofErr w:type="spellEnd"/>
-      <w:r>
-        <w:t xml:space="preserve"> </w:t>
-      </w:r>
-      <w:proofErr w:type="spellStart"/>
-      <w:r>
-        <w:t>memberi</w:t>
-      </w:r>
-      <w:proofErr w:type="spellEnd"/>
-      <w:r>
-        <w:t xml:space="preserve"> </w:t>
-      </w:r>
-      <w:proofErr w:type="spellStart"/>
-      <w:r>
-        <w:t>komentar</w:t>
-      </w:r>
-      <w:proofErr w:type="spellEnd"/>
-      <w:r>
-        <w:t xml:space="preserve"> </w:t>
-      </w:r>
-      <w:proofErr w:type="spellStart"/>
-      <w:r>
-        <w:t>riview</w:t>
-      </w:r>
-      <w:proofErr w:type="spellEnd"/>
-      <w:r>
-        <w:t xml:space="preserve"> </w:t>
-      </w:r>
-      <w:proofErr w:type="spellStart"/>
-      <w:r>
-        <w:t>tempat</w:t>
-      </w:r>
-      <w:proofErr w:type="spellEnd"/>
-      <w:r>
-        <w:t xml:space="preserve"> </w:t>
-      </w:r>
-      <w:proofErr w:type="spellStart"/>
-      <w:r>
-        <w:t>wisata</w:t>
-      </w:r>
-      <w:proofErr w:type="spellEnd"/>
-      <w:r>
-        <w:t xml:space="preserve"> </w:t>
-      </w:r>
-      <w:proofErr w:type="spellStart"/>
-      <w:r>
-        <w:t>setelah</w:t>
-      </w:r>
-      <w:proofErr w:type="spellEnd"/>
-      <w:r>
-        <w:t xml:space="preserve"> </w:t>
-      </w:r>
-      <w:proofErr w:type="spellStart"/>
-      <w:r>
-        <w:t>mengunjungi</w:t>
-      </w:r>
-      <w:proofErr w:type="spellEnd"/>
+      <w:r>
+        <w:t>sistem 2 pengguna admin dan costumer, admin bisa menambahkan tempat wisata, foto, deksripsi, harga masuk, dan menerima review costumer. costumer bisa melihat memberi komentar riview tempat wisata setelah mengunjungi</w:t>
+      </w:r>
     </w:p>
     <w:p>
       <w:pPr>
@@ -507,21 +222,12 @@
           <w:bCs/>
         </w:rPr>
       </w:pPr>
-      <w:proofErr w:type="spellStart"/>
       <w:r>
         <w:rPr>
           <w:b/>
           <w:bCs/>
         </w:rPr>
-        <w:t>Dokumentasi</w:t>
-      </w:r>
-      <w:proofErr w:type="spellEnd"/>
-      <w:r>
-        <w:rPr>
-          <w:b/>
-          <w:bCs/>
-        </w:rPr>
-        <w:t xml:space="preserve"> Sesi 3.</w:t>
+        <w:t>Dokumentasi Sesi 3.</w:t>
       </w:r>
     </w:p>
     <w:p>
@@ -547,23 +253,7 @@
       </w:r>
       <w:proofErr w:type="gramEnd"/>
       <w:r>
-        <w:t xml:space="preserve"> .</w:t>
-      </w:r>
-      <w:proofErr w:type="spellStart"/>
-      <w:r>
-        <w:t>env.example</w:t>
-      </w:r>
-      <w:proofErr w:type="spellEnd"/>
-      <w:r>
-        <w:t xml:space="preserve"> pada folder </w:t>
-      </w:r>
-      <w:proofErr w:type="spellStart"/>
-      <w:r>
-        <w:t>api</w:t>
-      </w:r>
-      <w:proofErr w:type="spellEnd"/>
-      <w:r>
-        <w:t>.</w:t>
+        <w:t xml:space="preserve"> .env.example pada folder api.</w:t>
       </w:r>
     </w:p>
     <w:p>
@@ -637,55 +327,7 @@
         <w:contextualSpacing/>
       </w:pPr>
       <w:r>
-        <w:t>Membuat file .</w:t>
-      </w:r>
-      <w:proofErr w:type="spellStart"/>
-      <w:r>
-        <w:t>env.example</w:t>
-      </w:r>
-      <w:proofErr w:type="spellEnd"/>
-      <w:r>
-        <w:t xml:space="preserve"> </w:t>
-      </w:r>
-      <w:proofErr w:type="spellStart"/>
-      <w:r>
-        <w:t>ini</w:t>
-      </w:r>
-      <w:proofErr w:type="spellEnd"/>
-      <w:r>
-        <w:t xml:space="preserve"> </w:t>
-      </w:r>
-      <w:proofErr w:type="spellStart"/>
-      <w:r>
-        <w:t>bertujuan</w:t>
-      </w:r>
-      <w:proofErr w:type="spellEnd"/>
-      <w:r>
-        <w:t xml:space="preserve"> </w:t>
-      </w:r>
-      <w:proofErr w:type="spellStart"/>
-      <w:r>
-        <w:t>untuk</w:t>
-      </w:r>
-      <w:proofErr w:type="spellEnd"/>
-      <w:r>
-        <w:t xml:space="preserve"> </w:t>
-      </w:r>
-      <w:proofErr w:type="spellStart"/>
-      <w:r>
-        <w:t>membedakan</w:t>
-      </w:r>
-      <w:proofErr w:type="spellEnd"/>
-      <w:r>
-        <w:t xml:space="preserve"> mana file .env yang </w:t>
-      </w:r>
-      <w:proofErr w:type="spellStart"/>
-      <w:r>
-        <w:t>akan</w:t>
-      </w:r>
-      <w:proofErr w:type="spellEnd"/>
-      <w:r>
-        <w:t xml:space="preserve"> di push </w:t>
+        <w:t xml:space="preserve">Membuat file .env.example ini bertujuan untuk membedakan mana file .env yang akan di push </w:t>
       </w:r>
       <w:proofErr w:type="gramStart"/>
       <w:r>
@@ -693,39 +335,7 @@
       </w:r>
       <w:proofErr w:type="gramEnd"/>
       <w:r>
-        <w:t xml:space="preserve"> yang </w:t>
-      </w:r>
-      <w:proofErr w:type="spellStart"/>
-      <w:r>
-        <w:t>akan</w:t>
-      </w:r>
-      <w:proofErr w:type="spellEnd"/>
-      <w:r>
-        <w:t xml:space="preserve"> </w:t>
-      </w:r>
-      <w:proofErr w:type="spellStart"/>
-      <w:r>
-        <w:t>digunakan</w:t>
-      </w:r>
-      <w:proofErr w:type="spellEnd"/>
-      <w:r>
-        <w:t xml:space="preserve"> masing-masing </w:t>
-      </w:r>
-      <w:proofErr w:type="spellStart"/>
-      <w:r>
-        <w:t>anggota</w:t>
-      </w:r>
-      <w:proofErr w:type="spellEnd"/>
-      <w:r>
-        <w:t xml:space="preserve"> </w:t>
-      </w:r>
-      <w:proofErr w:type="spellStart"/>
-      <w:r>
-        <w:t>kelompok</w:t>
-      </w:r>
-      <w:proofErr w:type="spellEnd"/>
-      <w:r>
-        <w:t xml:space="preserve">. </w:t>
+        <w:t xml:space="preserve"> yang akan digunakan masing-masing anggota kelompok. </w:t>
       </w:r>
     </w:p>
     <w:p>
@@ -749,23 +359,7 @@
         <w:t>:</w:t>
       </w:r>
       <w:r>
-        <w:t xml:space="preserve"> file </w:t>
-      </w:r>
-      <w:proofErr w:type="spellStart"/>
-      <w:r>
-        <w:t>pribadi</w:t>
-      </w:r>
-      <w:proofErr w:type="spellEnd"/>
-      <w:r>
-        <w:t xml:space="preserve"> (</w:t>
-      </w:r>
-      <w:proofErr w:type="spellStart"/>
-      <w:r>
-        <w:t>tidak</w:t>
-      </w:r>
-      <w:proofErr w:type="spellEnd"/>
-      <w:r>
-        <w:t xml:space="preserve"> di-push)</w:t>
+        <w:t xml:space="preserve"> file pribadi (tidak di-push)</w:t>
       </w:r>
     </w:p>
     <w:p>
@@ -779,23 +373,15 @@
       </w:pPr>
       <w:proofErr w:type="gramStart"/>
       <w:r>
+        <w:t>.env</w:t>
+      </w:r>
+      <w:proofErr w:type="gramEnd"/>
+      <w:r>
         <w:t>.</w:t>
       </w:r>
-      <w:proofErr w:type="spellStart"/>
-      <w:r>
-        <w:t>env</w:t>
-      </w:r>
-      <w:proofErr w:type="gramEnd"/>
-      <w:r>
-        <w:t>.</w:t>
-      </w:r>
       <w:proofErr w:type="gramStart"/>
       <w:r>
-        <w:t>example</w:t>
-      </w:r>
-      <w:proofErr w:type="spellEnd"/>
-      <w:r>
-        <w:t xml:space="preserve"> </w:t>
+        <w:t xml:space="preserve">example </w:t>
       </w:r>
       <w:r>
         <w:t>:</w:t>
@@ -815,15 +401,7 @@
         <w:spacing w:line="240" w:lineRule="auto"/>
       </w:pPr>
       <w:r>
-        <w:t xml:space="preserve">Tim </w:t>
-      </w:r>
-      <w:proofErr w:type="spellStart"/>
-      <w:r>
-        <w:t>cukup</w:t>
-      </w:r>
-      <w:proofErr w:type="spellEnd"/>
-      <w:r>
-        <w:t xml:space="preserve"> copy </w:t>
+        <w:t xml:space="preserve">Tim cukup copy </w:t>
       </w:r>
       <w:r>
         <w:t>&gt;</w:t>
@@ -835,13 +413,283 @@
         <w:t>&gt;</w:t>
       </w:r>
       <w:r>
-        <w:t xml:space="preserve"> </w:t>
-      </w:r>
-      <w:proofErr w:type="spellStart"/>
-      <w:r>
-        <w:t>jalan</w:t>
-      </w:r>
-      <w:proofErr w:type="spellEnd"/>
+        <w:t xml:space="preserve"> jalan</w:t>
+      </w:r>
+    </w:p>
+    <w:p>
+      <w:pPr>
+        <w:spacing w:line="240" w:lineRule="auto"/>
+      </w:pPr>
+    </w:p>
+    <w:p>
+      <w:pPr>
+        <w:spacing w:line="240" w:lineRule="auto"/>
+      </w:pPr>
+      <w:r>
+        <w:lastRenderedPageBreak/>
+        <w:t xml:space="preserve">2. Perbaikan Extensi file pada </w:t>
+      </w:r>
+      <w:proofErr w:type="gramStart"/>
+      <w:r>
+        <w:t>message.utils</w:t>
+      </w:r>
+      <w:proofErr w:type="gramEnd"/>
+    </w:p>
+    <w:p>
+      <w:pPr>
+        <w:spacing w:line="240" w:lineRule="auto"/>
+      </w:pPr>
+      <w:r>
+        <w:rPr>
+          <w:noProof/>
+        </w:rPr>
+        <w:drawing>
+          <wp:inline distT="0" distB="0" distL="0" distR="0" wp14:anchorId="4B5D3198" wp14:editId="63C712A6">
+            <wp:extent cx="2926080" cy="4663440"/>
+            <wp:effectExtent l="0" t="0" r="7620" b="3810"/>
+            <wp:docPr id="1313472616" name="Picture 2"/>
+            <wp:cNvGraphicFramePr>
+              <a:graphicFrameLocks xmlns:a="http://schemas.openxmlformats.org/drawingml/2006/main" noChangeAspect="1"/>
+            </wp:cNvGraphicFramePr>
+            <a:graphic xmlns:a="http://schemas.openxmlformats.org/drawingml/2006/main">
+              <a:graphicData uri="http://schemas.openxmlformats.org/drawingml/2006/picture">
+                <pic:pic xmlns:pic="http://schemas.openxmlformats.org/drawingml/2006/picture">
+                  <pic:nvPicPr>
+                    <pic:cNvPr id="0" name="Picture 2"/>
+                    <pic:cNvPicPr>
+                      <a:picLocks noChangeAspect="1" noChangeArrowheads="1"/>
+                    </pic:cNvPicPr>
+                  </pic:nvPicPr>
+                  <pic:blipFill>
+                    <a:blip r:embed="rId6">
+                      <a:extLst>
+                        <a:ext uri="{28A0092B-C50C-407E-A947-70E740481C1C}">
+                          <a14:useLocalDpi xmlns:a14="http://schemas.microsoft.com/office/drawing/2010/main" val="0"/>
+                        </a:ext>
+                      </a:extLst>
+                    </a:blip>
+                    <a:srcRect/>
+                    <a:stretch>
+                      <a:fillRect/>
+                    </a:stretch>
+                  </pic:blipFill>
+                  <pic:spPr bwMode="auto">
+                    <a:xfrm>
+                      <a:off x="0" y="0"/>
+                      <a:ext cx="2926080" cy="4663440"/>
+                    </a:xfrm>
+                    <a:prstGeom prst="rect">
+                      <a:avLst/>
+                    </a:prstGeom>
+                    <a:noFill/>
+                    <a:ln>
+                      <a:noFill/>
+                    </a:ln>
+                  </pic:spPr>
+                </pic:pic>
+              </a:graphicData>
+            </a:graphic>
+          </wp:inline>
+        </w:drawing>
+      </w:r>
+    </w:p>
+    <w:p>
+      <w:pPr>
+        <w:spacing w:line="240" w:lineRule="auto"/>
+      </w:pPr>
+      <w:r>
+        <w:t xml:space="preserve">Extensi file pada </w:t>
+      </w:r>
+      <w:proofErr w:type="gramStart"/>
+      <w:r>
+        <w:t>message.utils</w:t>
+      </w:r>
+      <w:proofErr w:type="gramEnd"/>
+      <w:r>
+        <w:t xml:space="preserve"> awalnya kemudian diganti dengan </w:t>
+      </w:r>
+      <w:proofErr w:type="gramStart"/>
+      <w:r>
+        <w:t>message.utils</w:t>
+      </w:r>
+      <w:proofErr w:type="gramEnd"/>
+      <w:r>
+        <w:t>.ts</w:t>
+      </w:r>
+    </w:p>
+    <w:p>
+      <w:pPr>
+        <w:spacing w:line="240" w:lineRule="auto"/>
+      </w:pPr>
+    </w:p>
+    <w:p>
+      <w:pPr>
+        <w:spacing w:line="240" w:lineRule="auto"/>
+      </w:pPr>
+    </w:p>
+    <w:p>
+      <w:pPr>
+        <w:spacing w:line="240" w:lineRule="auto"/>
+      </w:pPr>
+    </w:p>
+    <w:p>
+      <w:pPr>
+        <w:spacing w:line="240" w:lineRule="auto"/>
+      </w:pPr>
+    </w:p>
+    <w:p>
+      <w:pPr>
+        <w:spacing w:line="240" w:lineRule="auto"/>
+      </w:pPr>
+    </w:p>
+    <w:p>
+      <w:pPr>
+        <w:spacing w:line="240" w:lineRule="auto"/>
+      </w:pPr>
+    </w:p>
+    <w:p>
+      <w:pPr>
+        <w:spacing w:line="240" w:lineRule="auto"/>
+      </w:pPr>
+    </w:p>
+    <w:p>
+      <w:pPr>
+        <w:spacing w:line="240" w:lineRule="auto"/>
+      </w:pPr>
+    </w:p>
+    <w:p>
+      <w:pPr>
+        <w:spacing w:line="240" w:lineRule="auto"/>
+      </w:pPr>
+    </w:p>
+    <w:p>
+      <w:pPr>
+        <w:spacing w:line="240" w:lineRule="auto"/>
+      </w:pPr>
+    </w:p>
+    <w:p>
+      <w:pPr>
+        <w:spacing w:line="240" w:lineRule="auto"/>
+      </w:pPr>
+    </w:p>
+    <w:p>
+      <w:pPr>
+        <w:spacing w:line="240" w:lineRule="auto"/>
+      </w:pPr>
+    </w:p>
+    <w:p>
+      <w:pPr>
+        <w:spacing w:line="240" w:lineRule="auto"/>
+      </w:pPr>
+      <w:r>
+        <w:lastRenderedPageBreak/>
+        <w:t xml:space="preserve">3. Update </w:t>
+      </w:r>
+      <w:proofErr w:type="gramStart"/>
+      <w:r>
+        <w:t>tsconfig.json</w:t>
+      </w:r>
+      <w:proofErr w:type="gramEnd"/>
+    </w:p>
+    <w:p>
+      <w:pPr>
+        <w:spacing w:line="240" w:lineRule="auto"/>
+      </w:pPr>
+      <w:r>
+        <w:t>C:\Users\acr\Documents\PBS PA\wisata-CPMApp\api\tsconfig.json</w:t>
+      </w:r>
+    </w:p>
+    <w:p>
+      <w:pPr>
+        <w:spacing w:line="240" w:lineRule="auto"/>
+      </w:pPr>
+      <w:r>
+        <w:rPr>
+          <w:noProof/>
+        </w:rPr>
+        <w:drawing>
+          <wp:inline distT="0" distB="0" distL="0" distR="0" wp14:anchorId="01546B88" wp14:editId="1E185640">
+            <wp:extent cx="5731510" cy="3222625"/>
+            <wp:effectExtent l="0" t="0" r="2540" b="0"/>
+            <wp:docPr id="1060019103" name="Picture 1"/>
+            <wp:cNvGraphicFramePr>
+              <a:graphicFrameLocks xmlns:a="http://schemas.openxmlformats.org/drawingml/2006/main" noChangeAspect="1"/>
+            </wp:cNvGraphicFramePr>
+            <a:graphic xmlns:a="http://schemas.openxmlformats.org/drawingml/2006/main">
+              <a:graphicData uri="http://schemas.openxmlformats.org/drawingml/2006/picture">
+                <pic:pic xmlns:pic="http://schemas.openxmlformats.org/drawingml/2006/picture">
+                  <pic:nvPicPr>
+                    <pic:cNvPr id="1060019103" name=""/>
+                    <pic:cNvPicPr/>
+                  </pic:nvPicPr>
+                  <pic:blipFill>
+                    <a:blip r:embed="rId7"/>
+                    <a:stretch>
+                      <a:fillRect/>
+                    </a:stretch>
+                  </pic:blipFill>
+                  <pic:spPr>
+                    <a:xfrm>
+                      <a:off x="0" y="0"/>
+                      <a:ext cx="5731510" cy="3222625"/>
+                    </a:xfrm>
+                    <a:prstGeom prst="rect">
+                      <a:avLst/>
+                    </a:prstGeom>
+                  </pic:spPr>
+                </pic:pic>
+              </a:graphicData>
+            </a:graphic>
+          </wp:inline>
+        </w:drawing>
+      </w:r>
+    </w:p>
+    <w:p>
+      <w:pPr>
+        <w:spacing w:line="240" w:lineRule="auto"/>
+      </w:pPr>
+    </w:p>
+    <w:p>
+      <w:pPr>
+        <w:spacing w:line="240" w:lineRule="auto"/>
+      </w:pPr>
+      <w:r>
+        <w:t xml:space="preserve">Tujuan menghapus </w:t>
+      </w:r>
+      <w:r>
+        <w:t xml:space="preserve">pada "baseUrl": </w:t>
+      </w:r>
+      <w:proofErr w:type="gramStart"/>
+      <w:r>
+        <w:t>"./</w:t>
+      </w:r>
+      <w:proofErr w:type="gramEnd"/>
+      <w:r>
+        <w:t>dist"</w:t>
+      </w:r>
+      <w:r>
+        <w:t xml:space="preserve"> untuk import tidak error.</w:t>
+      </w:r>
+    </w:p>
+    <w:p>
+      <w:pPr>
+        <w:spacing w:line="240" w:lineRule="auto"/>
+      </w:pPr>
+    </w:p>
+    <w:p>
+      <w:pPr>
+        <w:spacing w:line="240" w:lineRule="auto"/>
+      </w:pPr>
+    </w:p>
+    <w:p>
+      <w:pPr>
+        <w:spacing w:line="240" w:lineRule="auto"/>
+      </w:pPr>
+    </w:p>
+    <w:p>
+      <w:pPr>
+        <w:spacing w:line="240" w:lineRule="auto"/>
+      </w:pPr>
     </w:p>
     <w:sectPr>
       <w:pgSz w:w="11906" w:h="16838"/>

</xml_diff>

<commit_message>
Perbaikan Koding pada App.tsx File : wisata-CPMApp\cms\src\App.tsx
</commit_message>
<xml_diff>
--- a/Dokumentasi/24382001P_Lorensius Firngadi_Dokumentasi Sesi 3.docx
+++ b/Dokumentasi/24382001P_Lorensius Firngadi_Dokumentasi Sesi 3.docx
@@ -44,23 +44,7 @@
           <w:b/>
           <w:bCs/>
         </w:rPr>
-        <w:t xml:space="preserve">Mata </w:t>
-      </w:r>
-      <w:proofErr w:type="gramStart"/>
-      <w:r>
-        <w:rPr>
-          <w:b/>
-          <w:bCs/>
-        </w:rPr>
-        <w:t>Kuliah :</w:t>
-      </w:r>
-      <w:proofErr w:type="gramEnd"/>
-      <w:r>
-        <w:rPr>
-          <w:b/>
-          <w:bCs/>
-        </w:rPr>
-        <w:t xml:space="preserve"> </w:t>
+        <w:t xml:space="preserve">Mata Kuliah : </w:t>
       </w:r>
       <w:proofErr w:type="spellStart"/>
       <w:r>
@@ -110,16 +94,9 @@
       <w:r>
         <w:t>Nama</w:t>
       </w:r>
-      <w:proofErr w:type="gramStart"/>
       <w:r>
         <w:tab/>
-      </w:r>
-      <w:r>
-        <w:t xml:space="preserve"> :</w:t>
-      </w:r>
-      <w:proofErr w:type="gramEnd"/>
-      <w:r>
-        <w:t xml:space="preserve"> </w:t>
+        <w:t xml:space="preserve"> : </w:t>
       </w:r>
       <w:proofErr w:type="spellStart"/>
       <w:r>
@@ -139,19 +116,9 @@
       <w:r>
         <w:t>NPM</w:t>
       </w:r>
-      <w:proofErr w:type="gramStart"/>
       <w:r>
         <w:tab/>
-      </w:r>
-      <w:r>
-        <w:t xml:space="preserve"> :</w:t>
-      </w:r>
-      <w:proofErr w:type="gramEnd"/>
-      <w:r>
-        <w:t xml:space="preserve"> 2</w:t>
-      </w:r>
-      <w:r>
-        <w:t>4382001P</w:t>
+        <w:t xml:space="preserve"> : 24382001P</w:t>
       </w:r>
     </w:p>
     <w:p>
@@ -165,16 +132,9 @@
         <w:t>Kelas</w:t>
       </w:r>
       <w:proofErr w:type="spellEnd"/>
-      <w:proofErr w:type="gramStart"/>
       <w:r>
         <w:tab/>
-      </w:r>
-      <w:r>
-        <w:t xml:space="preserve"> :</w:t>
-      </w:r>
-      <w:proofErr w:type="gramEnd"/>
-      <w:r>
-        <w:t xml:space="preserve"> IF 23 E</w:t>
+        <w:t xml:space="preserve"> : IF 23 E</w:t>
       </w:r>
     </w:p>
     <w:p>
@@ -191,17 +151,12 @@
         <w:jc w:val="both"/>
       </w:pPr>
       <w:proofErr w:type="spellStart"/>
-      <w:proofErr w:type="gramStart"/>
       <w:r>
         <w:t>Kelompok</w:t>
       </w:r>
       <w:proofErr w:type="spellEnd"/>
       <w:r>
-        <w:t xml:space="preserve"> :</w:t>
-      </w:r>
-      <w:proofErr w:type="gramEnd"/>
-      <w:r>
-        <w:t xml:space="preserve"> Ferdi, </w:t>
+        <w:t xml:space="preserve"> : Ferdi, </w:t>
       </w:r>
       <w:proofErr w:type="spellStart"/>
       <w:r>
@@ -220,7 +175,6 @@
         <w:t xml:space="preserve"> </w:t>
       </w:r>
       <w:proofErr w:type="spellStart"/>
-      <w:proofErr w:type="gramStart"/>
       <w:r>
         <w:t>dulu</w:t>
       </w:r>
@@ -228,7 +182,6 @@
       <w:r>
         <w:t xml:space="preserve"> !</w:t>
       </w:r>
-      <w:proofErr w:type="gramEnd"/>
     </w:p>
     <w:p>
       <w:pPr>
@@ -252,7 +205,6 @@
         <w:t xml:space="preserve"> </w:t>
       </w:r>
       <w:proofErr w:type="spellStart"/>
-      <w:proofErr w:type="gramStart"/>
       <w:r>
         <w:t>Kelompok</w:t>
       </w:r>
@@ -260,7 +212,6 @@
       <w:r>
         <w:t xml:space="preserve"> :</w:t>
       </w:r>
-      <w:proofErr w:type="gramEnd"/>
     </w:p>
     <w:p>
       <w:pPr>
@@ -362,15 +313,7 @@
       </w:r>
       <w:proofErr w:type="spellEnd"/>
       <w:r>
-        <w:t xml:space="preserve"> </w:t>
-      </w:r>
-      <w:proofErr w:type="gramStart"/>
-      <w:r>
-        <w:t>Project :</w:t>
-      </w:r>
-      <w:proofErr w:type="gramEnd"/>
-      <w:r>
-        <w:t xml:space="preserve"> </w:t>
+        <w:t xml:space="preserve"> Project : </w:t>
       </w:r>
       <w:proofErr w:type="spellStart"/>
       <w:r>
@@ -397,13 +340,8 @@
       </w:r>
       <w:proofErr w:type="spellEnd"/>
       <w:r>
-        <w:t xml:space="preserve"> </w:t>
-      </w:r>
-      <w:proofErr w:type="gramStart"/>
-      <w:r>
-        <w:t>Project :</w:t>
-      </w:r>
-      <w:proofErr w:type="gramEnd"/>
+        <w:t xml:space="preserve"> Project :</w:t>
+      </w:r>
     </w:p>
     <w:p>
       <w:pPr>
@@ -622,15 +560,7 @@
         <w:t xml:space="preserve">1. </w:t>
       </w:r>
       <w:r>
-        <w:t xml:space="preserve">Membuat </w:t>
-      </w:r>
-      <w:proofErr w:type="gramStart"/>
-      <w:r>
-        <w:t>file :</w:t>
-      </w:r>
-      <w:proofErr w:type="gramEnd"/>
-      <w:r>
-        <w:t xml:space="preserve"> .</w:t>
+        <w:t>Membuat file : .</w:t>
       </w:r>
       <w:proofErr w:type="spellStart"/>
       <w:r>
@@ -768,15 +698,7 @@
       </w:r>
       <w:proofErr w:type="spellEnd"/>
       <w:r>
-        <w:t xml:space="preserve"> di push </w:t>
-      </w:r>
-      <w:proofErr w:type="gramStart"/>
-      <w:r>
-        <w:t>dan .env</w:t>
-      </w:r>
-      <w:proofErr w:type="gramEnd"/>
-      <w:r>
-        <w:t xml:space="preserve"> yang </w:t>
+        <w:t xml:space="preserve"> di push dan .env yang </w:t>
       </w:r>
       <w:proofErr w:type="spellStart"/>
       <w:r>
@@ -820,20 +742,9 @@
         </w:numPr>
         <w:spacing w:line="240" w:lineRule="auto"/>
       </w:pPr>
-      <w:proofErr w:type="gramStart"/>
       <w:r>
         <w:lastRenderedPageBreak/>
-        <w:t>.env</w:t>
-      </w:r>
-      <w:proofErr w:type="gramEnd"/>
-      <w:r>
-        <w:t xml:space="preserve"> </w:t>
-      </w:r>
-      <w:r>
-        <w:t>:</w:t>
-      </w:r>
-      <w:r>
-        <w:t xml:space="preserve"> file </w:t>
+        <w:t xml:space="preserve">.env : file </w:t>
       </w:r>
       <w:proofErr w:type="spellStart"/>
       <w:r>
@@ -861,32 +772,16 @@
         </w:numPr>
         <w:spacing w:line="240" w:lineRule="auto"/>
       </w:pPr>
-      <w:proofErr w:type="gramStart"/>
       <w:r>
         <w:t>.</w:t>
       </w:r>
       <w:proofErr w:type="spellStart"/>
       <w:r>
-        <w:t>env</w:t>
-      </w:r>
-      <w:proofErr w:type="gramEnd"/>
-      <w:r>
-        <w:t>.</w:t>
-      </w:r>
-      <w:proofErr w:type="gramStart"/>
-      <w:r>
-        <w:t>example</w:t>
-      </w:r>
-      <w:proofErr w:type="spellEnd"/>
-      <w:r>
-        <w:t xml:space="preserve"> </w:t>
-      </w:r>
-      <w:r>
-        <w:t>:</w:t>
-      </w:r>
-      <w:proofErr w:type="gramEnd"/>
-      <w:r>
-        <w:t xml:space="preserve"> template (di-push)</w:t>
+        <w:t>env.example</w:t>
+      </w:r>
+      <w:proofErr w:type="spellEnd"/>
+      <w:r>
+        <w:t xml:space="preserve"> : template (di-push)</w:t>
       </w:r>
     </w:p>
     <w:p>
@@ -907,19 +802,7 @@
       </w:r>
       <w:proofErr w:type="spellEnd"/>
       <w:r>
-        <w:t xml:space="preserve"> copy </w:t>
-      </w:r>
-      <w:r>
-        <w:t>&gt;</w:t>
-      </w:r>
-      <w:r>
-        <w:t xml:space="preserve"> edit </w:t>
-      </w:r>
-      <w:r>
-        <w:t>&gt;</w:t>
-      </w:r>
-      <w:r>
-        <w:t xml:space="preserve"> </w:t>
+        <w:t xml:space="preserve"> copy &gt; edit &gt; </w:t>
       </w:r>
       <w:proofErr w:type="spellStart"/>
       <w:r>
@@ -956,12 +839,10 @@
         <w:t xml:space="preserve"> file pada </w:t>
       </w:r>
       <w:proofErr w:type="spellStart"/>
-      <w:proofErr w:type="gramStart"/>
       <w:r>
         <w:t>message.utils</w:t>
       </w:r>
       <w:proofErr w:type="spellEnd"/>
-      <w:proofErr w:type="gramEnd"/>
     </w:p>
     <w:p>
       <w:pPr>
@@ -1034,12 +915,10 @@
         <w:t xml:space="preserve"> file pada </w:t>
       </w:r>
       <w:proofErr w:type="spellStart"/>
-      <w:proofErr w:type="gramStart"/>
       <w:r>
         <w:t>message.utils</w:t>
       </w:r>
       <w:proofErr w:type="spellEnd"/>
-      <w:proofErr w:type="gramEnd"/>
       <w:r>
         <w:t xml:space="preserve"> </w:t>
       </w:r>
@@ -1076,13 +955,8 @@
         <w:t xml:space="preserve"> </w:t>
       </w:r>
       <w:proofErr w:type="spellStart"/>
-      <w:proofErr w:type="gramStart"/>
-      <w:r>
-        <w:t>message.utils</w:t>
-      </w:r>
-      <w:proofErr w:type="gramEnd"/>
-      <w:r>
-        <w:t>.ts</w:t>
+      <w:r>
+        <w:t>message.utils.ts</w:t>
       </w:r>
       <w:proofErr w:type="spellEnd"/>
     </w:p>
@@ -1154,12 +1028,10 @@
         <w:t xml:space="preserve">3. Update </w:t>
       </w:r>
       <w:proofErr w:type="spellStart"/>
-      <w:proofErr w:type="gramStart"/>
       <w:r>
         <w:t>tsconfig.json</w:t>
       </w:r>
       <w:proofErr w:type="spellEnd"/>
-      <w:proofErr w:type="gramEnd"/>
     </w:p>
     <w:p>
       <w:pPr>
@@ -1199,9 +1071,9 @@
           <w:noProof/>
         </w:rPr>
         <w:drawing>
-          <wp:inline distT="0" distB="0" distL="0" distR="0" wp14:anchorId="01546B88" wp14:editId="1E185640">
-            <wp:extent cx="5731510" cy="3222625"/>
-            <wp:effectExtent l="0" t="0" r="2540" b="0"/>
+          <wp:inline distT="0" distB="0" distL="0" distR="0" wp14:anchorId="01546B88" wp14:editId="6FFC3577">
+            <wp:extent cx="5400675" cy="3036608"/>
+            <wp:effectExtent l="0" t="0" r="0" b="0"/>
             <wp:docPr id="1060019103" name="Picture 1"/>
             <wp:cNvGraphicFramePr>
               <a:graphicFrameLocks xmlns:a="http://schemas.openxmlformats.org/drawingml/2006/main" noChangeAspect="1"/>
@@ -1222,7 +1094,7 @@
                   <pic:spPr>
                     <a:xfrm>
                       <a:off x="0" y="0"/>
-                      <a:ext cx="5731510" cy="3222625"/>
+                      <a:ext cx="5409730" cy="3041700"/>
                     </a:xfrm>
                     <a:prstGeom prst="rect">
                       <a:avLst/>
@@ -1239,11 +1111,6 @@
       <w:pPr>
         <w:spacing w:line="240" w:lineRule="auto"/>
       </w:pPr>
-    </w:p>
-    <w:p>
-      <w:pPr>
-        <w:spacing w:line="240" w:lineRule="auto"/>
-      </w:pPr>
       <w:r>
         <w:t xml:space="preserve">Tujuan </w:t>
       </w:r>
@@ -1264,14 +1131,9 @@
       </w:r>
       <w:proofErr w:type="spellEnd"/>
       <w:r>
-        <w:t xml:space="preserve">": </w:t>
-      </w:r>
-      <w:proofErr w:type="gramStart"/>
-      <w:r>
-        <w:t>"./</w:t>
-      </w:r>
-      <w:proofErr w:type="spellStart"/>
-      <w:proofErr w:type="gramEnd"/>
+        <w:t>": "./</w:t>
+      </w:r>
+      <w:proofErr w:type="spellStart"/>
       <w:r>
         <w:t>dist</w:t>
       </w:r>
@@ -1344,11 +1206,10 @@
         <w:rPr>
           <w:noProof/>
         </w:rPr>
-        <w:lastRenderedPageBreak/>
         <w:drawing>
-          <wp:inline distT="0" distB="0" distL="0" distR="0" wp14:anchorId="4A39E084" wp14:editId="693A9027">
-            <wp:extent cx="5731510" cy="3222625"/>
-            <wp:effectExtent l="0" t="0" r="2540" b="0"/>
+          <wp:inline distT="0" distB="0" distL="0" distR="0" wp14:anchorId="4A39E084" wp14:editId="4717EE92">
+            <wp:extent cx="4962525" cy="2790252"/>
+            <wp:effectExtent l="0" t="0" r="0" b="0"/>
             <wp:docPr id="271709215" name="Picture 1"/>
             <wp:cNvGraphicFramePr>
               <a:graphicFrameLocks xmlns:a="http://schemas.openxmlformats.org/drawingml/2006/main" noChangeAspect="1"/>
@@ -1369,6 +1230,192 @@
                   <pic:spPr>
                     <a:xfrm>
                       <a:off x="0" y="0"/>
+                      <a:ext cx="4969623" cy="2794243"/>
+                    </a:xfrm>
+                    <a:prstGeom prst="rect">
+                      <a:avLst/>
+                    </a:prstGeom>
+                  </pic:spPr>
+                </pic:pic>
+              </a:graphicData>
+            </a:graphic>
+          </wp:inline>
+        </w:drawing>
+      </w:r>
+    </w:p>
+    <w:p>
+      <w:pPr>
+        <w:spacing w:line="240" w:lineRule="auto"/>
+      </w:pPr>
+      <w:proofErr w:type="spellStart"/>
+      <w:r>
+        <w:t>Setelah</w:t>
+      </w:r>
+      <w:proofErr w:type="spellEnd"/>
+      <w:r>
+        <w:t xml:space="preserve"> </w:t>
+      </w:r>
+      <w:proofErr w:type="spellStart"/>
+      <w:r>
+        <w:t>menjalankan</w:t>
+      </w:r>
+      <w:proofErr w:type="spellEnd"/>
+      <w:r>
+        <w:t xml:space="preserve"> </w:t>
+      </w:r>
+      <w:proofErr w:type="spellStart"/>
+      <w:r>
+        <w:t>api</w:t>
+      </w:r>
+      <w:proofErr w:type="spellEnd"/>
+      <w:r>
+        <w:t xml:space="preserve"> </w:t>
+      </w:r>
+      <w:proofErr w:type="spellStart"/>
+      <w:r>
+        <w:t>kemudian</w:t>
+      </w:r>
+      <w:proofErr w:type="spellEnd"/>
+      <w:r>
+        <w:t xml:space="preserve"> </w:t>
+      </w:r>
+      <w:proofErr w:type="spellStart"/>
+      <w:r>
+        <w:t>menjalankan</w:t>
+      </w:r>
+      <w:proofErr w:type="spellEnd"/>
+      <w:r>
+        <w:t xml:space="preserve"> </w:t>
+      </w:r>
+      <w:proofErr w:type="spellStart"/>
+      <w:r>
+        <w:t>cms</w:t>
+      </w:r>
+      <w:proofErr w:type="spellEnd"/>
+      <w:r>
+        <w:t xml:space="preserve"> </w:t>
+      </w:r>
+      <w:proofErr w:type="spellStart"/>
+      <w:r>
+        <w:t>kedua</w:t>
+      </w:r>
+      <w:proofErr w:type="spellEnd"/>
+      <w:r>
+        <w:t xml:space="preserve"> </w:t>
+      </w:r>
+      <w:proofErr w:type="spellStart"/>
+      <w:r>
+        <w:t>berjalan</w:t>
+      </w:r>
+      <w:proofErr w:type="spellEnd"/>
+      <w:r>
+        <w:t>.</w:t>
+      </w:r>
+    </w:p>
+    <w:p>
+      <w:pPr>
+        <w:spacing w:line="240" w:lineRule="auto"/>
+      </w:pPr>
+    </w:p>
+    <w:p>
+      <w:pPr>
+        <w:spacing w:line="240" w:lineRule="auto"/>
+      </w:pPr>
+      <w:r>
+        <w:lastRenderedPageBreak/>
+        <w:t xml:space="preserve">5. </w:t>
+      </w:r>
+      <w:proofErr w:type="spellStart"/>
+      <w:r>
+        <w:t>Perbaikan</w:t>
+      </w:r>
+      <w:proofErr w:type="spellEnd"/>
+      <w:r>
+        <w:t xml:space="preserve"> </w:t>
+      </w:r>
+      <w:proofErr w:type="spellStart"/>
+      <w:r>
+        <w:t>Koding</w:t>
+      </w:r>
+      <w:proofErr w:type="spellEnd"/>
+      <w:r>
+        <w:t xml:space="preserve"> pada </w:t>
+      </w:r>
+      <w:proofErr w:type="spellStart"/>
+      <w:r>
+        <w:t>App.tsx</w:t>
+      </w:r>
+      <w:proofErr w:type="spellEnd"/>
+    </w:p>
+    <w:p>
+      <w:pPr>
+        <w:spacing w:line="240" w:lineRule="auto"/>
+      </w:pPr>
+      <w:r>
+        <w:t xml:space="preserve">File : </w:t>
+      </w:r>
+      <w:proofErr w:type="spellStart"/>
+      <w:r>
+        <w:t>wisata-CPMApp</w:t>
+      </w:r>
+      <w:proofErr w:type="spellEnd"/>
+      <w:r>
+        <w:t>\</w:t>
+      </w:r>
+      <w:proofErr w:type="spellStart"/>
+      <w:r>
+        <w:t>cms</w:t>
+      </w:r>
+      <w:proofErr w:type="spellEnd"/>
+      <w:r>
+        <w:t>\</w:t>
+      </w:r>
+      <w:proofErr w:type="spellStart"/>
+      <w:r>
+        <w:t>src</w:t>
+      </w:r>
+      <w:proofErr w:type="spellEnd"/>
+      <w:r>
+        <w:t>\</w:t>
+      </w:r>
+      <w:proofErr w:type="spellStart"/>
+      <w:r>
+        <w:t>App.tsx</w:t>
+      </w:r>
+      <w:proofErr w:type="spellEnd"/>
+    </w:p>
+    <w:p>
+      <w:pPr>
+        <w:spacing w:line="240" w:lineRule="auto"/>
+      </w:pPr>
+      <w:r>
+        <w:rPr>
+          <w:noProof/>
+        </w:rPr>
+        <w:drawing>
+          <wp:inline distT="0" distB="0" distL="0" distR="0" wp14:anchorId="1691ABC1" wp14:editId="1414468B">
+            <wp:extent cx="5731510" cy="3222625"/>
+            <wp:effectExtent l="0" t="0" r="2540" b="0"/>
+            <wp:docPr id="37208638" name="Picture 1"/>
+            <wp:cNvGraphicFramePr>
+              <a:graphicFrameLocks xmlns:a="http://schemas.openxmlformats.org/drawingml/2006/main" noChangeAspect="1"/>
+            </wp:cNvGraphicFramePr>
+            <a:graphic xmlns:a="http://schemas.openxmlformats.org/drawingml/2006/main">
+              <a:graphicData uri="http://schemas.openxmlformats.org/drawingml/2006/picture">
+                <pic:pic xmlns:pic="http://schemas.openxmlformats.org/drawingml/2006/picture">
+                  <pic:nvPicPr>
+                    <pic:cNvPr id="37208638" name=""/>
+                    <pic:cNvPicPr/>
+                  </pic:nvPicPr>
+                  <pic:blipFill>
+                    <a:blip r:embed="rId9"/>
+                    <a:stretch>
+                      <a:fillRect/>
+                    </a:stretch>
+                  </pic:blipFill>
+                  <pic:spPr>
+                    <a:xfrm>
+                      <a:off x="0" y="0"/>
                       <a:ext cx="5731510" cy="3222625"/>
                     </a:xfrm>
                     <a:prstGeom prst="rect">
@@ -1384,87 +1431,718 @@
     </w:p>
     <w:p>
       <w:pPr>
-        <w:spacing w:line="240" w:lineRule="auto"/>
-      </w:pPr>
-      <w:proofErr w:type="spellStart"/>
-      <w:r>
-        <w:t>Setelah</w:t>
-      </w:r>
-      <w:proofErr w:type="spellEnd"/>
-      <w:r>
-        <w:t xml:space="preserve"> </w:t>
-      </w:r>
-      <w:proofErr w:type="spellStart"/>
-      <w:r>
-        <w:t>menjalankan</w:t>
-      </w:r>
-      <w:proofErr w:type="spellEnd"/>
-      <w:r>
-        <w:t xml:space="preserve"> </w:t>
-      </w:r>
-      <w:proofErr w:type="spellStart"/>
-      <w:r>
-        <w:t>api</w:t>
-      </w:r>
-      <w:proofErr w:type="spellEnd"/>
-      <w:r>
-        <w:t xml:space="preserve"> </w:t>
-      </w:r>
-      <w:proofErr w:type="spellStart"/>
-      <w:r>
-        <w:t>kemudian</w:t>
-      </w:r>
-      <w:proofErr w:type="spellEnd"/>
-      <w:r>
-        <w:t xml:space="preserve"> </w:t>
-      </w:r>
-      <w:proofErr w:type="spellStart"/>
-      <w:r>
-        <w:t>menjalankan</w:t>
-      </w:r>
-      <w:proofErr w:type="spellEnd"/>
-      <w:r>
-        <w:t xml:space="preserve"> </w:t>
-      </w:r>
-      <w:proofErr w:type="spellStart"/>
-      <w:r>
-        <w:t>cms</w:t>
-      </w:r>
-      <w:proofErr w:type="spellEnd"/>
-      <w:r>
-        <w:t xml:space="preserve"> </w:t>
-      </w:r>
-      <w:proofErr w:type="spellStart"/>
-      <w:r>
-        <w:t>kedua</w:t>
-      </w:r>
-      <w:proofErr w:type="spellEnd"/>
-      <w:r>
-        <w:t xml:space="preserve"> </w:t>
-      </w:r>
-      <w:proofErr w:type="spellStart"/>
-      <w:r>
-        <w:t>berjalan</w:t>
-      </w:r>
-      <w:proofErr w:type="spellEnd"/>
+        <w:numPr>
+          <w:ilvl w:val="0"/>
+          <w:numId w:val="3"/>
+        </w:numPr>
+        <w:spacing w:line="240" w:lineRule="auto"/>
+      </w:pPr>
+      <w:r>
+        <w:t>Lazy State Initialization:</w:t>
+      </w:r>
+    </w:p>
+    <w:p>
+      <w:pPr>
+        <w:spacing w:line="240" w:lineRule="auto"/>
+        <w:ind w:left="720"/>
+        <w:jc w:val="both"/>
+      </w:pPr>
+      <w:proofErr w:type="spellStart"/>
+      <w:r>
+        <w:t>const</w:t>
+      </w:r>
+      <w:proofErr w:type="spellEnd"/>
+      <w:r>
+        <w:t xml:space="preserve"> [role, </w:t>
+      </w:r>
+      <w:proofErr w:type="spellStart"/>
+      <w:r>
+        <w:t>setRole</w:t>
+      </w:r>
+      <w:proofErr w:type="spellEnd"/>
+      <w:r>
+        <w:t xml:space="preserve">] = </w:t>
+      </w:r>
+      <w:proofErr w:type="spellStart"/>
+      <w:r>
+        <w:t>useState</w:t>
+      </w:r>
+      <w:proofErr w:type="spellEnd"/>
+      <w:r>
+        <w:t xml:space="preserve">(() =&gt; </w:t>
+      </w:r>
+      <w:proofErr w:type="spellStart"/>
+      <w:r>
+        <w:t>getRole</w:t>
+      </w:r>
+      <w:proofErr w:type="spellEnd"/>
+      <w:r>
+        <w:t>());</w:t>
+      </w:r>
+    </w:p>
+    <w:p>
+      <w:pPr>
+        <w:spacing w:line="240" w:lineRule="auto"/>
+        <w:ind w:left="720"/>
+        <w:jc w:val="both"/>
+      </w:pPr>
+      <w:proofErr w:type="spellStart"/>
+      <w:r>
+        <w:t>Fungsi</w:t>
+      </w:r>
+      <w:proofErr w:type="spellEnd"/>
+      <w:r>
+        <w:t xml:space="preserve"> di </w:t>
+      </w:r>
+      <w:proofErr w:type="spellStart"/>
+      <w:r>
+        <w:t>dalam</w:t>
+      </w:r>
+      <w:proofErr w:type="spellEnd"/>
+      <w:r>
+        <w:t> </w:t>
+      </w:r>
+      <w:proofErr w:type="spellStart"/>
+      <w:r>
+        <w:t>useState</w:t>
+      </w:r>
+      <w:proofErr w:type="spellEnd"/>
+      <w:r>
+        <w:t> </w:t>
+      </w:r>
+      <w:proofErr w:type="spellStart"/>
+      <w:r>
+        <w:t>hanya</w:t>
+      </w:r>
+      <w:proofErr w:type="spellEnd"/>
+      <w:r>
+        <w:t xml:space="preserve"> </w:t>
+      </w:r>
+      <w:proofErr w:type="spellStart"/>
+      <w:r>
+        <w:t>akan</w:t>
+      </w:r>
+      <w:proofErr w:type="spellEnd"/>
+      <w:r>
+        <w:t xml:space="preserve"> </w:t>
+      </w:r>
+      <w:proofErr w:type="spellStart"/>
+      <w:r>
+        <w:t>dijalankan</w:t>
+      </w:r>
+      <w:proofErr w:type="spellEnd"/>
+      <w:r>
+        <w:t xml:space="preserve"> </w:t>
+      </w:r>
+      <w:proofErr w:type="spellStart"/>
+      <w:r>
+        <w:t>satu</w:t>
+      </w:r>
+      <w:proofErr w:type="spellEnd"/>
+      <w:r>
+        <w:t xml:space="preserve"> kali </w:t>
+      </w:r>
+      <w:proofErr w:type="spellStart"/>
+      <w:r>
+        <w:t>saat</w:t>
+      </w:r>
+      <w:proofErr w:type="spellEnd"/>
+      <w:r>
+        <w:t xml:space="preserve"> </w:t>
+      </w:r>
+      <w:proofErr w:type="spellStart"/>
+      <w:r>
+        <w:t>aplikasi</w:t>
+      </w:r>
+      <w:proofErr w:type="spellEnd"/>
+      <w:r>
+        <w:t xml:space="preserve"> </w:t>
+      </w:r>
+      <w:proofErr w:type="spellStart"/>
+      <w:r>
+        <w:t>pertama</w:t>
+      </w:r>
+      <w:proofErr w:type="spellEnd"/>
+      <w:r>
+        <w:t xml:space="preserve"> kali </w:t>
+      </w:r>
+      <w:proofErr w:type="spellStart"/>
+      <w:r>
+        <w:t>dimuat</w:t>
+      </w:r>
+      <w:proofErr w:type="spellEnd"/>
+      <w:r>
+        <w:t xml:space="preserve">. </w:t>
+      </w:r>
+      <w:proofErr w:type="spellStart"/>
+      <w:r>
+        <w:t>L</w:t>
+      </w:r>
+      <w:r>
+        <w:t>ebih</w:t>
+      </w:r>
+      <w:proofErr w:type="spellEnd"/>
+      <w:r>
+        <w:t xml:space="preserve"> </w:t>
+      </w:r>
+      <w:proofErr w:type="spellStart"/>
+      <w:r>
+        <w:t>cepat</w:t>
+      </w:r>
+      <w:proofErr w:type="spellEnd"/>
+      <w:r>
+        <w:t xml:space="preserve"> </w:t>
+      </w:r>
+      <w:proofErr w:type="spellStart"/>
+      <w:r>
+        <w:t>karena</w:t>
+      </w:r>
+      <w:proofErr w:type="spellEnd"/>
+      <w:r>
+        <w:t xml:space="preserve"> React </w:t>
+      </w:r>
+      <w:proofErr w:type="spellStart"/>
+      <w:r>
+        <w:t>langsung</w:t>
+      </w:r>
+      <w:proofErr w:type="spellEnd"/>
+      <w:r>
+        <w:t xml:space="preserve"> </w:t>
+      </w:r>
+      <w:proofErr w:type="spellStart"/>
+      <w:r>
+        <w:t>tahu</w:t>
+      </w:r>
+      <w:proofErr w:type="spellEnd"/>
+      <w:r>
+        <w:t xml:space="preserve"> </w:t>
+      </w:r>
+      <w:proofErr w:type="spellStart"/>
+      <w:r>
+        <w:t>siapa</w:t>
+      </w:r>
+      <w:proofErr w:type="spellEnd"/>
+      <w:r>
+        <w:t xml:space="preserve"> </w:t>
+      </w:r>
+      <w:proofErr w:type="spellStart"/>
+      <w:r>
+        <w:t>usernya</w:t>
+      </w:r>
+      <w:proofErr w:type="spellEnd"/>
+      <w:r>
+        <w:t xml:space="preserve"> </w:t>
+      </w:r>
+      <w:proofErr w:type="spellStart"/>
+      <w:r>
+        <w:t>sebelum</w:t>
+      </w:r>
+      <w:proofErr w:type="spellEnd"/>
+      <w:r>
+        <w:t xml:space="preserve"> </w:t>
+      </w:r>
+      <w:proofErr w:type="spellStart"/>
+      <w:r>
+        <w:t>melakukan</w:t>
+      </w:r>
+      <w:proofErr w:type="spellEnd"/>
+      <w:r>
+        <w:t xml:space="preserve"> render </w:t>
+      </w:r>
+      <w:proofErr w:type="spellStart"/>
+      <w:r>
+        <w:t>pertama</w:t>
+      </w:r>
+      <w:proofErr w:type="spellEnd"/>
+      <w:r>
+        <w:t xml:space="preserve"> (First Paint).</w:t>
+      </w:r>
+    </w:p>
+    <w:p>
+      <w:pPr>
+        <w:numPr>
+          <w:ilvl w:val="0"/>
+          <w:numId w:val="3"/>
+        </w:numPr>
+        <w:spacing w:line="240" w:lineRule="auto"/>
+        <w:jc w:val="both"/>
+      </w:pPr>
+      <w:proofErr w:type="spellStart"/>
+      <w:r>
+        <w:t>Menghapus</w:t>
+      </w:r>
+      <w:proofErr w:type="spellEnd"/>
+      <w:r>
+        <w:t> loading state:</w:t>
+      </w:r>
+      <w:r>
+        <w:br/>
+      </w:r>
+      <w:proofErr w:type="spellStart"/>
+      <w:r>
+        <w:t>M</w:t>
+      </w:r>
+      <w:r>
+        <w:t>engambil</w:t>
+      </w:r>
+      <w:proofErr w:type="spellEnd"/>
+      <w:r>
+        <w:t> role </w:t>
+      </w:r>
+      <w:proofErr w:type="spellStart"/>
+      <w:r>
+        <w:t>secara</w:t>
+      </w:r>
+      <w:proofErr w:type="spellEnd"/>
+      <w:r>
+        <w:t xml:space="preserve"> </w:t>
+      </w:r>
+      <w:proofErr w:type="spellStart"/>
+      <w:r>
+        <w:t>sinkron</w:t>
+      </w:r>
+      <w:proofErr w:type="spellEnd"/>
+      <w:r>
+        <w:t xml:space="preserve"> </w:t>
+      </w:r>
+      <w:proofErr w:type="spellStart"/>
+      <w:r>
+        <w:t>dari</w:t>
+      </w:r>
+      <w:proofErr w:type="spellEnd"/>
+      <w:r>
+        <w:t> </w:t>
+      </w:r>
+      <w:proofErr w:type="spellStart"/>
+      <w:r>
+        <w:t>localStorage</w:t>
+      </w:r>
+      <w:proofErr w:type="spellEnd"/>
+      <w:r>
+        <w:t xml:space="preserve">, </w:t>
+      </w:r>
+      <w:proofErr w:type="spellStart"/>
+      <w:r>
+        <w:t>tidak</w:t>
+      </w:r>
+      <w:proofErr w:type="spellEnd"/>
+      <w:r>
+        <w:t xml:space="preserve"> </w:t>
+      </w:r>
+      <w:proofErr w:type="spellStart"/>
+      <w:r>
+        <w:t>perlu</w:t>
+      </w:r>
+      <w:proofErr w:type="spellEnd"/>
+      <w:r>
+        <w:t xml:space="preserve"> </w:t>
+      </w:r>
+      <w:proofErr w:type="spellStart"/>
+      <w:r>
+        <w:t>lagi</w:t>
+      </w:r>
+      <w:proofErr w:type="spellEnd"/>
+      <w:r>
+        <w:t xml:space="preserve"> </w:t>
+      </w:r>
+      <w:proofErr w:type="spellStart"/>
+      <w:r>
+        <w:t>menunggu</w:t>
+      </w:r>
+      <w:proofErr w:type="spellEnd"/>
+      <w:r>
+        <w:t xml:space="preserve"> "loading". </w:t>
+      </w:r>
+      <w:proofErr w:type="spellStart"/>
+      <w:r>
+        <w:t>Aplikasi</w:t>
+      </w:r>
+      <w:proofErr w:type="spellEnd"/>
+      <w:r>
+        <w:t xml:space="preserve"> </w:t>
+      </w:r>
+      <w:proofErr w:type="spellStart"/>
+      <w:r>
+        <w:t>langsung</w:t>
+      </w:r>
+      <w:proofErr w:type="spellEnd"/>
+      <w:r>
+        <w:t xml:space="preserve"> </w:t>
+      </w:r>
+      <w:proofErr w:type="spellStart"/>
+      <w:r>
+        <w:t>tahu</w:t>
+      </w:r>
+      <w:proofErr w:type="spellEnd"/>
+      <w:r>
+        <w:t xml:space="preserve"> </w:t>
+      </w:r>
+      <w:proofErr w:type="spellStart"/>
+      <w:r>
+        <w:t>apakah</w:t>
+      </w:r>
+      <w:proofErr w:type="spellEnd"/>
+      <w:r>
+        <w:t xml:space="preserve"> user </w:t>
+      </w:r>
+      <w:proofErr w:type="spellStart"/>
+      <w:r>
+        <w:t>adalah</w:t>
+      </w:r>
+      <w:proofErr w:type="spellEnd"/>
+      <w:r>
+        <w:t xml:space="preserve"> admin, customer, </w:t>
+      </w:r>
+      <w:proofErr w:type="spellStart"/>
+      <w:r>
+        <w:t>atau</w:t>
+      </w:r>
+      <w:proofErr w:type="spellEnd"/>
+      <w:r>
+        <w:t xml:space="preserve"> </w:t>
+      </w:r>
+      <w:proofErr w:type="spellStart"/>
+      <w:r>
+        <w:t>belum</w:t>
+      </w:r>
+      <w:proofErr w:type="spellEnd"/>
+      <w:r>
+        <w:t xml:space="preserve"> login.</w:t>
+      </w:r>
+    </w:p>
+    <w:p>
+      <w:pPr>
+        <w:numPr>
+          <w:ilvl w:val="0"/>
+          <w:numId w:val="3"/>
+        </w:numPr>
+        <w:spacing w:line="240" w:lineRule="auto"/>
+        <w:jc w:val="both"/>
+      </w:pPr>
+      <w:proofErr w:type="spellStart"/>
+      <w:r>
+        <w:t>Menghapus</w:t>
+      </w:r>
+      <w:proofErr w:type="spellEnd"/>
+      <w:r>
+        <w:t> </w:t>
+      </w:r>
+      <w:proofErr w:type="spellStart"/>
+      <w:r>
+        <w:t>setRole</w:t>
+      </w:r>
+      <w:proofErr w:type="spellEnd"/>
+      <w:r>
+        <w:t> </w:t>
+      </w:r>
+      <w:proofErr w:type="spellStart"/>
+      <w:r>
+        <w:t>dari</w:t>
+      </w:r>
+      <w:proofErr w:type="spellEnd"/>
+      <w:r>
+        <w:t> </w:t>
+      </w:r>
+      <w:proofErr w:type="spellStart"/>
+      <w:r>
+        <w:t>useEffect</w:t>
+      </w:r>
+      <w:proofErr w:type="spellEnd"/>
+      <w:r>
+        <w:t>:</w:t>
+      </w:r>
+      <w:r>
+        <w:br/>
+      </w:r>
+      <w:proofErr w:type="spellStart"/>
+      <w:r>
+        <w:t>M</w:t>
+      </w:r>
+      <w:r>
+        <w:t>enghilangkan</w:t>
+      </w:r>
+      <w:proofErr w:type="spellEnd"/>
+      <w:r>
+        <w:t xml:space="preserve"> error </w:t>
+      </w:r>
+      <w:proofErr w:type="spellStart"/>
+      <w:r>
+        <w:t>ESLint</w:t>
+      </w:r>
+      <w:proofErr w:type="spellEnd"/>
+      <w:r>
+        <w:t xml:space="preserve"> </w:t>
+      </w:r>
+      <w:proofErr w:type="spellStart"/>
+      <w:r>
+        <w:t>tersebut</w:t>
+      </w:r>
+      <w:proofErr w:type="spellEnd"/>
+      <w:r>
+        <w:t>. </w:t>
+      </w:r>
+      <w:proofErr w:type="spellStart"/>
+      <w:r>
+        <w:t>useEffect</w:t>
+      </w:r>
+      <w:proofErr w:type="spellEnd"/>
+      <w:r>
+        <w:t> </w:t>
+      </w:r>
+      <w:proofErr w:type="spellStart"/>
+      <w:r>
+        <w:t>sekarang</w:t>
+      </w:r>
+      <w:proofErr w:type="spellEnd"/>
+      <w:r>
+        <w:t xml:space="preserve"> </w:t>
+      </w:r>
+      <w:proofErr w:type="spellStart"/>
+      <w:r>
+        <w:t>hanya</w:t>
+      </w:r>
+      <w:proofErr w:type="spellEnd"/>
+      <w:r>
+        <w:t xml:space="preserve"> </w:t>
+      </w:r>
+      <w:proofErr w:type="spellStart"/>
+      <w:r>
+        <w:t>bertugas</w:t>
+      </w:r>
+      <w:proofErr w:type="spellEnd"/>
+      <w:r>
+        <w:t xml:space="preserve"> </w:t>
+      </w:r>
+      <w:proofErr w:type="spellStart"/>
+      <w:r>
+        <w:t>menyetel</w:t>
+      </w:r>
+      <w:proofErr w:type="spellEnd"/>
+      <w:r>
+        <w:t xml:space="preserve"> token </w:t>
+      </w:r>
+      <w:proofErr w:type="spellStart"/>
+      <w:r>
+        <w:t>ke</w:t>
+      </w:r>
+      <w:proofErr w:type="spellEnd"/>
+      <w:r>
+        <w:t xml:space="preserve"> instance API (</w:t>
+      </w:r>
+      <w:proofErr w:type="spellStart"/>
+      <w:r>
+        <w:t>seperti</w:t>
+      </w:r>
+      <w:proofErr w:type="spellEnd"/>
+      <w:r>
+        <w:t xml:space="preserve"> Axios), yang mana </w:t>
+      </w:r>
+      <w:proofErr w:type="spellStart"/>
+      <w:r>
+        <w:t>merupakan</w:t>
+      </w:r>
+      <w:proofErr w:type="spellEnd"/>
+      <w:r>
+        <w:t xml:space="preserve"> </w:t>
+      </w:r>
+      <w:proofErr w:type="spellStart"/>
+      <w:r>
+        <w:t>murni</w:t>
+      </w:r>
+      <w:proofErr w:type="spellEnd"/>
+      <w:r>
+        <w:t> </w:t>
+      </w:r>
+      <w:r>
+        <w:rPr>
+          <w:i/>
+          <w:iCs/>
+        </w:rPr>
+        <w:t>side effect</w:t>
+      </w:r>
       <w:r>
         <w:t>.</w:t>
       </w:r>
     </w:p>
     <w:p>
       <w:pPr>
-        <w:spacing w:line="240" w:lineRule="auto"/>
-      </w:pPr>
-    </w:p>
-    <w:p>
-      <w:pPr>
-        <w:spacing w:line="240" w:lineRule="auto"/>
-      </w:pPr>
-    </w:p>
-    <w:p>
-      <w:pPr>
-        <w:spacing w:line="240" w:lineRule="auto"/>
-      </w:pPr>
+        <w:numPr>
+          <w:ilvl w:val="0"/>
+          <w:numId w:val="3"/>
+        </w:numPr>
+        <w:spacing w:line="240" w:lineRule="auto"/>
+        <w:jc w:val="both"/>
+      </w:pPr>
+      <w:proofErr w:type="spellStart"/>
+      <w:r>
+        <w:t>Penambahan</w:t>
+      </w:r>
+      <w:proofErr w:type="spellEnd"/>
+      <w:r>
+        <w:t> replace pada Navigate:</w:t>
+      </w:r>
+      <w:r>
+        <w:br/>
+      </w:r>
+      <w:proofErr w:type="spellStart"/>
+      <w:r>
+        <w:t>M</w:t>
+      </w:r>
+      <w:r>
+        <w:t>enambahkan</w:t>
+      </w:r>
+      <w:proofErr w:type="spellEnd"/>
+      <w:r>
+        <w:t xml:space="preserve"> </w:t>
+      </w:r>
+      <w:proofErr w:type="spellStart"/>
+      <w:r>
+        <w:t>properti</w:t>
+      </w:r>
+      <w:proofErr w:type="spellEnd"/>
+      <w:r>
+        <w:t xml:space="preserve"> replace pada &lt;Navigate /&gt; agar user </w:t>
+      </w:r>
+      <w:proofErr w:type="spellStart"/>
+      <w:r>
+        <w:t>tidak</w:t>
+      </w:r>
+      <w:proofErr w:type="spellEnd"/>
+      <w:r>
+        <w:t xml:space="preserve"> </w:t>
+      </w:r>
+      <w:proofErr w:type="spellStart"/>
+      <w:r>
+        <w:t>terjebak</w:t>
+      </w:r>
+      <w:proofErr w:type="spellEnd"/>
+      <w:r>
+        <w:t xml:space="preserve"> </w:t>
+      </w:r>
+      <w:proofErr w:type="spellStart"/>
+      <w:r>
+        <w:t>dalam</w:t>
+      </w:r>
+      <w:proofErr w:type="spellEnd"/>
+      <w:r>
+        <w:t xml:space="preserve"> loop </w:t>
+      </w:r>
+      <w:proofErr w:type="spellStart"/>
+      <w:r>
+        <w:t>tombol</w:t>
+      </w:r>
+      <w:proofErr w:type="spellEnd"/>
+      <w:r>
+        <w:t xml:space="preserve"> "back" di browser.</w:t>
+      </w:r>
+    </w:p>
+    <w:p>
+      <w:pPr>
+        <w:numPr>
+          <w:ilvl w:val="0"/>
+          <w:numId w:val="3"/>
+        </w:numPr>
+        <w:spacing w:line="240" w:lineRule="auto"/>
+        <w:jc w:val="both"/>
+      </w:pPr>
+      <w:proofErr w:type="spellStart"/>
+      <w:r>
+        <w:t>Perbaikan</w:t>
+      </w:r>
+      <w:proofErr w:type="spellEnd"/>
+      <w:r>
+        <w:t xml:space="preserve"> Path:</w:t>
+      </w:r>
+    </w:p>
+    <w:p>
+      <w:pPr>
+        <w:spacing w:line="240" w:lineRule="auto"/>
+        <w:ind w:left="720"/>
+        <w:jc w:val="both"/>
+      </w:pPr>
+      <w:proofErr w:type="spellStart"/>
+      <w:r>
+        <w:t>M</w:t>
+      </w:r>
+      <w:r>
+        <w:t>enghapus</w:t>
+      </w:r>
+      <w:proofErr w:type="spellEnd"/>
+      <w:r>
+        <w:t> /admin/review </w:t>
+      </w:r>
+      <w:proofErr w:type="spellStart"/>
+      <w:r>
+        <w:t>menjadi</w:t>
+      </w:r>
+      <w:proofErr w:type="spellEnd"/>
+      <w:r>
+        <w:t> review </w:t>
+      </w:r>
+      <w:proofErr w:type="spellStart"/>
+      <w:r>
+        <w:t>saja</w:t>
+      </w:r>
+      <w:proofErr w:type="spellEnd"/>
+      <w:r>
+        <w:t xml:space="preserve"> di </w:t>
+      </w:r>
+      <w:proofErr w:type="spellStart"/>
+      <w:r>
+        <w:t>dalam</w:t>
+      </w:r>
+      <w:proofErr w:type="spellEnd"/>
+      <w:r>
+        <w:t xml:space="preserve"> Route admin, </w:t>
+      </w:r>
+      <w:proofErr w:type="spellStart"/>
+      <w:r>
+        <w:t>karena</w:t>
+      </w:r>
+      <w:proofErr w:type="spellEnd"/>
+      <w:r>
+        <w:t xml:space="preserve"> </w:t>
+      </w:r>
+      <w:proofErr w:type="spellStart"/>
+      <w:r>
+        <w:t>sudah</w:t>
+      </w:r>
+      <w:proofErr w:type="spellEnd"/>
+      <w:r>
+        <w:t xml:space="preserve"> </w:t>
+      </w:r>
+      <w:proofErr w:type="spellStart"/>
+      <w:r>
+        <w:t>berada</w:t>
+      </w:r>
+      <w:proofErr w:type="spellEnd"/>
+      <w:r>
+        <w:t xml:space="preserve"> di </w:t>
+      </w:r>
+      <w:proofErr w:type="spellStart"/>
+      <w:r>
+        <w:t>bawah</w:t>
+      </w:r>
+      <w:proofErr w:type="spellEnd"/>
+      <w:r>
+        <w:t xml:space="preserve"> prefix /admin.</w:t>
+      </w:r>
+    </w:p>
+    <w:p>
+      <w:pPr>
+        <w:spacing w:line="240" w:lineRule="auto"/>
+      </w:pPr>
+      <w:r>
+        <w:t xml:space="preserve"> </w:t>
+      </w:r>
+    </w:p>
+    <w:p>
+      <w:pPr>
+        <w:spacing w:line="240" w:lineRule="auto"/>
+      </w:pPr>
+      <w:r>
+        <w:t xml:space="preserve">6. </w:t>
+      </w:r>
     </w:p>
     <w:p>
       <w:pPr>
@@ -1484,6 +2162,119 @@
 <file path=word/numbering.xml><?xml version="1.0" encoding="utf-8"?>
 <w:numbering xmlns:wpc="http://schemas.microsoft.com/office/word/2010/wordprocessingCanvas" xmlns:cx="http://schemas.microsoft.com/office/drawing/2014/chartex" xmlns:cx1="http://schemas.microsoft.com/office/drawing/2015/9/8/chartex" xmlns:cx2="http://schemas.microsoft.com/office/drawing/2015/10/21/chartex" xmlns:cx3="http://schemas.microsoft.com/office/drawing/2016/5/9/chartex" xmlns:cx4="http://schemas.microsoft.com/office/drawing/2016/5/10/chartex" xmlns:cx5="http://schemas.microsoft.com/office/drawing/2016/5/11/chartex" xmlns:cx6="http://schemas.microsoft.com/office/drawing/2016/5/12/chartex" xmlns:cx7="http://schemas.microsoft.com/office/drawing/2016/5/13/chartex" xmlns:cx8="http://schemas.microsoft.com/office/drawing/2016/5/14/chartex" xmlns:mc="http://schemas.openxmlformats.org/markup-compatibility/2006" xmlns:aink="http://schemas.microsoft.com/office/drawing/2016/ink" xmlns:am3d="http://schemas.microsoft.com/office/drawing/2017/model3d" xmlns:o="urn:schemas-microsoft-com:office:office" xmlns:oel="http://schemas.microsoft.com/office/2019/extlst" xmlns:r="http://schemas.openxmlformats.org/officeDocument/2006/relationships" xmlns:m="http://schemas.openxmlformats.org/officeDocument/2006/math" xmlns:v="urn:schemas-microsoft-com:vml" xmlns:wp14="http://schemas.microsoft.com/office/word/2010/wordprocessingDrawing" xmlns:wp="http://schemas.openxmlformats.org/drawingml/2006/wordprocessingDrawing" xmlns:w10="urn:schemas-microsoft-com:office:word" xmlns:w="http://schemas.openxmlformats.org/wordprocessingml/2006/main" xmlns:w14="http://schemas.microsoft.com/office/word/2010/wordml" xmlns:w15="http://schemas.microsoft.com/office/word/2012/wordml" xmlns:w16cex="http://schemas.microsoft.com/office/word/2018/wordml/cex" xmlns:w16cid="http://schemas.microsoft.com/office/word/2016/wordml/cid" xmlns:w16="http://schemas.microsoft.com/office/word/2018/wordml" xmlns:w16du="http://schemas.microsoft.com/office/word/2023/wordml/word16du" xmlns:w16sdtdh="http://schemas.microsoft.com/office/word/2020/wordml/sdtdatahash" xmlns:w16sdtfl="http://schemas.microsoft.com/office/word/2024/wordml/sdtformatlock" xmlns:w16se="http://schemas.microsoft.com/office/word/2015/wordml/symex" xmlns:wpg="http://schemas.microsoft.com/office/word/2010/wordprocessingGroup" xmlns:wpi="http://schemas.microsoft.com/office/word/2010/wordprocessingInk" xmlns:wne="http://schemas.microsoft.com/office/word/2006/wordml" xmlns:wps="http://schemas.microsoft.com/office/word/2010/wordprocessingShape" mc:Ignorable="w14 w15 w16se w16cid w16 w16cex w16sdtdh w16sdtfl w16du wp14">
   <w:abstractNum w:abstractNumId="0" w15:restartNumberingAfterBreak="0">
+    <w:nsid w:val="1D550A8C"/>
+    <w:multiLevelType w:val="multilevel"/>
+    <w:tmpl w:val="A1469022"/>
+    <w:lvl w:ilvl="0">
+      <w:start w:val="1"/>
+      <w:numFmt w:val="decimal"/>
+      <w:lvlText w:val="%1."/>
+      <w:lvlJc w:val="left"/>
+      <w:pPr>
+        <w:tabs>
+          <w:tab w:val="num" w:pos="720"/>
+        </w:tabs>
+        <w:ind w:left="720" w:hanging="360"/>
+      </w:pPr>
+    </w:lvl>
+    <w:lvl w:ilvl="1" w:tentative="1">
+      <w:start w:val="1"/>
+      <w:numFmt w:val="decimal"/>
+      <w:lvlText w:val="%2."/>
+      <w:lvlJc w:val="left"/>
+      <w:pPr>
+        <w:tabs>
+          <w:tab w:val="num" w:pos="1440"/>
+        </w:tabs>
+        <w:ind w:left="1440" w:hanging="360"/>
+      </w:pPr>
+    </w:lvl>
+    <w:lvl w:ilvl="2" w:tentative="1">
+      <w:start w:val="1"/>
+      <w:numFmt w:val="decimal"/>
+      <w:lvlText w:val="%3."/>
+      <w:lvlJc w:val="left"/>
+      <w:pPr>
+        <w:tabs>
+          <w:tab w:val="num" w:pos="2160"/>
+        </w:tabs>
+        <w:ind w:left="2160" w:hanging="360"/>
+      </w:pPr>
+    </w:lvl>
+    <w:lvl w:ilvl="3" w:tentative="1">
+      <w:start w:val="1"/>
+      <w:numFmt w:val="decimal"/>
+      <w:lvlText w:val="%4."/>
+      <w:lvlJc w:val="left"/>
+      <w:pPr>
+        <w:tabs>
+          <w:tab w:val="num" w:pos="2880"/>
+        </w:tabs>
+        <w:ind w:left="2880" w:hanging="360"/>
+      </w:pPr>
+    </w:lvl>
+    <w:lvl w:ilvl="4" w:tentative="1">
+      <w:start w:val="1"/>
+      <w:numFmt w:val="decimal"/>
+      <w:lvlText w:val="%5."/>
+      <w:lvlJc w:val="left"/>
+      <w:pPr>
+        <w:tabs>
+          <w:tab w:val="num" w:pos="3600"/>
+        </w:tabs>
+        <w:ind w:left="3600" w:hanging="360"/>
+      </w:pPr>
+    </w:lvl>
+    <w:lvl w:ilvl="5" w:tentative="1">
+      <w:start w:val="1"/>
+      <w:numFmt w:val="decimal"/>
+      <w:lvlText w:val="%6."/>
+      <w:lvlJc w:val="left"/>
+      <w:pPr>
+        <w:tabs>
+          <w:tab w:val="num" w:pos="4320"/>
+        </w:tabs>
+        <w:ind w:left="4320" w:hanging="360"/>
+      </w:pPr>
+    </w:lvl>
+    <w:lvl w:ilvl="6" w:tentative="1">
+      <w:start w:val="1"/>
+      <w:numFmt w:val="decimal"/>
+      <w:lvlText w:val="%7."/>
+      <w:lvlJc w:val="left"/>
+      <w:pPr>
+        <w:tabs>
+          <w:tab w:val="num" w:pos="5040"/>
+        </w:tabs>
+        <w:ind w:left="5040" w:hanging="360"/>
+      </w:pPr>
+    </w:lvl>
+    <w:lvl w:ilvl="7" w:tentative="1">
+      <w:start w:val="1"/>
+      <w:numFmt w:val="decimal"/>
+      <w:lvlText w:val="%8."/>
+      <w:lvlJc w:val="left"/>
+      <w:pPr>
+        <w:tabs>
+          <w:tab w:val="num" w:pos="5760"/>
+        </w:tabs>
+        <w:ind w:left="5760" w:hanging="360"/>
+      </w:pPr>
+    </w:lvl>
+    <w:lvl w:ilvl="8" w:tentative="1">
+      <w:start w:val="1"/>
+      <w:numFmt w:val="decimal"/>
+      <w:lvlText w:val="%9."/>
+      <w:lvlJc w:val="left"/>
+      <w:pPr>
+        <w:tabs>
+          <w:tab w:val="num" w:pos="6480"/>
+        </w:tabs>
+        <w:ind w:left="6480" w:hanging="360"/>
+      </w:pPr>
+    </w:lvl>
+  </w:abstractNum>
+  <w:abstractNum w:abstractNumId="1" w15:restartNumberingAfterBreak="0">
     <w:nsid w:val="7B92578F"/>
     <w:multiLevelType w:val="hybridMultilevel"/>
     <w:tmpl w:val="B804E9B8"/>
@@ -1596,7 +2387,7 @@
       </w:rPr>
     </w:lvl>
   </w:abstractNum>
-  <w:abstractNum w:abstractNumId="1" w15:restartNumberingAfterBreak="0">
+  <w:abstractNum w:abstractNumId="2" w15:restartNumberingAfterBreak="0">
     <w:nsid w:val="7DD5389E"/>
     <w:multiLevelType w:val="hybridMultilevel"/>
     <w:tmpl w:val="6840CD52"/>
@@ -1710,10 +2501,13 @@
     </w:lvl>
   </w:abstractNum>
   <w:num w:numId="1" w16cid:durableId="775180286">
-    <w:abstractNumId w:val="0"/>
+    <w:abstractNumId w:val="1"/>
   </w:num>
   <w:num w:numId="2" w16cid:durableId="1579442916">
-    <w:abstractNumId w:val="1"/>
+    <w:abstractNumId w:val="2"/>
+  </w:num>
+  <w:num w:numId="3" w16cid:durableId="1996445871">
+    <w:abstractNumId w:val="0"/>
   </w:num>
 </w:numbering>
 </file>

</xml_diff>

<commit_message>
Update file auth.ts pada File : wisata-CPMApp\user\app\lib\auth\utils\auth.ts
</commit_message>
<xml_diff>
--- a/Dokumentasi/24382001P_Lorensius Firngadi_Dokumentasi Sesi 3.docx
+++ b/Dokumentasi/24382001P_Lorensius Firngadi_Dokumentasi Sesi 3.docx
@@ -12,21 +12,12 @@
           <w:bCs/>
         </w:rPr>
       </w:pPr>
-      <w:proofErr w:type="spellStart"/>
       <w:r>
         <w:rPr>
           <w:b/>
           <w:bCs/>
         </w:rPr>
-        <w:t>Tugas</w:t>
-      </w:r>
-      <w:proofErr w:type="spellEnd"/>
-      <w:r>
-        <w:rPr>
-          <w:b/>
-          <w:bCs/>
-        </w:rPr>
-        <w:t xml:space="preserve"> Project</w:t>
+        <w:t>Tugas Project</w:t>
       </w:r>
     </w:p>
     <w:p>
@@ -44,55 +35,7 @@
           <w:b/>
           <w:bCs/>
         </w:rPr>
-        <w:t xml:space="preserve">Mata </w:t>
-      </w:r>
-      <w:proofErr w:type="gramStart"/>
-      <w:r>
-        <w:rPr>
-          <w:b/>
-          <w:bCs/>
-        </w:rPr>
-        <w:t>Kuliah :</w:t>
-      </w:r>
-      <w:proofErr w:type="gramEnd"/>
-      <w:r>
-        <w:rPr>
-          <w:b/>
-          <w:bCs/>
-        </w:rPr>
-        <w:t xml:space="preserve"> </w:t>
-      </w:r>
-      <w:proofErr w:type="spellStart"/>
-      <w:r>
-        <w:rPr>
-          <w:b/>
-          <w:bCs/>
-        </w:rPr>
-        <w:t>Pemrograman</w:t>
-      </w:r>
-      <w:proofErr w:type="spellEnd"/>
-      <w:r>
-        <w:rPr>
-          <w:b/>
-          <w:bCs/>
-        </w:rPr>
-        <w:t xml:space="preserve"> </w:t>
-      </w:r>
-      <w:proofErr w:type="spellStart"/>
-      <w:r>
-        <w:rPr>
-          <w:b/>
-          <w:bCs/>
-        </w:rPr>
-        <w:t>Berorientasi</w:t>
-      </w:r>
-      <w:proofErr w:type="spellEnd"/>
-      <w:r>
-        <w:rPr>
-          <w:b/>
-          <w:bCs/>
-        </w:rPr>
-        <w:t xml:space="preserve"> Service (IF 23 E)</w:t>
+        <w:t>Mata Kuliah : Pemrograman Berorientasi Service (IF 23 E)</w:t>
       </w:r>
     </w:p>
     <w:p>
@@ -110,22 +53,9 @@
       <w:r>
         <w:t>Nama</w:t>
       </w:r>
-      <w:proofErr w:type="gramStart"/>
       <w:r>
         <w:tab/>
-        <w:t xml:space="preserve"> :</w:t>
-      </w:r>
-      <w:proofErr w:type="gramEnd"/>
-      <w:r>
-        <w:t xml:space="preserve"> </w:t>
-      </w:r>
-      <w:proofErr w:type="spellStart"/>
-      <w:r>
-        <w:t>Lorensius</w:t>
-      </w:r>
-      <w:proofErr w:type="spellEnd"/>
-      <w:r>
-        <w:t xml:space="preserve"> Firngadi</w:t>
+        <w:t xml:space="preserve"> : Lorensius Firngadi</w:t>
       </w:r>
     </w:p>
     <w:p>
@@ -137,14 +67,9 @@
       <w:r>
         <w:t>NPM</w:t>
       </w:r>
-      <w:proofErr w:type="gramStart"/>
       <w:r>
         <w:tab/>
-        <w:t xml:space="preserve"> :</w:t>
-      </w:r>
-      <w:proofErr w:type="gramEnd"/>
-      <w:r>
-        <w:t xml:space="preserve"> 24382001P</w:t>
+        <w:t xml:space="preserve"> : 24382001P</w:t>
       </w:r>
     </w:p>
     <w:p>
@@ -153,19 +78,12 @@
         <w:contextualSpacing/>
         <w:jc w:val="both"/>
       </w:pPr>
-      <w:proofErr w:type="spellStart"/>
       <w:r>
         <w:t>Kelas</w:t>
       </w:r>
-      <w:proofErr w:type="spellEnd"/>
-      <w:proofErr w:type="gramStart"/>
       <w:r>
         <w:tab/>
-        <w:t xml:space="preserve"> :</w:t>
-      </w:r>
-      <w:proofErr w:type="gramEnd"/>
-      <w:r>
-        <w:t xml:space="preserve"> IF 23 E</w:t>
+        <w:t xml:space="preserve"> : IF 23 E</w:t>
       </w:r>
     </w:p>
     <w:p>
@@ -181,45 +99,9 @@
         <w:contextualSpacing/>
         <w:jc w:val="both"/>
       </w:pPr>
-      <w:proofErr w:type="spellStart"/>
-      <w:proofErr w:type="gramStart"/>
-      <w:r>
-        <w:t>Kelompok</w:t>
-      </w:r>
-      <w:proofErr w:type="spellEnd"/>
-      <w:r>
-        <w:t xml:space="preserve"> :</w:t>
-      </w:r>
-      <w:proofErr w:type="gramEnd"/>
-      <w:r>
-        <w:t xml:space="preserve"> Ferdi, </w:t>
-      </w:r>
-      <w:proofErr w:type="spellStart"/>
-      <w:r>
-        <w:t>minum</w:t>
-      </w:r>
-      <w:proofErr w:type="spellEnd"/>
-      <w:r>
-        <w:t xml:space="preserve"> </w:t>
-      </w:r>
-      <w:proofErr w:type="spellStart"/>
-      <w:r>
-        <w:t>Paramex</w:t>
-      </w:r>
-      <w:proofErr w:type="spellEnd"/>
-      <w:r>
-        <w:t xml:space="preserve"> </w:t>
-      </w:r>
-      <w:proofErr w:type="spellStart"/>
-      <w:proofErr w:type="gramStart"/>
-      <w:r>
-        <w:t>dulu</w:t>
-      </w:r>
-      <w:proofErr w:type="spellEnd"/>
-      <w:r>
-        <w:t xml:space="preserve"> !</w:t>
-      </w:r>
-      <w:proofErr w:type="gramEnd"/>
+      <w:r>
+        <w:t>Kelompok : Ferdi, minum Paramex dulu !</w:t>
+      </w:r>
     </w:p>
     <w:p>
       <w:pPr>
@@ -234,24 +116,9 @@
         <w:contextualSpacing/>
         <w:jc w:val="both"/>
       </w:pPr>
-      <w:proofErr w:type="spellStart"/>
-      <w:r>
-        <w:t>Anggota</w:t>
-      </w:r>
-      <w:proofErr w:type="spellEnd"/>
-      <w:r>
-        <w:t xml:space="preserve"> </w:t>
-      </w:r>
-      <w:proofErr w:type="spellStart"/>
-      <w:proofErr w:type="gramStart"/>
-      <w:r>
-        <w:t>Kelompok</w:t>
-      </w:r>
-      <w:proofErr w:type="spellEnd"/>
-      <w:r>
-        <w:t xml:space="preserve"> :</w:t>
-      </w:r>
-      <w:proofErr w:type="gramEnd"/>
+      <w:r>
+        <w:t>Anggota Kelompok :</w:t>
+      </w:r>
     </w:p>
     <w:p>
       <w:pPr>
@@ -263,29 +130,8 @@
         <w:spacing w:line="240" w:lineRule="auto"/>
         <w:jc w:val="both"/>
       </w:pPr>
-      <w:proofErr w:type="spellStart"/>
-      <w:r>
-        <w:t>Exsa</w:t>
-      </w:r>
-      <w:proofErr w:type="spellEnd"/>
-      <w:r>
-        <w:t xml:space="preserve"> </w:t>
-      </w:r>
-      <w:proofErr w:type="spellStart"/>
-      <w:r>
-        <w:t>Agdi</w:t>
-      </w:r>
-      <w:proofErr w:type="spellEnd"/>
-      <w:r>
-        <w:t xml:space="preserve"> </w:t>
-      </w:r>
-      <w:proofErr w:type="spellStart"/>
-      <w:r>
-        <w:t>Farhensen</w:t>
-      </w:r>
-      <w:proofErr w:type="spellEnd"/>
-      <w:r>
-        <w:t xml:space="preserve"> - 23312176</w:t>
+      <w:r>
+        <w:t>Exsa Agdi Farhensen - 23312176</w:t>
       </w:r>
     </w:p>
     <w:p>
@@ -298,21 +144,8 @@
         <w:spacing w:line="240" w:lineRule="auto"/>
         <w:jc w:val="both"/>
       </w:pPr>
-      <w:proofErr w:type="spellStart"/>
-      <w:r>
-        <w:t>Divka</w:t>
-      </w:r>
-      <w:proofErr w:type="spellEnd"/>
-      <w:r>
-        <w:t xml:space="preserve"> </w:t>
-      </w:r>
-      <w:proofErr w:type="spellStart"/>
-      <w:r>
-        <w:t>Ferdiansyah</w:t>
-      </w:r>
-      <w:proofErr w:type="spellEnd"/>
-      <w:r>
-        <w:t xml:space="preserve"> - 23312173</w:t>
+      <w:r>
+        <w:t>Divka Ferdiansyah - 23312173</w:t>
       </w:r>
     </w:p>
     <w:p>
@@ -325,13 +158,8 @@
         <w:spacing w:line="240" w:lineRule="auto"/>
         <w:jc w:val="both"/>
       </w:pPr>
-      <w:proofErr w:type="spellStart"/>
-      <w:r>
-        <w:t>Lorensius</w:t>
-      </w:r>
-      <w:proofErr w:type="spellEnd"/>
-      <w:r>
-        <w:t xml:space="preserve"> Firngadi - 24382001P</w:t>
+      <w:r>
+        <w:t>Lorensius Firngadi - 24382001P</w:t>
       </w:r>
     </w:p>
     <w:p>
@@ -347,27 +175,9 @@
         <w:contextualSpacing/>
         <w:jc w:val="both"/>
       </w:pPr>
-      <w:proofErr w:type="spellStart"/>
-      <w:r>
-        <w:t>Judul</w:t>
-      </w:r>
-      <w:proofErr w:type="spellEnd"/>
-      <w:r>
-        <w:t xml:space="preserve"> </w:t>
-      </w:r>
-      <w:proofErr w:type="gramStart"/>
-      <w:r>
-        <w:t>Project :</w:t>
-      </w:r>
-      <w:proofErr w:type="gramEnd"/>
-      <w:r>
-        <w:t xml:space="preserve"> </w:t>
-      </w:r>
-      <w:proofErr w:type="spellStart"/>
-      <w:r>
-        <w:t>CPMApp</w:t>
-      </w:r>
-      <w:proofErr w:type="spellEnd"/>
+      <w:r>
+        <w:t>Judul Project : CPMApp</w:t>
+      </w:r>
     </w:p>
     <w:p>
       <w:pPr>
@@ -382,19 +192,9 @@
         <w:contextualSpacing/>
         <w:jc w:val="both"/>
       </w:pPr>
-      <w:proofErr w:type="spellStart"/>
-      <w:r>
-        <w:t>Deskripsi</w:t>
-      </w:r>
-      <w:proofErr w:type="spellEnd"/>
-      <w:r>
-        <w:t xml:space="preserve"> </w:t>
-      </w:r>
-      <w:proofErr w:type="gramStart"/>
-      <w:r>
-        <w:t>Project :</w:t>
-      </w:r>
-      <w:proofErr w:type="gramEnd"/>
+      <w:r>
+        <w:t>Deskripsi Project :</w:t>
+      </w:r>
     </w:p>
     <w:p>
       <w:pPr>
@@ -402,163 +202,9 @@
         <w:contextualSpacing/>
         <w:jc w:val="both"/>
       </w:pPr>
-      <w:proofErr w:type="spellStart"/>
-      <w:r>
-        <w:t>sistem</w:t>
-      </w:r>
-      <w:proofErr w:type="spellEnd"/>
-      <w:r>
-        <w:t xml:space="preserve"> 2 </w:t>
-      </w:r>
-      <w:proofErr w:type="spellStart"/>
-      <w:r>
-        <w:t>pengguna</w:t>
-      </w:r>
-      <w:proofErr w:type="spellEnd"/>
-      <w:r>
-        <w:t xml:space="preserve"> admin dan costumer, admin </w:t>
-      </w:r>
-      <w:proofErr w:type="spellStart"/>
-      <w:r>
-        <w:t>bisa</w:t>
-      </w:r>
-      <w:proofErr w:type="spellEnd"/>
-      <w:r>
-        <w:t xml:space="preserve"> </w:t>
-      </w:r>
-      <w:proofErr w:type="spellStart"/>
-      <w:r>
-        <w:t>menambahkan</w:t>
-      </w:r>
-      <w:proofErr w:type="spellEnd"/>
-      <w:r>
-        <w:t xml:space="preserve"> </w:t>
-      </w:r>
-      <w:proofErr w:type="spellStart"/>
-      <w:r>
-        <w:t>tempat</w:t>
-      </w:r>
-      <w:proofErr w:type="spellEnd"/>
-      <w:r>
-        <w:t xml:space="preserve"> </w:t>
-      </w:r>
-      <w:proofErr w:type="spellStart"/>
-      <w:r>
-        <w:t>wisata</w:t>
-      </w:r>
-      <w:proofErr w:type="spellEnd"/>
-      <w:r>
-        <w:t xml:space="preserve">, </w:t>
-      </w:r>
-      <w:proofErr w:type="spellStart"/>
-      <w:r>
-        <w:t>foto</w:t>
-      </w:r>
-      <w:proofErr w:type="spellEnd"/>
-      <w:r>
-        <w:t xml:space="preserve">, </w:t>
-      </w:r>
-      <w:proofErr w:type="spellStart"/>
-      <w:r>
-        <w:t>deksripsi</w:t>
-      </w:r>
-      <w:proofErr w:type="spellEnd"/>
-      <w:r>
-        <w:t xml:space="preserve">, </w:t>
-      </w:r>
-      <w:proofErr w:type="spellStart"/>
-      <w:r>
-        <w:t>harga</w:t>
-      </w:r>
-      <w:proofErr w:type="spellEnd"/>
-      <w:r>
-        <w:t xml:space="preserve"> </w:t>
-      </w:r>
-      <w:proofErr w:type="spellStart"/>
-      <w:r>
-        <w:t>masuk</w:t>
-      </w:r>
-      <w:proofErr w:type="spellEnd"/>
-      <w:r>
-        <w:t xml:space="preserve">, dan </w:t>
-      </w:r>
-      <w:proofErr w:type="spellStart"/>
-      <w:r>
-        <w:t>menerima</w:t>
-      </w:r>
-      <w:proofErr w:type="spellEnd"/>
-      <w:r>
-        <w:t xml:space="preserve"> review costumer. costumer </w:t>
-      </w:r>
-      <w:proofErr w:type="spellStart"/>
-      <w:r>
-        <w:t>bisa</w:t>
-      </w:r>
-      <w:proofErr w:type="spellEnd"/>
-      <w:r>
-        <w:t xml:space="preserve"> </w:t>
-      </w:r>
-      <w:proofErr w:type="spellStart"/>
-      <w:r>
-        <w:t>melihat</w:t>
-      </w:r>
-      <w:proofErr w:type="spellEnd"/>
-      <w:r>
-        <w:t xml:space="preserve"> </w:t>
-      </w:r>
-      <w:proofErr w:type="spellStart"/>
-      <w:r>
-        <w:t>memberi</w:t>
-      </w:r>
-      <w:proofErr w:type="spellEnd"/>
-      <w:r>
-        <w:t xml:space="preserve"> </w:t>
-      </w:r>
-      <w:proofErr w:type="spellStart"/>
-      <w:r>
-        <w:t>komentar</w:t>
-      </w:r>
-      <w:proofErr w:type="spellEnd"/>
-      <w:r>
-        <w:t xml:space="preserve"> </w:t>
-      </w:r>
-      <w:proofErr w:type="spellStart"/>
-      <w:r>
-        <w:t>riview</w:t>
-      </w:r>
-      <w:proofErr w:type="spellEnd"/>
-      <w:r>
-        <w:t xml:space="preserve"> </w:t>
-      </w:r>
-      <w:proofErr w:type="spellStart"/>
-      <w:r>
-        <w:t>tempat</w:t>
-      </w:r>
-      <w:proofErr w:type="spellEnd"/>
-      <w:r>
-        <w:t xml:space="preserve"> </w:t>
-      </w:r>
-      <w:proofErr w:type="spellStart"/>
-      <w:r>
-        <w:t>wisata</w:t>
-      </w:r>
-      <w:proofErr w:type="spellEnd"/>
-      <w:r>
-        <w:t xml:space="preserve"> </w:t>
-      </w:r>
-      <w:proofErr w:type="spellStart"/>
-      <w:r>
-        <w:t>setelah</w:t>
-      </w:r>
-      <w:proofErr w:type="spellEnd"/>
-      <w:r>
-        <w:t xml:space="preserve"> </w:t>
-      </w:r>
-      <w:proofErr w:type="spellStart"/>
-      <w:r>
-        <w:t>mengunjungi</w:t>
-      </w:r>
-      <w:proofErr w:type="spellEnd"/>
+      <w:r>
+        <w:t>sistem 2 pengguna admin dan costumer, admin bisa menambahkan tempat wisata, foto, deksripsi, harga masuk, dan menerima review costumer. costumer bisa melihat memberi komentar riview tempat wisata setelah mengunjungi</w:t>
+      </w:r>
     </w:p>
     <w:p>
       <w:pPr>
@@ -581,21 +227,12 @@
           <w:bCs/>
         </w:rPr>
       </w:pPr>
-      <w:proofErr w:type="spellStart"/>
       <w:r>
         <w:rPr>
           <w:b/>
           <w:bCs/>
         </w:rPr>
-        <w:t>Dokumentasi</w:t>
-      </w:r>
-      <w:proofErr w:type="spellEnd"/>
-      <w:r>
-        <w:rPr>
-          <w:b/>
-          <w:bCs/>
-        </w:rPr>
-        <w:t xml:space="preserve"> Sesi 3.</w:t>
+        <w:t>Dokumentasi Sesi 3.</w:t>
       </w:r>
     </w:p>
     <w:p>
@@ -613,31 +250,7 @@
         <w:t xml:space="preserve">1. </w:t>
       </w:r>
       <w:r>
-        <w:t xml:space="preserve">Membuat </w:t>
-      </w:r>
-      <w:proofErr w:type="gramStart"/>
-      <w:r>
-        <w:t>file :</w:t>
-      </w:r>
-      <w:proofErr w:type="gramEnd"/>
-      <w:r>
-        <w:t xml:space="preserve"> .</w:t>
-      </w:r>
-      <w:proofErr w:type="spellStart"/>
-      <w:r>
-        <w:t>env.example</w:t>
-      </w:r>
-      <w:proofErr w:type="spellEnd"/>
-      <w:r>
-        <w:t xml:space="preserve"> pada folder </w:t>
-      </w:r>
-      <w:proofErr w:type="spellStart"/>
-      <w:r>
-        <w:t>api</w:t>
-      </w:r>
-      <w:proofErr w:type="spellEnd"/>
-      <w:r>
-        <w:t>.</w:t>
+        <w:t>Membuat file : .env.example pada folder api.</w:t>
       </w:r>
     </w:p>
     <w:p>
@@ -711,95 +324,7 @@
         <w:contextualSpacing/>
       </w:pPr>
       <w:r>
-        <w:t>Membuat file .</w:t>
-      </w:r>
-      <w:proofErr w:type="spellStart"/>
-      <w:r>
-        <w:t>env.example</w:t>
-      </w:r>
-      <w:proofErr w:type="spellEnd"/>
-      <w:r>
-        <w:t xml:space="preserve"> </w:t>
-      </w:r>
-      <w:proofErr w:type="spellStart"/>
-      <w:r>
-        <w:t>ini</w:t>
-      </w:r>
-      <w:proofErr w:type="spellEnd"/>
-      <w:r>
-        <w:t xml:space="preserve"> </w:t>
-      </w:r>
-      <w:proofErr w:type="spellStart"/>
-      <w:r>
-        <w:t>bertujuan</w:t>
-      </w:r>
-      <w:proofErr w:type="spellEnd"/>
-      <w:r>
-        <w:t xml:space="preserve"> </w:t>
-      </w:r>
-      <w:proofErr w:type="spellStart"/>
-      <w:r>
-        <w:t>untuk</w:t>
-      </w:r>
-      <w:proofErr w:type="spellEnd"/>
-      <w:r>
-        <w:t xml:space="preserve"> </w:t>
-      </w:r>
-      <w:proofErr w:type="spellStart"/>
-      <w:r>
-        <w:t>membedakan</w:t>
-      </w:r>
-      <w:proofErr w:type="spellEnd"/>
-      <w:r>
-        <w:t xml:space="preserve"> mana file .env yang </w:t>
-      </w:r>
-      <w:proofErr w:type="spellStart"/>
-      <w:r>
-        <w:t>akan</w:t>
-      </w:r>
-      <w:proofErr w:type="spellEnd"/>
-      <w:r>
-        <w:t xml:space="preserve"> di push </w:t>
-      </w:r>
-      <w:proofErr w:type="gramStart"/>
-      <w:r>
-        <w:t>dan .env</w:t>
-      </w:r>
-      <w:proofErr w:type="gramEnd"/>
-      <w:r>
-        <w:t xml:space="preserve"> yang </w:t>
-      </w:r>
-      <w:proofErr w:type="spellStart"/>
-      <w:r>
-        <w:t>akan</w:t>
-      </w:r>
-      <w:proofErr w:type="spellEnd"/>
-      <w:r>
-        <w:t xml:space="preserve"> </w:t>
-      </w:r>
-      <w:proofErr w:type="spellStart"/>
-      <w:r>
-        <w:t>digunakan</w:t>
-      </w:r>
-      <w:proofErr w:type="spellEnd"/>
-      <w:r>
-        <w:t xml:space="preserve"> masing-masing </w:t>
-      </w:r>
-      <w:proofErr w:type="spellStart"/>
-      <w:r>
-        <w:t>anggota</w:t>
-      </w:r>
-      <w:proofErr w:type="spellEnd"/>
-      <w:r>
-        <w:t xml:space="preserve"> </w:t>
-      </w:r>
-      <w:proofErr w:type="spellStart"/>
-      <w:r>
-        <w:t>kelompok</w:t>
-      </w:r>
-      <w:proofErr w:type="spellEnd"/>
-      <w:r>
-        <w:t xml:space="preserve">. </w:t>
+        <w:t xml:space="preserve">Membuat file .env.example ini bertujuan untuk membedakan mana file .env yang akan di push dan .env yang akan digunakan masing-masing anggota kelompok. </w:t>
       </w:r>
     </w:p>
     <w:p>
@@ -811,30 +336,9 @@
         </w:numPr>
         <w:spacing w:line="240" w:lineRule="auto"/>
       </w:pPr>
-      <w:proofErr w:type="gramStart"/>
       <w:r>
         <w:lastRenderedPageBreak/>
-        <w:t>.env</w:t>
-      </w:r>
-      <w:proofErr w:type="gramEnd"/>
-      <w:r>
-        <w:t xml:space="preserve"> : file </w:t>
-      </w:r>
-      <w:proofErr w:type="spellStart"/>
-      <w:r>
-        <w:t>pribadi</w:t>
-      </w:r>
-      <w:proofErr w:type="spellEnd"/>
-      <w:r>
-        <w:t xml:space="preserve"> (</w:t>
-      </w:r>
-      <w:proofErr w:type="spellStart"/>
-      <w:r>
-        <w:t>tidak</w:t>
-      </w:r>
-      <w:proofErr w:type="spellEnd"/>
-      <w:r>
-        <w:t xml:space="preserve"> di-push)</w:t>
+        <w:t>.env : file pribadi (tidak di-push)</w:t>
       </w:r>
     </w:p>
     <w:p>
@@ -846,29 +350,8 @@
         </w:numPr>
         <w:spacing w:line="240" w:lineRule="auto"/>
       </w:pPr>
-      <w:proofErr w:type="gramStart"/>
-      <w:r>
-        <w:t>.</w:t>
-      </w:r>
-      <w:proofErr w:type="spellStart"/>
-      <w:r>
-        <w:t>env</w:t>
-      </w:r>
-      <w:proofErr w:type="gramEnd"/>
-      <w:r>
-        <w:t>.</w:t>
-      </w:r>
-      <w:proofErr w:type="gramStart"/>
-      <w:r>
-        <w:t>example</w:t>
-      </w:r>
-      <w:proofErr w:type="spellEnd"/>
-      <w:r>
-        <w:t xml:space="preserve"> :</w:t>
-      </w:r>
-      <w:proofErr w:type="gramEnd"/>
-      <w:r>
-        <w:t xml:space="preserve"> template (di-push)</w:t>
+      <w:r>
+        <w:t>.env.example : template (di-push)</w:t>
       </w:r>
     </w:p>
     <w:p>
@@ -881,57 +364,21 @@
         <w:spacing w:line="240" w:lineRule="auto"/>
       </w:pPr>
       <w:r>
-        <w:t xml:space="preserve">Tim </w:t>
-      </w:r>
-      <w:proofErr w:type="spellStart"/>
-      <w:r>
-        <w:t>cukup</w:t>
-      </w:r>
-      <w:proofErr w:type="spellEnd"/>
-      <w:r>
-        <w:t xml:space="preserve"> copy &gt; edit &gt; </w:t>
-      </w:r>
-      <w:proofErr w:type="spellStart"/>
-      <w:r>
-        <w:t>jalan</w:t>
-      </w:r>
-      <w:proofErr w:type="spellEnd"/>
-    </w:p>
-    <w:p>
-      <w:pPr>
-        <w:spacing w:line="240" w:lineRule="auto"/>
-      </w:pPr>
-    </w:p>
-    <w:p>
-      <w:pPr>
-        <w:spacing w:line="240" w:lineRule="auto"/>
-      </w:pPr>
-      <w:r>
-        <w:t xml:space="preserve">2. </w:t>
-      </w:r>
-      <w:proofErr w:type="spellStart"/>
-      <w:r>
-        <w:t>Perbaikan</w:t>
-      </w:r>
-      <w:proofErr w:type="spellEnd"/>
-      <w:r>
-        <w:t xml:space="preserve"> </w:t>
-      </w:r>
-      <w:proofErr w:type="spellStart"/>
-      <w:r>
-        <w:t>Extensi</w:t>
-      </w:r>
-      <w:proofErr w:type="spellEnd"/>
-      <w:r>
-        <w:t xml:space="preserve"> file pada </w:t>
-      </w:r>
-      <w:proofErr w:type="spellStart"/>
-      <w:proofErr w:type="gramStart"/>
-      <w:r>
-        <w:t>message.utils</w:t>
-      </w:r>
-      <w:proofErr w:type="spellEnd"/>
-      <w:proofErr w:type="gramEnd"/>
+        <w:t>Tim cukup copy &gt; edit &gt; jalan</w:t>
+      </w:r>
+    </w:p>
+    <w:p>
+      <w:pPr>
+        <w:spacing w:line="240" w:lineRule="auto"/>
+      </w:pPr>
+    </w:p>
+    <w:p>
+      <w:pPr>
+        <w:spacing w:line="240" w:lineRule="auto"/>
+      </w:pPr>
+      <w:r>
+        <w:t>2. Perbaikan Extensi file pada message.utils</w:t>
+      </w:r>
     </w:p>
     <w:p>
       <w:pPr>
@@ -995,66 +442,9 @@
       <w:pPr>
         <w:spacing w:line="240" w:lineRule="auto"/>
       </w:pPr>
-      <w:proofErr w:type="spellStart"/>
-      <w:r>
-        <w:t>Extensi</w:t>
-      </w:r>
-      <w:proofErr w:type="spellEnd"/>
-      <w:r>
-        <w:t xml:space="preserve"> file pada </w:t>
-      </w:r>
-      <w:proofErr w:type="spellStart"/>
-      <w:proofErr w:type="gramStart"/>
-      <w:r>
-        <w:t>message.utils</w:t>
-      </w:r>
-      <w:proofErr w:type="spellEnd"/>
-      <w:proofErr w:type="gramEnd"/>
-      <w:r>
-        <w:t xml:space="preserve"> </w:t>
-      </w:r>
-      <w:proofErr w:type="spellStart"/>
-      <w:r>
-        <w:t>awalnya</w:t>
-      </w:r>
-      <w:proofErr w:type="spellEnd"/>
-      <w:r>
-        <w:t xml:space="preserve"> </w:t>
-      </w:r>
-      <w:proofErr w:type="spellStart"/>
-      <w:r>
-        <w:t>kemudian</w:t>
-      </w:r>
-      <w:proofErr w:type="spellEnd"/>
-      <w:r>
-        <w:t xml:space="preserve"> </w:t>
-      </w:r>
-      <w:proofErr w:type="spellStart"/>
-      <w:r>
-        <w:t>diganti</w:t>
-      </w:r>
-      <w:proofErr w:type="spellEnd"/>
-      <w:r>
-        <w:t xml:space="preserve"> </w:t>
-      </w:r>
-      <w:proofErr w:type="spellStart"/>
-      <w:r>
-        <w:t>dengan</w:t>
-      </w:r>
-      <w:proofErr w:type="spellEnd"/>
-      <w:r>
-        <w:t xml:space="preserve"> </w:t>
-      </w:r>
-      <w:proofErr w:type="spellStart"/>
-      <w:proofErr w:type="gramStart"/>
-      <w:r>
-        <w:t>message.utils</w:t>
-      </w:r>
-      <w:proofErr w:type="gramEnd"/>
-      <w:r>
-        <w:t>.ts</w:t>
-      </w:r>
-      <w:proofErr w:type="spellEnd"/>
+      <w:r>
+        <w:t>Extensi file pada message.utils awalnya kemudian diganti dengan message.utils.ts</w:t>
+      </w:r>
     </w:p>
     <w:p>
       <w:pPr>
@@ -1123,42 +513,17 @@
       <w:r>
         <w:t xml:space="preserve">3. Update </w:t>
       </w:r>
-      <w:proofErr w:type="spellStart"/>
-      <w:proofErr w:type="gramStart"/>
       <w:r>
         <w:t>tsconfig.json</w:t>
       </w:r>
-      <w:proofErr w:type="spellEnd"/>
-      <w:proofErr w:type="gramEnd"/>
-    </w:p>
-    <w:p>
-      <w:pPr>
-        <w:spacing w:line="240" w:lineRule="auto"/>
-      </w:pPr>
-      <w:r>
-        <w:t>C:\Users\acr\Documents\PBS PA\</w:t>
-      </w:r>
-      <w:proofErr w:type="spellStart"/>
-      <w:r>
-        <w:t>wisata-CPMApp</w:t>
-      </w:r>
-      <w:proofErr w:type="spellEnd"/>
-      <w:r>
-        <w:t>\</w:t>
-      </w:r>
-      <w:proofErr w:type="spellStart"/>
-      <w:r>
-        <w:t>api</w:t>
-      </w:r>
-      <w:proofErr w:type="spellEnd"/>
-      <w:r>
-        <w:t>\</w:t>
-      </w:r>
-      <w:proofErr w:type="spellStart"/>
-      <w:r>
-        <w:t>tsconfig.json</w:t>
-      </w:r>
-      <w:proofErr w:type="spellEnd"/>
+    </w:p>
+    <w:p>
+      <w:pPr>
+        <w:spacing w:line="240" w:lineRule="auto"/>
+      </w:pPr>
+      <w:r>
+        <w:t>C:\Users\acr\Documents\PBS PA\wisata-CPMApp\api\tsconfig.json</w:t>
+      </w:r>
     </w:p>
     <w:p>
       <w:pPr>
@@ -1210,96 +575,30 @@
         <w:spacing w:line="240" w:lineRule="auto"/>
       </w:pPr>
       <w:r>
-        <w:t xml:space="preserve">Tujuan </w:t>
-      </w:r>
-      <w:proofErr w:type="spellStart"/>
-      <w:r>
-        <w:t>menghapus</w:t>
-      </w:r>
-      <w:proofErr w:type="spellEnd"/>
-      <w:r>
-        <w:t xml:space="preserve"> </w:t>
-      </w:r>
-      <w:r>
-        <w:t>pada "</w:t>
-      </w:r>
-      <w:proofErr w:type="spellStart"/>
-      <w:r>
-        <w:t>baseUrl</w:t>
-      </w:r>
-      <w:proofErr w:type="spellEnd"/>
-      <w:r>
-        <w:t xml:space="preserve">": </w:t>
-      </w:r>
-      <w:proofErr w:type="gramStart"/>
-      <w:r>
-        <w:t>"./</w:t>
-      </w:r>
-      <w:proofErr w:type="spellStart"/>
-      <w:proofErr w:type="gramEnd"/>
-      <w:r>
-        <w:t>dist</w:t>
-      </w:r>
-      <w:proofErr w:type="spellEnd"/>
-      <w:r>
-        <w:t>"</w:t>
-      </w:r>
-      <w:r>
-        <w:t xml:space="preserve"> </w:t>
-      </w:r>
-      <w:proofErr w:type="spellStart"/>
-      <w:r>
-        <w:t>untuk</w:t>
-      </w:r>
-      <w:proofErr w:type="spellEnd"/>
-      <w:r>
-        <w:t xml:space="preserve"> import </w:t>
-      </w:r>
-      <w:proofErr w:type="spellStart"/>
-      <w:r>
-        <w:t>tidak</w:t>
-      </w:r>
-      <w:proofErr w:type="spellEnd"/>
-      <w:r>
-        <w:t xml:space="preserve"> error.</w:t>
-      </w:r>
-    </w:p>
-    <w:p>
-      <w:pPr>
-        <w:spacing w:line="240" w:lineRule="auto"/>
-      </w:pPr>
-    </w:p>
-    <w:p>
-      <w:pPr>
-        <w:spacing w:line="240" w:lineRule="auto"/>
-      </w:pPr>
-      <w:r>
-        <w:t xml:space="preserve">4. </w:t>
-      </w:r>
-      <w:proofErr w:type="spellStart"/>
-      <w:r>
-        <w:t>Mencoba</w:t>
-      </w:r>
-      <w:proofErr w:type="spellEnd"/>
-      <w:r>
-        <w:t xml:space="preserve"> </w:t>
-      </w:r>
-      <w:proofErr w:type="spellStart"/>
-      <w:r>
-        <w:t>menjalankan</w:t>
-      </w:r>
-      <w:proofErr w:type="spellEnd"/>
-      <w:r>
-        <w:t xml:space="preserve"> </w:t>
-      </w:r>
-      <w:r>
-        <w:t xml:space="preserve">Halaman Login Web </w:t>
-      </w:r>
-      <w:proofErr w:type="spellStart"/>
-      <w:r>
-        <w:t>CPMApp</w:t>
-      </w:r>
-      <w:proofErr w:type="spellEnd"/>
+        <w:t xml:space="preserve">Tujuan menghapus </w:t>
+      </w:r>
+      <w:r>
+        <w:t>pada "baseUrl": "./dist"</w:t>
+      </w:r>
+      <w:r>
+        <w:t xml:space="preserve"> untuk import tidak error.</w:t>
+      </w:r>
+    </w:p>
+    <w:p>
+      <w:pPr>
+        <w:spacing w:line="240" w:lineRule="auto"/>
+      </w:pPr>
+    </w:p>
+    <w:p>
+      <w:pPr>
+        <w:spacing w:line="240" w:lineRule="auto"/>
+      </w:pPr>
+      <w:r>
+        <w:t xml:space="preserve">4. Mencoba menjalankan </w:t>
+      </w:r>
+      <w:r>
+        <w:t>Halaman Login Web CPMApp</w:t>
+      </w:r>
     </w:p>
     <w:p>
       <w:pPr>
@@ -1350,69 +649,8 @@
       <w:pPr>
         <w:spacing w:line="240" w:lineRule="auto"/>
       </w:pPr>
-      <w:proofErr w:type="spellStart"/>
-      <w:r>
-        <w:t>Setelah</w:t>
-      </w:r>
-      <w:proofErr w:type="spellEnd"/>
-      <w:r>
-        <w:t xml:space="preserve"> </w:t>
-      </w:r>
-      <w:proofErr w:type="spellStart"/>
-      <w:r>
-        <w:t>menjalankan</w:t>
-      </w:r>
-      <w:proofErr w:type="spellEnd"/>
-      <w:r>
-        <w:t xml:space="preserve"> </w:t>
-      </w:r>
-      <w:proofErr w:type="spellStart"/>
-      <w:r>
-        <w:t>api</w:t>
-      </w:r>
-      <w:proofErr w:type="spellEnd"/>
-      <w:r>
-        <w:t xml:space="preserve"> </w:t>
-      </w:r>
-      <w:proofErr w:type="spellStart"/>
-      <w:r>
-        <w:t>kemudian</w:t>
-      </w:r>
-      <w:proofErr w:type="spellEnd"/>
-      <w:r>
-        <w:t xml:space="preserve"> </w:t>
-      </w:r>
-      <w:proofErr w:type="spellStart"/>
-      <w:r>
-        <w:t>menjalankan</w:t>
-      </w:r>
-      <w:proofErr w:type="spellEnd"/>
-      <w:r>
-        <w:t xml:space="preserve"> </w:t>
-      </w:r>
-      <w:proofErr w:type="spellStart"/>
-      <w:r>
-        <w:t>cms</w:t>
-      </w:r>
-      <w:proofErr w:type="spellEnd"/>
-      <w:r>
-        <w:t xml:space="preserve"> </w:t>
-      </w:r>
-      <w:proofErr w:type="spellStart"/>
-      <w:r>
-        <w:t>kedua</w:t>
-      </w:r>
-      <w:proofErr w:type="spellEnd"/>
-      <w:r>
-        <w:t xml:space="preserve"> </w:t>
-      </w:r>
-      <w:proofErr w:type="spellStart"/>
-      <w:r>
-        <w:t>berjalan</w:t>
-      </w:r>
-      <w:proofErr w:type="spellEnd"/>
-      <w:r>
-        <w:t>.</w:t>
+      <w:r>
+        <w:t>Setelah menjalankan api kemudian menjalankan cms kedua berjalan.</w:t>
       </w:r>
     </w:p>
     <w:p>
@@ -1426,71 +664,22 @@
       </w:pPr>
       <w:r>
         <w:lastRenderedPageBreak/>
-        <w:t xml:space="preserve">5. </w:t>
-      </w:r>
-      <w:proofErr w:type="spellStart"/>
-      <w:r>
-        <w:t>Perbaikan</w:t>
-      </w:r>
-      <w:proofErr w:type="spellEnd"/>
-      <w:r>
-        <w:t xml:space="preserve"> </w:t>
-      </w:r>
-      <w:proofErr w:type="spellStart"/>
-      <w:r>
-        <w:t>Koding</w:t>
-      </w:r>
-      <w:proofErr w:type="spellEnd"/>
-      <w:r>
-        <w:t xml:space="preserve"> pada </w:t>
-      </w:r>
-      <w:proofErr w:type="spellStart"/>
+        <w:t xml:space="preserve">5. Perbaikan Koding pada </w:t>
+      </w:r>
       <w:r>
         <w:t>App.tsx</w:t>
       </w:r>
-      <w:proofErr w:type="spellEnd"/>
-    </w:p>
-    <w:p>
-      <w:pPr>
-        <w:spacing w:line="240" w:lineRule="auto"/>
-      </w:pPr>
-      <w:proofErr w:type="gramStart"/>
-      <w:r>
-        <w:t>File :</w:t>
-      </w:r>
-      <w:proofErr w:type="gramEnd"/>
-      <w:r>
-        <w:t xml:space="preserve"> </w:t>
-      </w:r>
-      <w:proofErr w:type="spellStart"/>
-      <w:r>
-        <w:t>wisata-CPMApp</w:t>
-      </w:r>
-      <w:proofErr w:type="spellEnd"/>
-      <w:r>
-        <w:t>\</w:t>
-      </w:r>
-      <w:proofErr w:type="spellStart"/>
-      <w:r>
-        <w:t>cms</w:t>
-      </w:r>
-      <w:proofErr w:type="spellEnd"/>
-      <w:r>
-        <w:t>\</w:t>
-      </w:r>
-      <w:proofErr w:type="spellStart"/>
-      <w:r>
-        <w:t>src</w:t>
-      </w:r>
-      <w:proofErr w:type="spellEnd"/>
-      <w:r>
-        <w:t>\</w:t>
-      </w:r>
-      <w:proofErr w:type="spellStart"/>
-      <w:r>
-        <w:t>App.tsx</w:t>
-      </w:r>
-      <w:proofErr w:type="spellEnd"/>
+    </w:p>
+    <w:p>
+      <w:pPr>
+        <w:spacing w:line="240" w:lineRule="auto"/>
+      </w:pPr>
+      <w:r>
+        <w:t xml:space="preserve">File : </w:t>
+      </w:r>
+      <w:r>
+        <w:t>wisata-CPMApp\cms\src\App.tsx</w:t>
+      </w:r>
     </w:p>
     <w:p>
       <w:pPr>
@@ -1555,47 +744,8 @@
         <w:ind w:left="720"/>
         <w:jc w:val="both"/>
       </w:pPr>
-      <w:proofErr w:type="spellStart"/>
-      <w:r>
-        <w:t>const</w:t>
-      </w:r>
-      <w:proofErr w:type="spellEnd"/>
-      <w:r>
-        <w:t xml:space="preserve"> [role, </w:t>
-      </w:r>
-      <w:proofErr w:type="spellStart"/>
-      <w:r>
-        <w:t>setRole</w:t>
-      </w:r>
-      <w:proofErr w:type="spellEnd"/>
-      <w:r>
-        <w:t xml:space="preserve">] = </w:t>
-      </w:r>
-      <w:proofErr w:type="spellStart"/>
-      <w:proofErr w:type="gramStart"/>
-      <w:r>
-        <w:t>useState</w:t>
-      </w:r>
-      <w:proofErr w:type="spellEnd"/>
-      <w:r>
-        <w:t>(</w:t>
-      </w:r>
-      <w:proofErr w:type="gramEnd"/>
-      <w:r>
-        <w:t xml:space="preserve">() =&gt; </w:t>
-      </w:r>
-      <w:proofErr w:type="spellStart"/>
-      <w:proofErr w:type="gramStart"/>
-      <w:r>
-        <w:t>getRole</w:t>
-      </w:r>
-      <w:proofErr w:type="spellEnd"/>
-      <w:r>
-        <w:t>(</w:t>
-      </w:r>
-      <w:proofErr w:type="gramEnd"/>
-      <w:r>
-        <w:t>));</w:t>
+      <w:r>
+        <w:t>const [role, setRole] = useState(() =&gt; getRole());</w:t>
       </w:r>
     </w:p>
     <w:p>
@@ -1604,173 +754,8 @@
         <w:ind w:left="720"/>
         <w:jc w:val="both"/>
       </w:pPr>
-      <w:proofErr w:type="spellStart"/>
-      <w:r>
-        <w:t>Fungsi</w:t>
-      </w:r>
-      <w:proofErr w:type="spellEnd"/>
-      <w:r>
-        <w:t xml:space="preserve"> di </w:t>
-      </w:r>
-      <w:proofErr w:type="spellStart"/>
-      <w:r>
-        <w:t>dalam</w:t>
-      </w:r>
-      <w:proofErr w:type="spellEnd"/>
-      <w:r>
-        <w:t> </w:t>
-      </w:r>
-      <w:proofErr w:type="spellStart"/>
-      <w:r>
-        <w:t>useState</w:t>
-      </w:r>
-      <w:proofErr w:type="spellEnd"/>
-      <w:r>
-        <w:t> </w:t>
-      </w:r>
-      <w:proofErr w:type="spellStart"/>
-      <w:r>
-        <w:t>hanya</w:t>
-      </w:r>
-      <w:proofErr w:type="spellEnd"/>
-      <w:r>
-        <w:t xml:space="preserve"> </w:t>
-      </w:r>
-      <w:proofErr w:type="spellStart"/>
-      <w:r>
-        <w:t>akan</w:t>
-      </w:r>
-      <w:proofErr w:type="spellEnd"/>
-      <w:r>
-        <w:t xml:space="preserve"> </w:t>
-      </w:r>
-      <w:proofErr w:type="spellStart"/>
-      <w:r>
-        <w:t>dijalankan</w:t>
-      </w:r>
-      <w:proofErr w:type="spellEnd"/>
-      <w:r>
-        <w:t xml:space="preserve"> </w:t>
-      </w:r>
-      <w:proofErr w:type="spellStart"/>
-      <w:r>
-        <w:t>satu</w:t>
-      </w:r>
-      <w:proofErr w:type="spellEnd"/>
-      <w:r>
-        <w:t xml:space="preserve"> kali </w:t>
-      </w:r>
-      <w:proofErr w:type="spellStart"/>
-      <w:r>
-        <w:t>saat</w:t>
-      </w:r>
-      <w:proofErr w:type="spellEnd"/>
-      <w:r>
-        <w:t xml:space="preserve"> </w:t>
-      </w:r>
-      <w:proofErr w:type="spellStart"/>
-      <w:r>
-        <w:t>aplikasi</w:t>
-      </w:r>
-      <w:proofErr w:type="spellEnd"/>
-      <w:r>
-        <w:t xml:space="preserve"> </w:t>
-      </w:r>
-      <w:proofErr w:type="spellStart"/>
-      <w:r>
-        <w:t>pertama</w:t>
-      </w:r>
-      <w:proofErr w:type="spellEnd"/>
-      <w:r>
-        <w:t xml:space="preserve"> kali </w:t>
-      </w:r>
-      <w:proofErr w:type="spellStart"/>
-      <w:r>
-        <w:t>dimuat</w:t>
-      </w:r>
-      <w:proofErr w:type="spellEnd"/>
-      <w:r>
-        <w:t xml:space="preserve">. </w:t>
-      </w:r>
-      <w:proofErr w:type="spellStart"/>
-      <w:r>
-        <w:t>Lebih</w:t>
-      </w:r>
-      <w:proofErr w:type="spellEnd"/>
-      <w:r>
-        <w:t xml:space="preserve"> </w:t>
-      </w:r>
-      <w:proofErr w:type="spellStart"/>
-      <w:r>
-        <w:t>cepat</w:t>
-      </w:r>
-      <w:proofErr w:type="spellEnd"/>
-      <w:r>
-        <w:t xml:space="preserve"> </w:t>
-      </w:r>
-      <w:proofErr w:type="spellStart"/>
-      <w:r>
-        <w:t>karena</w:t>
-      </w:r>
-      <w:proofErr w:type="spellEnd"/>
-      <w:r>
-        <w:t xml:space="preserve"> React </w:t>
-      </w:r>
-      <w:proofErr w:type="spellStart"/>
-      <w:r>
-        <w:t>langsung</w:t>
-      </w:r>
-      <w:proofErr w:type="spellEnd"/>
-      <w:r>
-        <w:t xml:space="preserve"> </w:t>
-      </w:r>
-      <w:proofErr w:type="spellStart"/>
-      <w:r>
-        <w:t>tahu</w:t>
-      </w:r>
-      <w:proofErr w:type="spellEnd"/>
-      <w:r>
-        <w:t xml:space="preserve"> </w:t>
-      </w:r>
-      <w:proofErr w:type="spellStart"/>
-      <w:r>
-        <w:t>siapa</w:t>
-      </w:r>
-      <w:proofErr w:type="spellEnd"/>
-      <w:r>
-        <w:t xml:space="preserve"> </w:t>
-      </w:r>
-      <w:proofErr w:type="spellStart"/>
-      <w:r>
-        <w:t>usernya</w:t>
-      </w:r>
-      <w:proofErr w:type="spellEnd"/>
-      <w:r>
-        <w:t xml:space="preserve"> </w:t>
-      </w:r>
-      <w:proofErr w:type="spellStart"/>
-      <w:r>
-        <w:t>sebelum</w:t>
-      </w:r>
-      <w:proofErr w:type="spellEnd"/>
-      <w:r>
-        <w:t xml:space="preserve"> </w:t>
-      </w:r>
-      <w:proofErr w:type="spellStart"/>
-      <w:r>
-        <w:t>melakukan</w:t>
-      </w:r>
-      <w:proofErr w:type="spellEnd"/>
-      <w:r>
-        <w:t xml:space="preserve"> render </w:t>
-      </w:r>
-      <w:proofErr w:type="spellStart"/>
-      <w:r>
-        <w:t>pertama</w:t>
-      </w:r>
-      <w:proofErr w:type="spellEnd"/>
-      <w:r>
-        <w:t xml:space="preserve"> (First Paint).</w:t>
+      <w:r>
+        <w:t>Fungsi di dalam useState hanya akan dijalankan satu kali saat aplikasi pertama kali dimuat. Lebih cepat karena React langsung tahu siapa usernya sebelum melakukan render pertama (First Paint).</w:t>
       </w:r>
     </w:p>
     <w:p>
@@ -1782,144 +767,12 @@
         <w:spacing w:line="240" w:lineRule="auto"/>
         <w:jc w:val="both"/>
       </w:pPr>
-      <w:proofErr w:type="spellStart"/>
-      <w:r>
-        <w:t>Menghapus</w:t>
-      </w:r>
-      <w:proofErr w:type="spellEnd"/>
-      <w:r>
-        <w:t> loading state:</w:t>
+      <w:r>
+        <w:t>Menghapus loading state:</w:t>
       </w:r>
       <w:r>
         <w:br/>
-      </w:r>
-      <w:proofErr w:type="spellStart"/>
-      <w:r>
-        <w:t>Mengambil</w:t>
-      </w:r>
-      <w:proofErr w:type="spellEnd"/>
-      <w:r>
-        <w:t> role </w:t>
-      </w:r>
-      <w:proofErr w:type="spellStart"/>
-      <w:r>
-        <w:t>secara</w:t>
-      </w:r>
-      <w:proofErr w:type="spellEnd"/>
-      <w:r>
-        <w:t xml:space="preserve"> </w:t>
-      </w:r>
-      <w:proofErr w:type="spellStart"/>
-      <w:r>
-        <w:t>sinkron</w:t>
-      </w:r>
-      <w:proofErr w:type="spellEnd"/>
-      <w:r>
-        <w:t xml:space="preserve"> </w:t>
-      </w:r>
-      <w:proofErr w:type="spellStart"/>
-      <w:r>
-        <w:t>dari</w:t>
-      </w:r>
-      <w:proofErr w:type="spellEnd"/>
-      <w:r>
-        <w:t> </w:t>
-      </w:r>
-      <w:proofErr w:type="spellStart"/>
-      <w:r>
-        <w:t>localStorage</w:t>
-      </w:r>
-      <w:proofErr w:type="spellEnd"/>
-      <w:r>
-        <w:t xml:space="preserve">, </w:t>
-      </w:r>
-      <w:proofErr w:type="spellStart"/>
-      <w:r>
-        <w:t>tidak</w:t>
-      </w:r>
-      <w:proofErr w:type="spellEnd"/>
-      <w:r>
-        <w:t xml:space="preserve"> </w:t>
-      </w:r>
-      <w:proofErr w:type="spellStart"/>
-      <w:r>
-        <w:t>perlu</w:t>
-      </w:r>
-      <w:proofErr w:type="spellEnd"/>
-      <w:r>
-        <w:t xml:space="preserve"> </w:t>
-      </w:r>
-      <w:proofErr w:type="spellStart"/>
-      <w:r>
-        <w:t>lagi</w:t>
-      </w:r>
-      <w:proofErr w:type="spellEnd"/>
-      <w:r>
-        <w:t xml:space="preserve"> </w:t>
-      </w:r>
-      <w:proofErr w:type="spellStart"/>
-      <w:r>
-        <w:t>menunggu</w:t>
-      </w:r>
-      <w:proofErr w:type="spellEnd"/>
-      <w:r>
-        <w:t xml:space="preserve"> "loading". </w:t>
-      </w:r>
-      <w:proofErr w:type="spellStart"/>
-      <w:r>
-        <w:t>Aplikasi</w:t>
-      </w:r>
-      <w:proofErr w:type="spellEnd"/>
-      <w:r>
-        <w:t xml:space="preserve"> </w:t>
-      </w:r>
-      <w:proofErr w:type="spellStart"/>
-      <w:r>
-        <w:t>langsung</w:t>
-      </w:r>
-      <w:proofErr w:type="spellEnd"/>
-      <w:r>
-        <w:t xml:space="preserve"> </w:t>
-      </w:r>
-      <w:proofErr w:type="spellStart"/>
-      <w:r>
-        <w:t>tahu</w:t>
-      </w:r>
-      <w:proofErr w:type="spellEnd"/>
-      <w:r>
-        <w:t xml:space="preserve"> </w:t>
-      </w:r>
-      <w:proofErr w:type="spellStart"/>
-      <w:r>
-        <w:t>apakah</w:t>
-      </w:r>
-      <w:proofErr w:type="spellEnd"/>
-      <w:r>
-        <w:t xml:space="preserve"> user </w:t>
-      </w:r>
-      <w:proofErr w:type="spellStart"/>
-      <w:r>
-        <w:t>adalah</w:t>
-      </w:r>
-      <w:proofErr w:type="spellEnd"/>
-      <w:r>
-        <w:t xml:space="preserve"> admin, customer, </w:t>
-      </w:r>
-      <w:proofErr w:type="spellStart"/>
-      <w:r>
-        <w:t>atau</w:t>
-      </w:r>
-      <w:proofErr w:type="spellEnd"/>
-      <w:r>
-        <w:t xml:space="preserve"> </w:t>
-      </w:r>
-      <w:proofErr w:type="spellStart"/>
-      <w:r>
-        <w:t>belum</w:t>
-      </w:r>
-      <w:proofErr w:type="spellEnd"/>
-      <w:r>
-        <w:t xml:space="preserve"> login.</w:t>
+        <w:t>Mengambil role secara sinkron dari localStorage, tidak perlu lagi menunggu "loading". Aplikasi langsung tahu apakah user adalah admin, customer, atau belum login.</w:t>
       </w:r>
     </w:p>
     <w:p>
@@ -1931,136 +784,12 @@
         <w:spacing w:line="240" w:lineRule="auto"/>
         <w:jc w:val="both"/>
       </w:pPr>
-      <w:proofErr w:type="spellStart"/>
-      <w:r>
-        <w:t>Menghapus</w:t>
-      </w:r>
-      <w:proofErr w:type="spellEnd"/>
-      <w:r>
-        <w:t> </w:t>
-      </w:r>
-      <w:proofErr w:type="spellStart"/>
-      <w:r>
-        <w:t>setRole</w:t>
-      </w:r>
-      <w:proofErr w:type="spellEnd"/>
-      <w:r>
-        <w:t> </w:t>
-      </w:r>
-      <w:proofErr w:type="spellStart"/>
-      <w:r>
-        <w:t>dari</w:t>
-      </w:r>
-      <w:proofErr w:type="spellEnd"/>
-      <w:r>
-        <w:t> </w:t>
-      </w:r>
-      <w:proofErr w:type="spellStart"/>
-      <w:r>
-        <w:t>useEffect</w:t>
-      </w:r>
-      <w:proofErr w:type="spellEnd"/>
-      <w:r>
-        <w:t>:</w:t>
+      <w:r>
+        <w:t>Menghapus setRole dari useEffect:</w:t>
       </w:r>
       <w:r>
         <w:br/>
-      </w:r>
-      <w:proofErr w:type="spellStart"/>
-      <w:r>
-        <w:t>Menghilangkan</w:t>
-      </w:r>
-      <w:proofErr w:type="spellEnd"/>
-      <w:r>
-        <w:t xml:space="preserve"> error </w:t>
-      </w:r>
-      <w:proofErr w:type="spellStart"/>
-      <w:r>
-        <w:t>ESLint</w:t>
-      </w:r>
-      <w:proofErr w:type="spellEnd"/>
-      <w:r>
-        <w:t xml:space="preserve"> </w:t>
-      </w:r>
-      <w:proofErr w:type="spellStart"/>
-      <w:r>
-        <w:t>tersebut</w:t>
-      </w:r>
-      <w:proofErr w:type="spellEnd"/>
-      <w:r>
-        <w:t>. </w:t>
-      </w:r>
-      <w:proofErr w:type="spellStart"/>
-      <w:r>
-        <w:t>useEffect</w:t>
-      </w:r>
-      <w:proofErr w:type="spellEnd"/>
-      <w:r>
-        <w:t> </w:t>
-      </w:r>
-      <w:proofErr w:type="spellStart"/>
-      <w:r>
-        <w:t>sekarang</w:t>
-      </w:r>
-      <w:proofErr w:type="spellEnd"/>
-      <w:r>
-        <w:t xml:space="preserve"> </w:t>
-      </w:r>
-      <w:proofErr w:type="spellStart"/>
-      <w:r>
-        <w:t>hanya</w:t>
-      </w:r>
-      <w:proofErr w:type="spellEnd"/>
-      <w:r>
-        <w:t xml:space="preserve"> </w:t>
-      </w:r>
-      <w:proofErr w:type="spellStart"/>
-      <w:r>
-        <w:t>bertugas</w:t>
-      </w:r>
-      <w:proofErr w:type="spellEnd"/>
-      <w:r>
-        <w:t xml:space="preserve"> </w:t>
-      </w:r>
-      <w:proofErr w:type="spellStart"/>
-      <w:r>
-        <w:t>menyetel</w:t>
-      </w:r>
-      <w:proofErr w:type="spellEnd"/>
-      <w:r>
-        <w:t xml:space="preserve"> token </w:t>
-      </w:r>
-      <w:proofErr w:type="spellStart"/>
-      <w:r>
-        <w:t>ke</w:t>
-      </w:r>
-      <w:proofErr w:type="spellEnd"/>
-      <w:r>
-        <w:t xml:space="preserve"> instance API (</w:t>
-      </w:r>
-      <w:proofErr w:type="spellStart"/>
-      <w:r>
-        <w:t>seperti</w:t>
-      </w:r>
-      <w:proofErr w:type="spellEnd"/>
-      <w:r>
-        <w:t xml:space="preserve"> Axios), yang mana </w:t>
-      </w:r>
-      <w:proofErr w:type="spellStart"/>
-      <w:r>
-        <w:t>merupakan</w:t>
-      </w:r>
-      <w:proofErr w:type="spellEnd"/>
-      <w:r>
-        <w:t xml:space="preserve"> </w:t>
-      </w:r>
-      <w:proofErr w:type="spellStart"/>
-      <w:r>
-        <w:t>murni</w:t>
-      </w:r>
-      <w:proofErr w:type="spellEnd"/>
-      <w:r>
-        <w:t> </w:t>
+        <w:t>Menghilangkan error ESLint tersebut. useEffect sekarang hanya bertugas menyetel token ke instance API (seperti Axios), yang mana merupakan murni </w:t>
       </w:r>
       <w:r>
         <w:rPr>
@@ -2082,64 +811,12 @@
         <w:spacing w:line="240" w:lineRule="auto"/>
         <w:jc w:val="both"/>
       </w:pPr>
-      <w:proofErr w:type="spellStart"/>
-      <w:r>
-        <w:t>Penambahan</w:t>
-      </w:r>
-      <w:proofErr w:type="spellEnd"/>
-      <w:r>
-        <w:t> replace pada Navigate:</w:t>
+      <w:r>
+        <w:t>Penambahan replace pada Navigate:</w:t>
       </w:r>
       <w:r>
         <w:br/>
-      </w:r>
-      <w:proofErr w:type="spellStart"/>
-      <w:r>
-        <w:t>Menambahkan</w:t>
-      </w:r>
-      <w:proofErr w:type="spellEnd"/>
-      <w:r>
-        <w:t xml:space="preserve"> </w:t>
-      </w:r>
-      <w:proofErr w:type="spellStart"/>
-      <w:r>
-        <w:t>properti</w:t>
-      </w:r>
-      <w:proofErr w:type="spellEnd"/>
-      <w:r>
-        <w:t xml:space="preserve"> replace pada &lt;Navigate /&gt; agar user </w:t>
-      </w:r>
-      <w:proofErr w:type="spellStart"/>
-      <w:r>
-        <w:t>tidak</w:t>
-      </w:r>
-      <w:proofErr w:type="spellEnd"/>
-      <w:r>
-        <w:t xml:space="preserve"> </w:t>
-      </w:r>
-      <w:proofErr w:type="spellStart"/>
-      <w:r>
-        <w:t>terjebak</w:t>
-      </w:r>
-      <w:proofErr w:type="spellEnd"/>
-      <w:r>
-        <w:t xml:space="preserve"> </w:t>
-      </w:r>
-      <w:proofErr w:type="spellStart"/>
-      <w:r>
-        <w:t>dalam</w:t>
-      </w:r>
-      <w:proofErr w:type="spellEnd"/>
-      <w:r>
-        <w:t xml:space="preserve"> loop </w:t>
-      </w:r>
-      <w:proofErr w:type="spellStart"/>
-      <w:r>
-        <w:t>tombol</w:t>
-      </w:r>
-      <w:proofErr w:type="spellEnd"/>
-      <w:r>
-        <w:t xml:space="preserve"> "back" di browser.</w:t>
+        <w:t>Menambahkan properti replace pada &lt;Navigate /&gt; agar user tidak terjebak dalam loop tombol "back" di browser.</w:t>
       </w:r>
     </w:p>
     <w:p>
@@ -2151,13 +828,8 @@
         <w:spacing w:line="240" w:lineRule="auto"/>
         <w:jc w:val="both"/>
       </w:pPr>
-      <w:proofErr w:type="spellStart"/>
-      <w:r>
-        <w:t>Perbaikan</w:t>
-      </w:r>
-      <w:proofErr w:type="spellEnd"/>
-      <w:r>
-        <w:t xml:space="preserve"> Path:</w:t>
+      <w:r>
+        <w:t>Perbaikan Path:</w:t>
       </w:r>
     </w:p>
     <w:p>
@@ -2166,69 +838,8 @@
         <w:ind w:left="720"/>
         <w:jc w:val="both"/>
       </w:pPr>
-      <w:proofErr w:type="spellStart"/>
-      <w:r>
-        <w:t>Menghapus</w:t>
-      </w:r>
-      <w:proofErr w:type="spellEnd"/>
-      <w:r>
-        <w:t> /admin/review </w:t>
-      </w:r>
-      <w:proofErr w:type="spellStart"/>
-      <w:r>
-        <w:t>menjadi</w:t>
-      </w:r>
-      <w:proofErr w:type="spellEnd"/>
-      <w:r>
-        <w:t> review </w:t>
-      </w:r>
-      <w:proofErr w:type="spellStart"/>
-      <w:r>
-        <w:t>saja</w:t>
-      </w:r>
-      <w:proofErr w:type="spellEnd"/>
-      <w:r>
-        <w:t xml:space="preserve"> di </w:t>
-      </w:r>
-      <w:proofErr w:type="spellStart"/>
-      <w:r>
-        <w:t>dalam</w:t>
-      </w:r>
-      <w:proofErr w:type="spellEnd"/>
-      <w:r>
-        <w:t xml:space="preserve"> Route admin, </w:t>
-      </w:r>
-      <w:proofErr w:type="spellStart"/>
-      <w:r>
-        <w:t>karena</w:t>
-      </w:r>
-      <w:proofErr w:type="spellEnd"/>
-      <w:r>
-        <w:t xml:space="preserve"> </w:t>
-      </w:r>
-      <w:proofErr w:type="spellStart"/>
-      <w:r>
-        <w:t>sudah</w:t>
-      </w:r>
-      <w:proofErr w:type="spellEnd"/>
-      <w:r>
-        <w:t xml:space="preserve"> </w:t>
-      </w:r>
-      <w:proofErr w:type="spellStart"/>
-      <w:r>
-        <w:t>berada</w:t>
-      </w:r>
-      <w:proofErr w:type="spellEnd"/>
-      <w:r>
-        <w:t xml:space="preserve"> di </w:t>
-      </w:r>
-      <w:proofErr w:type="spellStart"/>
-      <w:r>
-        <w:t>bawah</w:t>
-      </w:r>
-      <w:proofErr w:type="spellEnd"/>
-      <w:r>
-        <w:t xml:space="preserve"> prefix /admin.</w:t>
+      <w:r>
+        <w:t>Menghapus /admin/review menjadi review saja di dalam Route admin, karena sudah berada di bawah prefix /admin.</w:t>
       </w:r>
     </w:p>
     <w:p>
@@ -2258,45 +869,8 @@
         <w:t xml:space="preserve">6. </w:t>
       </w:r>
       <w:r>
-        <w:t xml:space="preserve">Git </w:t>
-      </w:r>
-      <w:proofErr w:type="spellStart"/>
-      <w:r>
-        <w:t>berhenti</w:t>
-      </w:r>
-      <w:proofErr w:type="spellEnd"/>
-      <w:r>
-        <w:t xml:space="preserve"> </w:t>
-      </w:r>
-      <w:proofErr w:type="spellStart"/>
-      <w:r>
-        <w:t>karena</w:t>
-      </w:r>
-      <w:proofErr w:type="spellEnd"/>
-      <w:r>
-        <w:t xml:space="preserve"> </w:t>
-      </w:r>
-      <w:proofErr w:type="spellStart"/>
-      <w:r>
-        <w:t>masih</w:t>
-      </w:r>
-      <w:proofErr w:type="spellEnd"/>
-      <w:r>
-        <w:t xml:space="preserve"> </w:t>
-      </w:r>
-      <w:proofErr w:type="spellStart"/>
-      <w:r>
-        <w:t>ada</w:t>
-      </w:r>
-      <w:proofErr w:type="spellEnd"/>
-      <w:r>
-        <w:t xml:space="preserve"> </w:t>
-      </w:r>
-      <w:proofErr w:type="spellStart"/>
-      <w:r>
-        <w:t>konflik</w:t>
-      </w:r>
-      <w:proofErr w:type="spellEnd"/>
+        <w:t>Git berhenti karena masih ada konflik</w:t>
+      </w:r>
       <w:r>
         <w:t>.</w:t>
       </w:r>
@@ -2426,40 +1000,18 @@
       <w:pPr>
         <w:spacing w:line="240" w:lineRule="auto"/>
       </w:pPr>
-      <w:proofErr w:type="spellStart"/>
-      <w:r>
-        <w:t>Penyebabnya</w:t>
-      </w:r>
-      <w:proofErr w:type="spellEnd"/>
-      <w:r>
-        <w:t xml:space="preserve"> </w:t>
-      </w:r>
-      <w:proofErr w:type="spellStart"/>
-      <w:r>
-        <w:t>karena</w:t>
-      </w:r>
-      <w:proofErr w:type="spellEnd"/>
-      <w:r>
-        <w:t xml:space="preserve"> </w:t>
-      </w:r>
-      <w:proofErr w:type="spellStart"/>
-      <w:r>
-        <w:t>terjadi</w:t>
-      </w:r>
-      <w:proofErr w:type="spellEnd"/>
-      <w:r>
-        <w:t xml:space="preserve"> </w:t>
-      </w:r>
-      <w:proofErr w:type="spellStart"/>
-      <w:proofErr w:type="gramStart"/>
+      <w:r>
+        <w:t xml:space="preserve">Penyebabnya </w:t>
+      </w:r>
+      <w:r>
+        <w:t xml:space="preserve">karena terjadi </w:t>
+      </w:r>
       <w:r>
         <w:t>konflik</w:t>
       </w:r>
-      <w:proofErr w:type="spellEnd"/>
       <w:r>
         <w:t xml:space="preserve"> :</w:t>
       </w:r>
-      <w:proofErr w:type="gramEnd"/>
     </w:p>
     <w:p>
       <w:pPr>
@@ -2476,35 +1028,12 @@
       <w:r>
         <w:t xml:space="preserve"> dan </w:t>
       </w:r>
-      <w:proofErr w:type="spellStart"/>
-      <w:r>
-        <w:t>anggota</w:t>
-      </w:r>
-      <w:proofErr w:type="spellEnd"/>
-      <w:r>
-        <w:t xml:space="preserve"> </w:t>
-      </w:r>
-      <w:proofErr w:type="spellStart"/>
-      <w:r>
-        <w:t>tim</w:t>
-      </w:r>
-      <w:proofErr w:type="spellEnd"/>
-      <w:r>
-        <w:t xml:space="preserve"> </w:t>
-      </w:r>
-      <w:proofErr w:type="spellStart"/>
-      <w:r>
-        <w:t>mengubah</w:t>
-      </w:r>
-      <w:proofErr w:type="spellEnd"/>
-      <w:r>
-        <w:t xml:space="preserve"> file yang </w:t>
-      </w:r>
-      <w:proofErr w:type="spellStart"/>
-      <w:r>
-        <w:t>sama</w:t>
-      </w:r>
-      <w:proofErr w:type="spellEnd"/>
+      <w:r>
+        <w:t>anggota tim</w:t>
+      </w:r>
+      <w:r>
+        <w:t xml:space="preserve"> mengubah file yang sama</w:t>
+      </w:r>
       <w:r>
         <w:t>.</w:t>
       </w:r>
@@ -2519,37 +1048,8 @@
         <w:spacing w:line="240" w:lineRule="auto"/>
       </w:pPr>
       <w:r>
-        <w:t xml:space="preserve">Git </w:t>
-      </w:r>
-      <w:proofErr w:type="spellStart"/>
-      <w:r>
-        <w:t>bingung</w:t>
-      </w:r>
-      <w:proofErr w:type="spellEnd"/>
-      <w:r>
-        <w:t xml:space="preserve"> </w:t>
-      </w:r>
-      <w:proofErr w:type="spellStart"/>
-      <w:r>
-        <w:t>memilih</w:t>
-      </w:r>
-      <w:proofErr w:type="spellEnd"/>
-      <w:r>
-        <w:t xml:space="preserve"> </w:t>
-      </w:r>
-      <w:proofErr w:type="spellStart"/>
-      <w:r>
-        <w:t>versi</w:t>
-      </w:r>
-      <w:proofErr w:type="spellEnd"/>
-      <w:r>
-        <w:t xml:space="preserve"> mana yang </w:t>
-      </w:r>
-      <w:proofErr w:type="spellStart"/>
-      <w:r>
-        <w:t>benar</w:t>
-      </w:r>
-      <w:proofErr w:type="spellEnd"/>
+        <w:t>Git bingung memilih versi mana yang benar</w:t>
+      </w:r>
       <w:r>
         <w:t>.</w:t>
       </w:r>
@@ -2564,39 +1064,7 @@
         <w:spacing w:line="240" w:lineRule="auto"/>
       </w:pPr>
       <w:r>
-        <w:t xml:space="preserve">Jadi Git </w:t>
-      </w:r>
-      <w:proofErr w:type="spellStart"/>
-      <w:r>
-        <w:t>minta</w:t>
-      </w:r>
-      <w:proofErr w:type="spellEnd"/>
-      <w:r>
-        <w:t xml:space="preserve"> </w:t>
-      </w:r>
-      <w:proofErr w:type="spellStart"/>
-      <w:r>
-        <w:t>menyelesaikan</w:t>
-      </w:r>
-      <w:proofErr w:type="spellEnd"/>
-      <w:r>
-        <w:t xml:space="preserve"> </w:t>
-      </w:r>
-      <w:proofErr w:type="spellStart"/>
-      <w:r>
-        <w:t>konflik</w:t>
-      </w:r>
-      <w:proofErr w:type="spellEnd"/>
-      <w:r>
-        <w:t xml:space="preserve"> </w:t>
-      </w:r>
-      <w:proofErr w:type="spellStart"/>
-      <w:r>
-        <w:t>secara</w:t>
-      </w:r>
-      <w:proofErr w:type="spellEnd"/>
-      <w:r>
-        <w:t xml:space="preserve"> manual</w:t>
+        <w:t>Jadi Git minta menyelesaikan konflik secara manual</w:t>
       </w:r>
       <w:r>
         <w:t>.</w:t>
@@ -2612,18 +1080,8 @@
         <w:spacing w:line="240" w:lineRule="auto"/>
       </w:pPr>
       <w:r>
-        <w:t xml:space="preserve">Solusi yang </w:t>
-      </w:r>
-      <w:proofErr w:type="spellStart"/>
-      <w:proofErr w:type="gramStart"/>
-      <w:r>
-        <w:t>dilakukan</w:t>
-      </w:r>
-      <w:proofErr w:type="spellEnd"/>
-      <w:r>
-        <w:t xml:space="preserve"> :</w:t>
-      </w:r>
-      <w:proofErr w:type="gramEnd"/>
+        <w:t>Solusi yang dilakukan :</w:t>
+      </w:r>
     </w:p>
     <w:p>
       <w:pPr>
@@ -2634,29 +1092,8 @@
         </w:numPr>
         <w:spacing w:line="240" w:lineRule="auto"/>
       </w:pPr>
-      <w:proofErr w:type="spellStart"/>
-      <w:r>
-        <w:t>Mengembalikan</w:t>
-      </w:r>
-      <w:proofErr w:type="spellEnd"/>
-      <w:r>
-        <w:t xml:space="preserve"> </w:t>
-      </w:r>
-      <w:proofErr w:type="spellStart"/>
-      <w:r>
-        <w:t>koding</w:t>
-      </w:r>
-      <w:proofErr w:type="spellEnd"/>
-      <w:r>
-        <w:t xml:space="preserve"> </w:t>
-      </w:r>
-      <w:proofErr w:type="spellStart"/>
-      <w:r>
-        <w:t>sebelum</w:t>
-      </w:r>
-      <w:proofErr w:type="spellEnd"/>
-      <w:r>
-        <w:t xml:space="preserve"> di edit.</w:t>
+      <w:r>
+        <w:t>Mengembalikan koding sebelum di edit.</w:t>
       </w:r>
     </w:p>
     <w:p>
@@ -2668,21 +1105,8 @@
         </w:numPr>
         <w:spacing w:line="240" w:lineRule="auto"/>
       </w:pPr>
-      <w:proofErr w:type="spellStart"/>
-      <w:r>
-        <w:t>Setelah</w:t>
-      </w:r>
-      <w:proofErr w:type="spellEnd"/>
-      <w:r>
-        <w:t xml:space="preserve"> </w:t>
-      </w:r>
-      <w:proofErr w:type="spellStart"/>
-      <w:r>
-        <w:t>itu</w:t>
-      </w:r>
-      <w:proofErr w:type="spellEnd"/>
-      <w:r>
-        <w:t xml:space="preserve"> </w:t>
+      <w:r>
+        <w:t xml:space="preserve">Setelah itu </w:t>
       </w:r>
       <w:r>
         <w:t>commit</w:t>
@@ -2691,15 +1115,7 @@
         <w:t xml:space="preserve"> fan</w:t>
       </w:r>
       <w:r>
-        <w:t xml:space="preserve"> push </w:t>
-      </w:r>
-      <w:proofErr w:type="spellStart"/>
-      <w:r>
-        <w:t>ke</w:t>
-      </w:r>
-      <w:proofErr w:type="spellEnd"/>
-      <w:r>
-        <w:t xml:space="preserve"> GitHub:</w:t>
+        <w:t xml:space="preserve"> push ke GitHub:</w:t>
       </w:r>
     </w:p>
     <w:p>
@@ -2709,13 +1125,8 @@
         <w:ind w:left="1440"/>
       </w:pPr>
       <w:r>
-        <w:t xml:space="preserve">git </w:t>
-      </w:r>
-      <w:proofErr w:type="gramStart"/>
-      <w:r>
-        <w:t>add .</w:t>
-      </w:r>
-      <w:proofErr w:type="gramEnd"/>
+        <w:t>git add .</w:t>
+      </w:r>
     </w:p>
     <w:p>
       <w:pPr>
@@ -2724,23 +1135,7 @@
         <w:ind w:left="1440"/>
       </w:pPr>
       <w:r>
-        <w:t>git commit -m "</w:t>
-      </w:r>
-      <w:proofErr w:type="spellStart"/>
-      <w:r>
-        <w:t>pesan</w:t>
-      </w:r>
-      <w:proofErr w:type="spellEnd"/>
-      <w:r>
-        <w:t xml:space="preserve"> </w:t>
-      </w:r>
-      <w:proofErr w:type="spellStart"/>
-      <w:r>
-        <w:t>kamu</w:t>
-      </w:r>
-      <w:proofErr w:type="spellEnd"/>
-      <w:r>
-        <w:t>"</w:t>
+        <w:t>git commit -m "pesan kamu"</w:t>
       </w:r>
     </w:p>
     <w:p>
@@ -2751,6 +1146,465 @@
       </w:pPr>
       <w:r>
         <w:t>git push</w:t>
+      </w:r>
+    </w:p>
+    <w:p>
+      <w:pPr>
+        <w:spacing w:line="240" w:lineRule="auto"/>
+      </w:pPr>
+    </w:p>
+    <w:p>
+      <w:pPr>
+        <w:spacing w:line="240" w:lineRule="auto"/>
+      </w:pPr>
+    </w:p>
+    <w:p>
+      <w:pPr>
+        <w:spacing w:line="240" w:lineRule="auto"/>
+      </w:pPr>
+    </w:p>
+    <w:p>
+      <w:pPr>
+        <w:spacing w:line="240" w:lineRule="auto"/>
+      </w:pPr>
+    </w:p>
+    <w:p>
+      <w:pPr>
+        <w:spacing w:line="240" w:lineRule="auto"/>
+      </w:pPr>
+    </w:p>
+    <w:p>
+      <w:pPr>
+        <w:spacing w:line="240" w:lineRule="auto"/>
+      </w:pPr>
+    </w:p>
+    <w:p>
+      <w:pPr>
+        <w:spacing w:line="240" w:lineRule="auto"/>
+      </w:pPr>
+    </w:p>
+    <w:p>
+      <w:pPr>
+        <w:spacing w:line="240" w:lineRule="auto"/>
+      </w:pPr>
+    </w:p>
+    <w:p>
+      <w:pPr>
+        <w:spacing w:line="240" w:lineRule="auto"/>
+      </w:pPr>
+      <w:r>
+        <w:lastRenderedPageBreak/>
+        <w:t>7. Membuat file api.ts</w:t>
+      </w:r>
+    </w:p>
+    <w:p>
+      <w:pPr>
+        <w:spacing w:line="240" w:lineRule="auto"/>
+      </w:pPr>
+      <w:r>
+        <w:t xml:space="preserve">File : </w:t>
+      </w:r>
+      <w:r>
+        <w:t>wisata-CPMApp\user\app\lib\api.ts</w:t>
+      </w:r>
+    </w:p>
+    <w:p>
+      <w:pPr>
+        <w:spacing w:line="240" w:lineRule="auto"/>
+      </w:pPr>
+      <w:r>
+        <w:rPr>
+          <w:noProof/>
+        </w:rPr>
+        <w:drawing>
+          <wp:inline distT="0" distB="0" distL="0" distR="0" wp14:anchorId="37598F59" wp14:editId="314FF2B0">
+            <wp:extent cx="5731510" cy="3222625"/>
+            <wp:effectExtent l="0" t="0" r="2540" b="0"/>
+            <wp:docPr id="1588359864" name="Picture 1"/>
+            <wp:cNvGraphicFramePr>
+              <a:graphicFrameLocks xmlns:a="http://schemas.openxmlformats.org/drawingml/2006/main" noChangeAspect="1"/>
+            </wp:cNvGraphicFramePr>
+            <a:graphic xmlns:a="http://schemas.openxmlformats.org/drawingml/2006/main">
+              <a:graphicData uri="http://schemas.openxmlformats.org/drawingml/2006/picture">
+                <pic:pic xmlns:pic="http://schemas.openxmlformats.org/drawingml/2006/picture">
+                  <pic:nvPicPr>
+                    <pic:cNvPr id="1588359864" name=""/>
+                    <pic:cNvPicPr/>
+                  </pic:nvPicPr>
+                  <pic:blipFill>
+                    <a:blip r:embed="rId12"/>
+                    <a:stretch>
+                      <a:fillRect/>
+                    </a:stretch>
+                  </pic:blipFill>
+                  <pic:spPr>
+                    <a:xfrm>
+                      <a:off x="0" y="0"/>
+                      <a:ext cx="5731510" cy="3222625"/>
+                    </a:xfrm>
+                    <a:prstGeom prst="rect">
+                      <a:avLst/>
+                    </a:prstGeom>
+                  </pic:spPr>
+                </pic:pic>
+              </a:graphicData>
+            </a:graphic>
+          </wp:inline>
+        </w:drawing>
+      </w:r>
+    </w:p>
+    <w:p>
+      <w:pPr>
+        <w:numPr>
+          <w:ilvl w:val="0"/>
+          <w:numId w:val="6"/>
+        </w:numPr>
+        <w:spacing w:line="240" w:lineRule="auto"/>
+      </w:pPr>
+      <w:r>
+        <w:t>Deteksi Otomatis (Platform):</w:t>
+      </w:r>
+      <w:r>
+        <w:br/>
+        <w:t>Aplikasi mengecek: Sedang jalan di HP Android atau di Browser (Web)?</w:t>
+      </w:r>
+    </w:p>
+    <w:p>
+      <w:pPr>
+        <w:numPr>
+          <w:ilvl w:val="1"/>
+          <w:numId w:val="6"/>
+        </w:numPr>
+        <w:spacing w:line="240" w:lineRule="auto"/>
+      </w:pPr>
+      <w:r>
+        <w:t>Kalau di Web, alamatnya: localhost:3000.</w:t>
+      </w:r>
+    </w:p>
+    <w:p>
+      <w:pPr>
+        <w:numPr>
+          <w:ilvl w:val="1"/>
+          <w:numId w:val="6"/>
+        </w:numPr>
+        <w:spacing w:line="240" w:lineRule="auto"/>
+      </w:pPr>
+      <w:r>
+        <w:t>Kalau di Android, alamatnya: 10.0.2.2:3000 (kode khusus supaya Android bisa akses internet laptop).</w:t>
+      </w:r>
+    </w:p>
+    <w:p>
+      <w:pPr>
+        <w:numPr>
+          <w:ilvl w:val="0"/>
+          <w:numId w:val="6"/>
+        </w:numPr>
+        <w:spacing w:line="240" w:lineRule="auto"/>
+      </w:pPr>
+      <w:r>
+        <w:t>Pembersih Alamat (Normalize):</w:t>
+      </w:r>
+      <w:r>
+        <w:br/>
+        <w:t xml:space="preserve">Fungsi </w:t>
+      </w:r>
+      <w:r>
+        <w:t>untuk</w:t>
+      </w:r>
+      <w:r>
+        <w:t xml:space="preserve"> memastikan tidak ada tanda miring (/) yang dobel atau tertinggal di akhir link, supaya link-nya tidak rusak.</w:t>
+      </w:r>
+    </w:p>
+    <w:p>
+      <w:pPr>
+        <w:numPr>
+          <w:ilvl w:val="0"/>
+          <w:numId w:val="6"/>
+        </w:numPr>
+        <w:spacing w:line="240" w:lineRule="auto"/>
+      </w:pPr>
+      <w:r>
+        <w:t>Alamat Utama (API_BASE_URL):</w:t>
+      </w:r>
+      <w:r>
+        <w:br/>
+        <w:t xml:space="preserve">Alamat Pusat aplikasi. </w:t>
+      </w:r>
+      <w:r>
+        <w:t>Memi</w:t>
+      </w:r>
+      <w:r>
+        <w:t>lih alamat dari file pengaturan (.env), kalau tidak ada, pakai alamat default yang sudah dideteksi.</w:t>
+      </w:r>
+    </w:p>
+    <w:p>
+      <w:pPr>
+        <w:numPr>
+          <w:ilvl w:val="0"/>
+          <w:numId w:val="6"/>
+        </w:numPr>
+        <w:spacing w:line="240" w:lineRule="auto"/>
+      </w:pPr>
+      <w:r>
+        <w:t>T</w:t>
+      </w:r>
+      <w:r>
+        <w:t>erhubung</w:t>
+      </w:r>
+      <w:r>
+        <w:t xml:space="preserve"> Alamat (apiUrl):</w:t>
+      </w:r>
+      <w:r>
+        <w:br/>
+        <w:t>Fungsi tugasnya menyambungkan Alamat Pusat dengan Tujuan.</w:t>
+      </w:r>
+    </w:p>
+    <w:p>
+      <w:pPr>
+        <w:numPr>
+          <w:ilvl w:val="1"/>
+          <w:numId w:val="6"/>
+        </w:numPr>
+        <w:spacing w:line="240" w:lineRule="auto"/>
+      </w:pPr>
+      <w:r>
+        <w:rPr>
+          <w:i/>
+          <w:iCs/>
+        </w:rPr>
+        <w:t>Contoh:</w:t>
+      </w:r>
+      <w:r>
+        <w:t> Alamat Pusat + /login = http://localhost:3000/login.</w:t>
+      </w:r>
+    </w:p>
+    <w:p>
+      <w:pPr>
+        <w:numPr>
+          <w:ilvl w:val="0"/>
+          <w:numId w:val="6"/>
+        </w:numPr>
+        <w:spacing w:line="240" w:lineRule="auto"/>
+      </w:pPr>
+      <w:r>
+        <w:t>Pengatur Link Gambar (apiImageUrl):</w:t>
+      </w:r>
+      <w:r>
+        <w:br/>
+        <w:t>Fungsi ini khusus untuk foto.</w:t>
+      </w:r>
+    </w:p>
+    <w:p>
+      <w:pPr>
+        <w:numPr>
+          <w:ilvl w:val="1"/>
+          <w:numId w:val="6"/>
+        </w:numPr>
+        <w:spacing w:line="240" w:lineRule="auto"/>
+      </w:pPr>
+      <w:r>
+        <w:t>F</w:t>
+      </w:r>
+      <w:r>
+        <w:t xml:space="preserve">otonya sudah punya link internet (seperti dari Google), </w:t>
+      </w:r>
+      <w:r>
+        <w:t>tidak</w:t>
+      </w:r>
+      <w:r>
+        <w:t xml:space="preserve"> diubah.</w:t>
+      </w:r>
+    </w:p>
+    <w:p>
+      <w:pPr>
+        <w:numPr>
+          <w:ilvl w:val="1"/>
+          <w:numId w:val="6"/>
+        </w:numPr>
+        <w:spacing w:line="240" w:lineRule="auto"/>
+      </w:pPr>
+      <w:r>
+        <w:t>F</w:t>
+      </w:r>
+      <w:r>
+        <w:t>otonya ada di server sendiri, sambungkan link-nya agar fotonya bisa tampil.</w:t>
+      </w:r>
+    </w:p>
+    <w:p>
+      <w:pPr>
+        <w:spacing w:line="240" w:lineRule="auto"/>
+      </w:pPr>
+    </w:p>
+    <w:p>
+      <w:pPr>
+        <w:spacing w:line="240" w:lineRule="auto"/>
+      </w:pPr>
+      <w:r>
+        <w:t xml:space="preserve">8. Update file </w:t>
+      </w:r>
+      <w:r>
+        <w:t>auth.ts</w:t>
+      </w:r>
+    </w:p>
+    <w:p>
+      <w:pPr>
+        <w:spacing w:line="240" w:lineRule="auto"/>
+      </w:pPr>
+      <w:r>
+        <w:lastRenderedPageBreak/>
+        <w:t xml:space="preserve">File : </w:t>
+      </w:r>
+      <w:r>
+        <w:t>wisata-CPMApp\user\app\lib\auth\utils\auth.ts</w:t>
+      </w:r>
+    </w:p>
+    <w:p>
+      <w:pPr>
+        <w:spacing w:line="240" w:lineRule="auto"/>
+      </w:pPr>
+      <w:r>
+        <w:rPr>
+          <w:noProof/>
+        </w:rPr>
+        <w:drawing>
+          <wp:inline distT="0" distB="0" distL="0" distR="0" wp14:anchorId="2D104384" wp14:editId="5DE2C80A">
+            <wp:extent cx="5731510" cy="3222625"/>
+            <wp:effectExtent l="0" t="0" r="2540" b="0"/>
+            <wp:docPr id="559991038" name="Picture 1"/>
+            <wp:cNvGraphicFramePr>
+              <a:graphicFrameLocks xmlns:a="http://schemas.openxmlformats.org/drawingml/2006/main" noChangeAspect="1"/>
+            </wp:cNvGraphicFramePr>
+            <a:graphic xmlns:a="http://schemas.openxmlformats.org/drawingml/2006/main">
+              <a:graphicData uri="http://schemas.openxmlformats.org/drawingml/2006/picture">
+                <pic:pic xmlns:pic="http://schemas.openxmlformats.org/drawingml/2006/picture">
+                  <pic:nvPicPr>
+                    <pic:cNvPr id="559991038" name=""/>
+                    <pic:cNvPicPr/>
+                  </pic:nvPicPr>
+                  <pic:blipFill>
+                    <a:blip r:embed="rId13"/>
+                    <a:stretch>
+                      <a:fillRect/>
+                    </a:stretch>
+                  </pic:blipFill>
+                  <pic:spPr>
+                    <a:xfrm>
+                      <a:off x="0" y="0"/>
+                      <a:ext cx="5731510" cy="3222625"/>
+                    </a:xfrm>
+                    <a:prstGeom prst="rect">
+                      <a:avLst/>
+                    </a:prstGeom>
+                  </pic:spPr>
+                </pic:pic>
+              </a:graphicData>
+            </a:graphic>
+          </wp:inline>
+        </w:drawing>
+      </w:r>
+    </w:p>
+    <w:p>
+      <w:pPr>
+        <w:spacing w:line="240" w:lineRule="auto"/>
+      </w:pPr>
+    </w:p>
+    <w:p>
+      <w:pPr>
+        <w:spacing w:line="240" w:lineRule="auto"/>
+        <w:ind w:left="360"/>
+      </w:pPr>
+      <w:r>
+        <w:t>Ganti Alamat di Satu Tempat:</w:t>
+      </w:r>
+    </w:p>
+    <w:p>
+      <w:pPr>
+        <w:spacing w:line="240" w:lineRule="auto"/>
+        <w:ind w:left="1080"/>
+      </w:pPr>
+      <w:r>
+        <w:t>Sebelumnya</w:t>
+      </w:r>
+      <w:r>
+        <w:t xml:space="preserve">: Alamat server (http://10.0.2.2:3000) ditulis langsung di dalam file. Kalau alamatnya ganti, </w:t>
+      </w:r>
+      <w:r>
+        <w:t>maka</w:t>
+      </w:r>
+      <w:r>
+        <w:t xml:space="preserve"> harus cari satu-satu di setiap file.</w:t>
+      </w:r>
+    </w:p>
+    <w:p>
+      <w:pPr>
+        <w:spacing w:line="240" w:lineRule="auto"/>
+        <w:ind w:left="1080"/>
+      </w:pPr>
+      <w:r>
+        <w:t>Sekarang: Alamat server diambil dari satu pusat (file api.ts). Kalau alamat ganti, cukup ubah satu kali saja di pusatnya.</w:t>
+      </w:r>
+    </w:p>
+    <w:p>
+      <w:pPr>
+        <w:spacing w:line="240" w:lineRule="auto"/>
+        <w:ind w:left="360"/>
+      </w:pPr>
+      <w:r>
+        <w:t xml:space="preserve">Aplikasi Jadi Lebih </w:t>
+      </w:r>
+      <w:r>
+        <w:t>Baik</w:t>
+      </w:r>
+      <w:r>
+        <w:t>:</w:t>
+      </w:r>
+    </w:p>
+    <w:p>
+      <w:pPr>
+        <w:spacing w:line="240" w:lineRule="auto"/>
+        <w:ind w:left="1080"/>
+      </w:pPr>
+      <w:r>
+        <w:t>Sebelumnya</w:t>
+      </w:r>
+      <w:r>
+        <w:t>: hanya bisa jalan lancar di Android (karena alamat 10.0.2.2).</w:t>
+      </w:r>
+    </w:p>
+    <w:p>
+      <w:pPr>
+        <w:spacing w:line="240" w:lineRule="auto"/>
+        <w:ind w:left="1080"/>
+      </w:pPr>
+      <w:r>
+        <w:t xml:space="preserve">Sekarang: Berkat fungsi apiUrl, aplikasi bisa </w:t>
+      </w:r>
+      <w:r>
+        <w:t>sedang</w:t>
+      </w:r>
+      <w:r>
+        <w:t xml:space="preserve"> di Android pakai alamat A, kalau di Web pakai alamat B.</w:t>
+      </w:r>
+    </w:p>
+    <w:p>
+      <w:pPr>
+        <w:spacing w:line="240" w:lineRule="auto"/>
+        <w:ind w:left="360"/>
+      </w:pPr>
+      <w:r>
+        <w:t>Kodingan Lebih Bersih:</w:t>
+      </w:r>
+    </w:p>
+    <w:p>
+      <w:pPr>
+        <w:spacing w:line="240" w:lineRule="auto"/>
+        <w:ind w:left="1080"/>
+      </w:pPr>
+      <w:r>
+        <w:t>T</w:t>
+      </w:r>
+      <w:r>
+        <w:t>idak perlu lagi mengetik http://... panjang-panjang di setiap fungsi. Cukup panggil apiUrl(/login), dan sistem akan menyambungkannya secara otomatis.</w:t>
       </w:r>
     </w:p>
     <w:p>
@@ -2997,6 +1851,123 @@
     </w:lvl>
   </w:abstractNum>
   <w:abstractNum w:abstractNumId="2" w15:restartNumberingAfterBreak="0">
+    <w:nsid w:val="52B2306A"/>
+    <w:multiLevelType w:val="multilevel"/>
+    <w:tmpl w:val="28BC2570"/>
+    <w:lvl w:ilvl="0">
+      <w:start w:val="1"/>
+      <w:numFmt w:val="decimal"/>
+      <w:lvlText w:val="%1."/>
+      <w:lvlJc w:val="left"/>
+      <w:pPr>
+        <w:tabs>
+          <w:tab w:val="num" w:pos="720"/>
+        </w:tabs>
+        <w:ind w:left="720" w:hanging="360"/>
+      </w:pPr>
+    </w:lvl>
+    <w:lvl w:ilvl="1">
+      <w:start w:val="1"/>
+      <w:numFmt w:val="bullet"/>
+      <w:lvlText w:val="o"/>
+      <w:lvlJc w:val="left"/>
+      <w:pPr>
+        <w:tabs>
+          <w:tab w:val="num" w:pos="1440"/>
+        </w:tabs>
+        <w:ind w:left="1440" w:hanging="360"/>
+      </w:pPr>
+      <w:rPr>
+        <w:rFonts w:ascii="Courier New" w:hAnsi="Courier New" w:hint="default"/>
+        <w:sz w:val="20"/>
+      </w:rPr>
+    </w:lvl>
+    <w:lvl w:ilvl="2" w:tentative="1">
+      <w:start w:val="1"/>
+      <w:numFmt w:val="decimal"/>
+      <w:lvlText w:val="%3."/>
+      <w:lvlJc w:val="left"/>
+      <w:pPr>
+        <w:tabs>
+          <w:tab w:val="num" w:pos="2160"/>
+        </w:tabs>
+        <w:ind w:left="2160" w:hanging="360"/>
+      </w:pPr>
+    </w:lvl>
+    <w:lvl w:ilvl="3" w:tentative="1">
+      <w:start w:val="1"/>
+      <w:numFmt w:val="decimal"/>
+      <w:lvlText w:val="%4."/>
+      <w:lvlJc w:val="left"/>
+      <w:pPr>
+        <w:tabs>
+          <w:tab w:val="num" w:pos="2880"/>
+        </w:tabs>
+        <w:ind w:left="2880" w:hanging="360"/>
+      </w:pPr>
+    </w:lvl>
+    <w:lvl w:ilvl="4" w:tentative="1">
+      <w:start w:val="1"/>
+      <w:numFmt w:val="decimal"/>
+      <w:lvlText w:val="%5."/>
+      <w:lvlJc w:val="left"/>
+      <w:pPr>
+        <w:tabs>
+          <w:tab w:val="num" w:pos="3600"/>
+        </w:tabs>
+        <w:ind w:left="3600" w:hanging="360"/>
+      </w:pPr>
+    </w:lvl>
+    <w:lvl w:ilvl="5" w:tentative="1">
+      <w:start w:val="1"/>
+      <w:numFmt w:val="decimal"/>
+      <w:lvlText w:val="%6."/>
+      <w:lvlJc w:val="left"/>
+      <w:pPr>
+        <w:tabs>
+          <w:tab w:val="num" w:pos="4320"/>
+        </w:tabs>
+        <w:ind w:left="4320" w:hanging="360"/>
+      </w:pPr>
+    </w:lvl>
+    <w:lvl w:ilvl="6" w:tentative="1">
+      <w:start w:val="1"/>
+      <w:numFmt w:val="decimal"/>
+      <w:lvlText w:val="%7."/>
+      <w:lvlJc w:val="left"/>
+      <w:pPr>
+        <w:tabs>
+          <w:tab w:val="num" w:pos="5040"/>
+        </w:tabs>
+        <w:ind w:left="5040" w:hanging="360"/>
+      </w:pPr>
+    </w:lvl>
+    <w:lvl w:ilvl="7" w:tentative="1">
+      <w:start w:val="1"/>
+      <w:numFmt w:val="decimal"/>
+      <w:lvlText w:val="%8."/>
+      <w:lvlJc w:val="left"/>
+      <w:pPr>
+        <w:tabs>
+          <w:tab w:val="num" w:pos="5760"/>
+        </w:tabs>
+        <w:ind w:left="5760" w:hanging="360"/>
+      </w:pPr>
+    </w:lvl>
+    <w:lvl w:ilvl="8" w:tentative="1">
+      <w:start w:val="1"/>
+      <w:numFmt w:val="decimal"/>
+      <w:lvlText w:val="%9."/>
+      <w:lvlJc w:val="left"/>
+      <w:pPr>
+        <w:tabs>
+          <w:tab w:val="num" w:pos="6480"/>
+        </w:tabs>
+        <w:ind w:left="6480" w:hanging="360"/>
+      </w:pPr>
+    </w:lvl>
+  </w:abstractNum>
+  <w:abstractNum w:abstractNumId="3" w15:restartNumberingAfterBreak="0">
     <w:nsid w:val="59AC64DE"/>
     <w:multiLevelType w:val="hybridMultilevel"/>
     <w:tmpl w:val="D556FF78"/>
@@ -3109,7 +2080,156 @@
       </w:rPr>
     </w:lvl>
   </w:abstractNum>
-  <w:abstractNum w:abstractNumId="3" w15:restartNumberingAfterBreak="0">
+  <w:abstractNum w:abstractNumId="4" w15:restartNumberingAfterBreak="0">
+    <w:nsid w:val="6BA85B18"/>
+    <w:multiLevelType w:val="multilevel"/>
+    <w:tmpl w:val="C93CBC46"/>
+    <w:lvl w:ilvl="0">
+      <w:start w:val="1"/>
+      <w:numFmt w:val="bullet"/>
+      <w:lvlText w:val=""/>
+      <w:lvlJc w:val="left"/>
+      <w:pPr>
+        <w:tabs>
+          <w:tab w:val="num" w:pos="720"/>
+        </w:tabs>
+        <w:ind w:left="720" w:hanging="360"/>
+      </w:pPr>
+      <w:rPr>
+        <w:rFonts w:ascii="Symbol" w:hAnsi="Symbol" w:hint="default"/>
+        <w:sz w:val="20"/>
+      </w:rPr>
+    </w:lvl>
+    <w:lvl w:ilvl="1">
+      <w:start w:val="1"/>
+      <w:numFmt w:val="bullet"/>
+      <w:lvlText w:val="o"/>
+      <w:lvlJc w:val="left"/>
+      <w:pPr>
+        <w:tabs>
+          <w:tab w:val="num" w:pos="1440"/>
+        </w:tabs>
+        <w:ind w:left="1440" w:hanging="360"/>
+      </w:pPr>
+      <w:rPr>
+        <w:rFonts w:ascii="Courier New" w:hAnsi="Courier New" w:hint="default"/>
+        <w:sz w:val="20"/>
+      </w:rPr>
+    </w:lvl>
+    <w:lvl w:ilvl="2" w:tentative="1">
+      <w:start w:val="1"/>
+      <w:numFmt w:val="bullet"/>
+      <w:lvlText w:val=""/>
+      <w:lvlJc w:val="left"/>
+      <w:pPr>
+        <w:tabs>
+          <w:tab w:val="num" w:pos="2160"/>
+        </w:tabs>
+        <w:ind w:left="2160" w:hanging="360"/>
+      </w:pPr>
+      <w:rPr>
+        <w:rFonts w:ascii="Wingdings" w:hAnsi="Wingdings" w:hint="default"/>
+        <w:sz w:val="20"/>
+      </w:rPr>
+    </w:lvl>
+    <w:lvl w:ilvl="3" w:tentative="1">
+      <w:start w:val="1"/>
+      <w:numFmt w:val="bullet"/>
+      <w:lvlText w:val=""/>
+      <w:lvlJc w:val="left"/>
+      <w:pPr>
+        <w:tabs>
+          <w:tab w:val="num" w:pos="2880"/>
+        </w:tabs>
+        <w:ind w:left="2880" w:hanging="360"/>
+      </w:pPr>
+      <w:rPr>
+        <w:rFonts w:ascii="Wingdings" w:hAnsi="Wingdings" w:hint="default"/>
+        <w:sz w:val="20"/>
+      </w:rPr>
+    </w:lvl>
+    <w:lvl w:ilvl="4" w:tentative="1">
+      <w:start w:val="1"/>
+      <w:numFmt w:val="bullet"/>
+      <w:lvlText w:val=""/>
+      <w:lvlJc w:val="left"/>
+      <w:pPr>
+        <w:tabs>
+          <w:tab w:val="num" w:pos="3600"/>
+        </w:tabs>
+        <w:ind w:left="3600" w:hanging="360"/>
+      </w:pPr>
+      <w:rPr>
+        <w:rFonts w:ascii="Wingdings" w:hAnsi="Wingdings" w:hint="default"/>
+        <w:sz w:val="20"/>
+      </w:rPr>
+    </w:lvl>
+    <w:lvl w:ilvl="5" w:tentative="1">
+      <w:start w:val="1"/>
+      <w:numFmt w:val="bullet"/>
+      <w:lvlText w:val=""/>
+      <w:lvlJc w:val="left"/>
+      <w:pPr>
+        <w:tabs>
+          <w:tab w:val="num" w:pos="4320"/>
+        </w:tabs>
+        <w:ind w:left="4320" w:hanging="360"/>
+      </w:pPr>
+      <w:rPr>
+        <w:rFonts w:ascii="Wingdings" w:hAnsi="Wingdings" w:hint="default"/>
+        <w:sz w:val="20"/>
+      </w:rPr>
+    </w:lvl>
+    <w:lvl w:ilvl="6" w:tentative="1">
+      <w:start w:val="1"/>
+      <w:numFmt w:val="bullet"/>
+      <w:lvlText w:val=""/>
+      <w:lvlJc w:val="left"/>
+      <w:pPr>
+        <w:tabs>
+          <w:tab w:val="num" w:pos="5040"/>
+        </w:tabs>
+        <w:ind w:left="5040" w:hanging="360"/>
+      </w:pPr>
+      <w:rPr>
+        <w:rFonts w:ascii="Wingdings" w:hAnsi="Wingdings" w:hint="default"/>
+        <w:sz w:val="20"/>
+      </w:rPr>
+    </w:lvl>
+    <w:lvl w:ilvl="7" w:tentative="1">
+      <w:start w:val="1"/>
+      <w:numFmt w:val="bullet"/>
+      <w:lvlText w:val=""/>
+      <w:lvlJc w:val="left"/>
+      <w:pPr>
+        <w:tabs>
+          <w:tab w:val="num" w:pos="5760"/>
+        </w:tabs>
+        <w:ind w:left="5760" w:hanging="360"/>
+      </w:pPr>
+      <w:rPr>
+        <w:rFonts w:ascii="Wingdings" w:hAnsi="Wingdings" w:hint="default"/>
+        <w:sz w:val="20"/>
+      </w:rPr>
+    </w:lvl>
+    <w:lvl w:ilvl="8" w:tentative="1">
+      <w:start w:val="1"/>
+      <w:numFmt w:val="bullet"/>
+      <w:lvlText w:val=""/>
+      <w:lvlJc w:val="left"/>
+      <w:pPr>
+        <w:tabs>
+          <w:tab w:val="num" w:pos="6480"/>
+        </w:tabs>
+        <w:ind w:left="6480" w:hanging="360"/>
+      </w:pPr>
+      <w:rPr>
+        <w:rFonts w:ascii="Wingdings" w:hAnsi="Wingdings" w:hint="default"/>
+        <w:sz w:val="20"/>
+      </w:rPr>
+    </w:lvl>
+  </w:abstractNum>
+  <w:abstractNum w:abstractNumId="5" w15:restartNumberingAfterBreak="0">
     <w:nsid w:val="7B92578F"/>
     <w:multiLevelType w:val="hybridMultilevel"/>
     <w:tmpl w:val="B804E9B8"/>
@@ -3222,7 +2342,7 @@
       </w:rPr>
     </w:lvl>
   </w:abstractNum>
-  <w:abstractNum w:abstractNumId="4" w15:restartNumberingAfterBreak="0">
+  <w:abstractNum w:abstractNumId="6" w15:restartNumberingAfterBreak="0">
     <w:nsid w:val="7DD5389E"/>
     <w:multiLevelType w:val="hybridMultilevel"/>
     <w:tmpl w:val="6840CD52"/>
@@ -3336,19 +2456,25 @@
     </w:lvl>
   </w:abstractNum>
   <w:num w:numId="1" w16cid:durableId="775180286">
-    <w:abstractNumId w:val="3"/>
+    <w:abstractNumId w:val="5"/>
   </w:num>
   <w:num w:numId="2" w16cid:durableId="1579442916">
-    <w:abstractNumId w:val="4"/>
+    <w:abstractNumId w:val="6"/>
   </w:num>
   <w:num w:numId="3" w16cid:durableId="1996445871">
     <w:abstractNumId w:val="0"/>
   </w:num>
   <w:num w:numId="4" w16cid:durableId="982202006">
-    <w:abstractNumId w:val="2"/>
+    <w:abstractNumId w:val="3"/>
   </w:num>
   <w:num w:numId="5" w16cid:durableId="2119370406">
     <w:abstractNumId w:val="1"/>
+  </w:num>
+  <w:num w:numId="6" w16cid:durableId="1063062556">
+    <w:abstractNumId w:val="4"/>
+  </w:num>
+  <w:num w:numId="7" w16cid:durableId="1353610240">
+    <w:abstractNumId w:val="2"/>
   </w:num>
 </w:numbering>
 </file>
@@ -3956,7 +3082,6 @@
   <w:style w:type="character" w:default="1" w:styleId="DefaultParagraphFont">
     <w:name w:val="Default Paragraph Font"/>
     <w:uiPriority w:val="1"/>
-    <w:semiHidden/>
     <w:unhideWhenUsed/>
   </w:style>
   <w:style w:type="table" w:default="1" w:styleId="TableNormal">

</xml_diff>

<commit_message>
Update koding pada file index.ts pada File : wisata-CPMApp\user\app\lib\customer\utils\index.ts
</commit_message>
<xml_diff>
--- a/Dokumentasi/24382001P_Lorensius Firngadi_Dokumentasi Sesi 3.docx
+++ b/Dokumentasi/24382001P_Lorensius Firngadi_Dokumentasi Sesi 3.docx
@@ -1439,7 +1439,13 @@
       <w:pPr>
         <w:spacing w:line="240" w:lineRule="auto"/>
       </w:pPr>
-      <w:r>
+    </w:p>
+    <w:p>
+      <w:pPr>
+        <w:spacing w:line="240" w:lineRule="auto"/>
+      </w:pPr>
+      <w:r>
+        <w:lastRenderedPageBreak/>
         <w:t xml:space="preserve">8. Update file </w:t>
       </w:r>
       <w:r>
@@ -1451,7 +1457,6 @@
         <w:spacing w:line="240" w:lineRule="auto"/>
       </w:pPr>
       <w:r>
-        <w:lastRenderedPageBreak/>
         <w:t xml:space="preserve">File : </w:t>
       </w:r>
       <w:r>
@@ -1612,6 +1617,130 @@
         <w:spacing w:line="240" w:lineRule="auto"/>
       </w:pPr>
     </w:p>
+    <w:p>
+      <w:pPr>
+        <w:spacing w:line="240" w:lineRule="auto"/>
+      </w:pPr>
+      <w:r>
+        <w:t xml:space="preserve">9. </w:t>
+      </w:r>
+      <w:r>
+        <w:t xml:space="preserve">Update koding pada file </w:t>
+      </w:r>
+      <w:r>
+        <w:t>index.ts</w:t>
+      </w:r>
+    </w:p>
+    <w:p>
+      <w:pPr>
+        <w:spacing w:line="240" w:lineRule="auto"/>
+      </w:pPr>
+      <w:r>
+        <w:t xml:space="preserve">File : </w:t>
+      </w:r>
+      <w:r>
+        <w:t>wisata-CPMApp\user\app\lib\customer\utils\index.ts</w:t>
+      </w:r>
+    </w:p>
+    <w:p>
+      <w:pPr>
+        <w:spacing w:line="240" w:lineRule="auto"/>
+      </w:pPr>
+      <w:r>
+        <w:rPr>
+          <w:noProof/>
+        </w:rPr>
+        <w:lastRenderedPageBreak/>
+        <w:drawing>
+          <wp:inline distT="0" distB="0" distL="0" distR="0" wp14:anchorId="1DA7355A" wp14:editId="1A4D35AF">
+            <wp:extent cx="5731510" cy="3222625"/>
+            <wp:effectExtent l="0" t="0" r="2540" b="0"/>
+            <wp:docPr id="1793164531" name="Picture 1"/>
+            <wp:cNvGraphicFramePr>
+              <a:graphicFrameLocks xmlns:a="http://schemas.openxmlformats.org/drawingml/2006/main" noChangeAspect="1"/>
+            </wp:cNvGraphicFramePr>
+            <a:graphic xmlns:a="http://schemas.openxmlformats.org/drawingml/2006/main">
+              <a:graphicData uri="http://schemas.openxmlformats.org/drawingml/2006/picture">
+                <pic:pic xmlns:pic="http://schemas.openxmlformats.org/drawingml/2006/picture">
+                  <pic:nvPicPr>
+                    <pic:cNvPr id="1793164531" name=""/>
+                    <pic:cNvPicPr/>
+                  </pic:nvPicPr>
+                  <pic:blipFill>
+                    <a:blip r:embed="rId14"/>
+                    <a:stretch>
+                      <a:fillRect/>
+                    </a:stretch>
+                  </pic:blipFill>
+                  <pic:spPr>
+                    <a:xfrm>
+                      <a:off x="0" y="0"/>
+                      <a:ext cx="5731510" cy="3222625"/>
+                    </a:xfrm>
+                    <a:prstGeom prst="rect">
+                      <a:avLst/>
+                    </a:prstGeom>
+                  </pic:spPr>
+                </pic:pic>
+              </a:graphicData>
+            </a:graphic>
+          </wp:inline>
+        </w:drawing>
+      </w:r>
+    </w:p>
+    <w:p>
+      <w:pPr>
+        <w:numPr>
+          <w:ilvl w:val="0"/>
+          <w:numId w:val="8"/>
+        </w:numPr>
+        <w:spacing w:line="240" w:lineRule="auto"/>
+      </w:pPr>
+      <w:r>
+        <w:t>apiUrl: Memastikan alamat server benar.</w:t>
+      </w:r>
+    </w:p>
+    <w:p>
+      <w:pPr>
+        <w:numPr>
+          <w:ilvl w:val="0"/>
+          <w:numId w:val="8"/>
+        </w:numPr>
+        <w:spacing w:line="240" w:lineRule="auto"/>
+      </w:pPr>
+      <w:r>
+        <w:t xml:space="preserve">fetchWisata: </w:t>
+      </w:r>
+      <w:r>
+        <w:t>M</w:t>
+      </w:r>
+      <w:r>
+        <w:t>engambil data wisata yang statusnya masih aktif saja.</w:t>
+      </w:r>
+    </w:p>
+    <w:p>
+      <w:pPr>
+        <w:numPr>
+          <w:ilvl w:val="0"/>
+          <w:numId w:val="8"/>
+        </w:numPr>
+        <w:spacing w:line="240" w:lineRule="auto"/>
+      </w:pPr>
+      <w:r>
+        <w:t xml:space="preserve">getRating: </w:t>
+      </w:r>
+      <w:r>
+        <w:t>M</w:t>
+      </w:r>
+      <w:r>
+        <w:t>enghitung angka rating (bintang) agar bisa muncul di aplikasi (misalnya: 4.5 / 5 stars dari 100 ulasan).</w:t>
+      </w:r>
+    </w:p>
+    <w:p>
+      <w:pPr>
+        <w:spacing w:line="240" w:lineRule="auto"/>
+      </w:pPr>
+    </w:p>
     <w:sectPr>
       <w:pgSz w:w="11906" w:h="16838"/>
       <w:pgMar w:top="1440" w:right="1440" w:bottom="1440" w:left="1440" w:header="708" w:footer="708" w:gutter="0"/>
@@ -1738,6 +1867,155 @@
     </w:lvl>
   </w:abstractNum>
   <w:abstractNum w:abstractNumId="1" w15:restartNumberingAfterBreak="0">
+    <w:nsid w:val="255737F4"/>
+    <w:multiLevelType w:val="multilevel"/>
+    <w:tmpl w:val="89C6081C"/>
+    <w:lvl w:ilvl="0">
+      <w:start w:val="1"/>
+      <w:numFmt w:val="bullet"/>
+      <w:lvlText w:val=""/>
+      <w:lvlJc w:val="left"/>
+      <w:pPr>
+        <w:tabs>
+          <w:tab w:val="num" w:pos="720"/>
+        </w:tabs>
+        <w:ind w:left="720" w:hanging="360"/>
+      </w:pPr>
+      <w:rPr>
+        <w:rFonts w:ascii="Symbol" w:hAnsi="Symbol" w:hint="default"/>
+        <w:sz w:val="20"/>
+      </w:rPr>
+    </w:lvl>
+    <w:lvl w:ilvl="1" w:tentative="1">
+      <w:start w:val="1"/>
+      <w:numFmt w:val="bullet"/>
+      <w:lvlText w:val="o"/>
+      <w:lvlJc w:val="left"/>
+      <w:pPr>
+        <w:tabs>
+          <w:tab w:val="num" w:pos="1440"/>
+        </w:tabs>
+        <w:ind w:left="1440" w:hanging="360"/>
+      </w:pPr>
+      <w:rPr>
+        <w:rFonts w:ascii="Courier New" w:hAnsi="Courier New" w:hint="default"/>
+        <w:sz w:val="20"/>
+      </w:rPr>
+    </w:lvl>
+    <w:lvl w:ilvl="2" w:tentative="1">
+      <w:start w:val="1"/>
+      <w:numFmt w:val="bullet"/>
+      <w:lvlText w:val=""/>
+      <w:lvlJc w:val="left"/>
+      <w:pPr>
+        <w:tabs>
+          <w:tab w:val="num" w:pos="2160"/>
+        </w:tabs>
+        <w:ind w:left="2160" w:hanging="360"/>
+      </w:pPr>
+      <w:rPr>
+        <w:rFonts w:ascii="Wingdings" w:hAnsi="Wingdings" w:hint="default"/>
+        <w:sz w:val="20"/>
+      </w:rPr>
+    </w:lvl>
+    <w:lvl w:ilvl="3" w:tentative="1">
+      <w:start w:val="1"/>
+      <w:numFmt w:val="bullet"/>
+      <w:lvlText w:val=""/>
+      <w:lvlJc w:val="left"/>
+      <w:pPr>
+        <w:tabs>
+          <w:tab w:val="num" w:pos="2880"/>
+        </w:tabs>
+        <w:ind w:left="2880" w:hanging="360"/>
+      </w:pPr>
+      <w:rPr>
+        <w:rFonts w:ascii="Wingdings" w:hAnsi="Wingdings" w:hint="default"/>
+        <w:sz w:val="20"/>
+      </w:rPr>
+    </w:lvl>
+    <w:lvl w:ilvl="4" w:tentative="1">
+      <w:start w:val="1"/>
+      <w:numFmt w:val="bullet"/>
+      <w:lvlText w:val=""/>
+      <w:lvlJc w:val="left"/>
+      <w:pPr>
+        <w:tabs>
+          <w:tab w:val="num" w:pos="3600"/>
+        </w:tabs>
+        <w:ind w:left="3600" w:hanging="360"/>
+      </w:pPr>
+      <w:rPr>
+        <w:rFonts w:ascii="Wingdings" w:hAnsi="Wingdings" w:hint="default"/>
+        <w:sz w:val="20"/>
+      </w:rPr>
+    </w:lvl>
+    <w:lvl w:ilvl="5" w:tentative="1">
+      <w:start w:val="1"/>
+      <w:numFmt w:val="bullet"/>
+      <w:lvlText w:val=""/>
+      <w:lvlJc w:val="left"/>
+      <w:pPr>
+        <w:tabs>
+          <w:tab w:val="num" w:pos="4320"/>
+        </w:tabs>
+        <w:ind w:left="4320" w:hanging="360"/>
+      </w:pPr>
+      <w:rPr>
+        <w:rFonts w:ascii="Wingdings" w:hAnsi="Wingdings" w:hint="default"/>
+        <w:sz w:val="20"/>
+      </w:rPr>
+    </w:lvl>
+    <w:lvl w:ilvl="6" w:tentative="1">
+      <w:start w:val="1"/>
+      <w:numFmt w:val="bullet"/>
+      <w:lvlText w:val=""/>
+      <w:lvlJc w:val="left"/>
+      <w:pPr>
+        <w:tabs>
+          <w:tab w:val="num" w:pos="5040"/>
+        </w:tabs>
+        <w:ind w:left="5040" w:hanging="360"/>
+      </w:pPr>
+      <w:rPr>
+        <w:rFonts w:ascii="Wingdings" w:hAnsi="Wingdings" w:hint="default"/>
+        <w:sz w:val="20"/>
+      </w:rPr>
+    </w:lvl>
+    <w:lvl w:ilvl="7" w:tentative="1">
+      <w:start w:val="1"/>
+      <w:numFmt w:val="bullet"/>
+      <w:lvlText w:val=""/>
+      <w:lvlJc w:val="left"/>
+      <w:pPr>
+        <w:tabs>
+          <w:tab w:val="num" w:pos="5760"/>
+        </w:tabs>
+        <w:ind w:left="5760" w:hanging="360"/>
+      </w:pPr>
+      <w:rPr>
+        <w:rFonts w:ascii="Wingdings" w:hAnsi="Wingdings" w:hint="default"/>
+        <w:sz w:val="20"/>
+      </w:rPr>
+    </w:lvl>
+    <w:lvl w:ilvl="8" w:tentative="1">
+      <w:start w:val="1"/>
+      <w:numFmt w:val="bullet"/>
+      <w:lvlText w:val=""/>
+      <w:lvlJc w:val="left"/>
+      <w:pPr>
+        <w:tabs>
+          <w:tab w:val="num" w:pos="6480"/>
+        </w:tabs>
+        <w:ind w:left="6480" w:hanging="360"/>
+      </w:pPr>
+      <w:rPr>
+        <w:rFonts w:ascii="Wingdings" w:hAnsi="Wingdings" w:hint="default"/>
+        <w:sz w:val="20"/>
+      </w:rPr>
+    </w:lvl>
+  </w:abstractNum>
+  <w:abstractNum w:abstractNumId="2" w15:restartNumberingAfterBreak="0">
     <w:nsid w:val="4E280CE5"/>
     <w:multiLevelType w:val="hybridMultilevel"/>
     <w:tmpl w:val="C5944EFA"/>
@@ -1850,7 +2128,7 @@
       </w:rPr>
     </w:lvl>
   </w:abstractNum>
-  <w:abstractNum w:abstractNumId="2" w15:restartNumberingAfterBreak="0">
+  <w:abstractNum w:abstractNumId="3" w15:restartNumberingAfterBreak="0">
     <w:nsid w:val="52B2306A"/>
     <w:multiLevelType w:val="multilevel"/>
     <w:tmpl w:val="28BC2570"/>
@@ -1967,7 +2245,7 @@
       </w:pPr>
     </w:lvl>
   </w:abstractNum>
-  <w:abstractNum w:abstractNumId="3" w15:restartNumberingAfterBreak="0">
+  <w:abstractNum w:abstractNumId="4" w15:restartNumberingAfterBreak="0">
     <w:nsid w:val="59AC64DE"/>
     <w:multiLevelType w:val="hybridMultilevel"/>
     <w:tmpl w:val="D556FF78"/>
@@ -2080,7 +2358,7 @@
       </w:rPr>
     </w:lvl>
   </w:abstractNum>
-  <w:abstractNum w:abstractNumId="4" w15:restartNumberingAfterBreak="0">
+  <w:abstractNum w:abstractNumId="5" w15:restartNumberingAfterBreak="0">
     <w:nsid w:val="6BA85B18"/>
     <w:multiLevelType w:val="multilevel"/>
     <w:tmpl w:val="C93CBC46"/>
@@ -2229,7 +2507,7 @@
       </w:rPr>
     </w:lvl>
   </w:abstractNum>
-  <w:abstractNum w:abstractNumId="5" w15:restartNumberingAfterBreak="0">
+  <w:abstractNum w:abstractNumId="6" w15:restartNumberingAfterBreak="0">
     <w:nsid w:val="7B92578F"/>
     <w:multiLevelType w:val="hybridMultilevel"/>
     <w:tmpl w:val="B804E9B8"/>
@@ -2342,7 +2620,7 @@
       </w:rPr>
     </w:lvl>
   </w:abstractNum>
-  <w:abstractNum w:abstractNumId="6" w15:restartNumberingAfterBreak="0">
+  <w:abstractNum w:abstractNumId="7" w15:restartNumberingAfterBreak="0">
     <w:nsid w:val="7DD5389E"/>
     <w:multiLevelType w:val="hybridMultilevel"/>
     <w:tmpl w:val="6840CD52"/>
@@ -2456,25 +2734,28 @@
     </w:lvl>
   </w:abstractNum>
   <w:num w:numId="1" w16cid:durableId="775180286">
-    <w:abstractNumId w:val="5"/>
+    <w:abstractNumId w:val="6"/>
   </w:num>
   <w:num w:numId="2" w16cid:durableId="1579442916">
-    <w:abstractNumId w:val="6"/>
+    <w:abstractNumId w:val="7"/>
   </w:num>
   <w:num w:numId="3" w16cid:durableId="1996445871">
     <w:abstractNumId w:val="0"/>
   </w:num>
   <w:num w:numId="4" w16cid:durableId="982202006">
+    <w:abstractNumId w:val="4"/>
+  </w:num>
+  <w:num w:numId="5" w16cid:durableId="2119370406">
+    <w:abstractNumId w:val="2"/>
+  </w:num>
+  <w:num w:numId="6" w16cid:durableId="1063062556">
+    <w:abstractNumId w:val="5"/>
+  </w:num>
+  <w:num w:numId="7" w16cid:durableId="1353610240">
     <w:abstractNumId w:val="3"/>
   </w:num>
-  <w:num w:numId="5" w16cid:durableId="2119370406">
+  <w:num w:numId="8" w16cid:durableId="905185883">
     <w:abstractNumId w:val="1"/>
-  </w:num>
-  <w:num w:numId="6" w16cid:durableId="1063062556">
-    <w:abstractNumId w:val="4"/>
-  </w:num>
-  <w:num w:numId="7" w16cid:durableId="1353610240">
-    <w:abstractNumId w:val="2"/>
   </w:num>
 </w:numbering>
 </file>

</xml_diff>

<commit_message>
Update koding pada file booking.ts. pada File : wisata-CPMApp\user\app\lib\customer\utils\booking.ts
</commit_message>
<xml_diff>
--- a/Dokumentasi/24382001P_Lorensius Firngadi_Dokumentasi Sesi 3.docx
+++ b/Dokumentasi/24382001P_Lorensius Firngadi_Dokumentasi Sesi 3.docx
@@ -1621,7 +1621,33 @@
       <w:pPr>
         <w:spacing w:line="240" w:lineRule="auto"/>
       </w:pPr>
-      <w:r>
+    </w:p>
+    <w:p>
+      <w:pPr>
+        <w:spacing w:line="240" w:lineRule="auto"/>
+      </w:pPr>
+    </w:p>
+    <w:p>
+      <w:pPr>
+        <w:spacing w:line="240" w:lineRule="auto"/>
+      </w:pPr>
+    </w:p>
+    <w:p>
+      <w:pPr>
+        <w:spacing w:line="240" w:lineRule="auto"/>
+      </w:pPr>
+    </w:p>
+    <w:p>
+      <w:pPr>
+        <w:spacing w:line="240" w:lineRule="auto"/>
+      </w:pPr>
+    </w:p>
+    <w:p>
+      <w:pPr>
+        <w:spacing w:line="240" w:lineRule="auto"/>
+      </w:pPr>
+      <w:r>
+        <w:lastRenderedPageBreak/>
         <w:t xml:space="preserve">9. </w:t>
       </w:r>
       <w:r>
@@ -1650,7 +1676,6 @@
         <w:rPr>
           <w:noProof/>
         </w:rPr>
-        <w:lastRenderedPageBreak/>
         <w:drawing>
           <wp:inline distT="0" distB="0" distL="0" distR="0" wp14:anchorId="1DA7355A" wp14:editId="1A4D35AF">
             <wp:extent cx="5731510" cy="3222625"/>
@@ -1741,6 +1766,311 @@
         <w:spacing w:line="240" w:lineRule="auto"/>
       </w:pPr>
     </w:p>
+    <w:p>
+      <w:pPr>
+        <w:spacing w:line="240" w:lineRule="auto"/>
+      </w:pPr>
+    </w:p>
+    <w:p>
+      <w:pPr>
+        <w:spacing w:line="240" w:lineRule="auto"/>
+      </w:pPr>
+    </w:p>
+    <w:p>
+      <w:pPr>
+        <w:spacing w:line="240" w:lineRule="auto"/>
+      </w:pPr>
+    </w:p>
+    <w:p>
+      <w:pPr>
+        <w:spacing w:line="240" w:lineRule="auto"/>
+      </w:pPr>
+    </w:p>
+    <w:p>
+      <w:pPr>
+        <w:spacing w:line="240" w:lineRule="auto"/>
+      </w:pPr>
+    </w:p>
+    <w:p>
+      <w:pPr>
+        <w:spacing w:line="240" w:lineRule="auto"/>
+      </w:pPr>
+    </w:p>
+    <w:p>
+      <w:pPr>
+        <w:spacing w:line="240" w:lineRule="auto"/>
+      </w:pPr>
+    </w:p>
+    <w:p>
+      <w:pPr>
+        <w:spacing w:line="240" w:lineRule="auto"/>
+      </w:pPr>
+    </w:p>
+    <w:p>
+      <w:pPr>
+        <w:spacing w:line="240" w:lineRule="auto"/>
+      </w:pPr>
+    </w:p>
+    <w:p>
+      <w:pPr>
+        <w:spacing w:line="240" w:lineRule="auto"/>
+      </w:pPr>
+    </w:p>
+    <w:p>
+      <w:pPr>
+        <w:spacing w:line="240" w:lineRule="auto"/>
+      </w:pPr>
+    </w:p>
+    <w:p>
+      <w:pPr>
+        <w:spacing w:line="240" w:lineRule="auto"/>
+      </w:pPr>
+    </w:p>
+    <w:p>
+      <w:pPr>
+        <w:spacing w:line="240" w:lineRule="auto"/>
+      </w:pPr>
+      <w:r>
+        <w:lastRenderedPageBreak/>
+        <w:t xml:space="preserve">10. Update koding pada file </w:t>
+      </w:r>
+      <w:r>
+        <w:t>booking.ts</w:t>
+      </w:r>
+      <w:r>
+        <w:t>.</w:t>
+      </w:r>
+    </w:p>
+    <w:p>
+      <w:pPr>
+        <w:spacing w:line="240" w:lineRule="auto"/>
+      </w:pPr>
+      <w:r>
+        <w:t xml:space="preserve">File : </w:t>
+      </w:r>
+      <w:r>
+        <w:t>wisata-CPMApp\user\app\lib\customer\utils\booking.ts</w:t>
+      </w:r>
+    </w:p>
+    <w:p>
+      <w:pPr>
+        <w:spacing w:line="240" w:lineRule="auto"/>
+      </w:pPr>
+      <w:r>
+        <w:rPr>
+          <w:noProof/>
+        </w:rPr>
+        <w:drawing>
+          <wp:inline distT="0" distB="0" distL="0" distR="0" wp14:anchorId="4334EDD2" wp14:editId="2EAC9933">
+            <wp:extent cx="5731510" cy="3222625"/>
+            <wp:effectExtent l="0" t="0" r="2540" b="0"/>
+            <wp:docPr id="820490748" name="Picture 1"/>
+            <wp:cNvGraphicFramePr>
+              <a:graphicFrameLocks xmlns:a="http://schemas.openxmlformats.org/drawingml/2006/main" noChangeAspect="1"/>
+            </wp:cNvGraphicFramePr>
+            <a:graphic xmlns:a="http://schemas.openxmlformats.org/drawingml/2006/main">
+              <a:graphicData uri="http://schemas.openxmlformats.org/drawingml/2006/picture">
+                <pic:pic xmlns:pic="http://schemas.openxmlformats.org/drawingml/2006/picture">
+                  <pic:nvPicPr>
+                    <pic:cNvPr id="820490748" name=""/>
+                    <pic:cNvPicPr/>
+                  </pic:nvPicPr>
+                  <pic:blipFill>
+                    <a:blip r:embed="rId15"/>
+                    <a:stretch>
+                      <a:fillRect/>
+                    </a:stretch>
+                  </pic:blipFill>
+                  <pic:spPr>
+                    <a:xfrm>
+                      <a:off x="0" y="0"/>
+                      <a:ext cx="5731510" cy="3222625"/>
+                    </a:xfrm>
+                    <a:prstGeom prst="rect">
+                      <a:avLst/>
+                    </a:prstGeom>
+                  </pic:spPr>
+                </pic:pic>
+              </a:graphicData>
+            </a:graphic>
+          </wp:inline>
+        </w:drawing>
+      </w:r>
+    </w:p>
+    <w:p>
+      <w:pPr>
+        <w:spacing w:line="240" w:lineRule="auto"/>
+      </w:pPr>
+      <w:r>
+        <w:t>import { apiUrl } from @/app/lib/api;</w:t>
+      </w:r>
+    </w:p>
+    <w:p>
+      <w:pPr>
+        <w:spacing w:line="240" w:lineRule="auto"/>
+        <w:jc w:val="both"/>
+      </w:pPr>
+      <w:r>
+        <w:t>Penjelasan:</w:t>
+      </w:r>
+      <w:r>
+        <w:br/>
+      </w:r>
+      <w:r>
+        <w:t>F</w:t>
+      </w:r>
+      <w:r>
+        <w:t xml:space="preserve">ungsinya untuk memanggil Mesin Alamat. </w:t>
+      </w:r>
+      <w:r>
+        <w:t>M</w:t>
+      </w:r>
+      <w:r>
+        <w:t>enulis alamat server yang panjang dan berubah-ubah secara manual, cukup mengimpor fungsi ini agar bisa membuat alamat otomatis yang sesuai dengan perangkat (Android/Web).</w:t>
+      </w:r>
+    </w:p>
+    <w:p>
+      <w:pPr>
+        <w:spacing w:line="240" w:lineRule="auto"/>
+        <w:jc w:val="both"/>
+      </w:pPr>
+    </w:p>
+    <w:p>
+      <w:pPr>
+        <w:spacing w:line="240" w:lineRule="auto"/>
+        <w:jc w:val="both"/>
+      </w:pPr>
+      <w:r>
+        <w:t xml:space="preserve">fetch(apiUrl(/booking/my), </w:t>
+      </w:r>
+    </w:p>
+    <w:p>
+      <w:pPr>
+        <w:spacing w:line="240" w:lineRule="auto"/>
+        <w:jc w:val="both"/>
+      </w:pPr>
+      <w:r>
+        <w:t>Penjelasan:</w:t>
+      </w:r>
+      <w:r>
+        <w:br/>
+      </w:r>
+      <w:r>
+        <w:t>F</w:t>
+      </w:r>
+      <w:r>
+        <w:t>ungsinya untuk mengambil data Booking Saya.</w:t>
+      </w:r>
+    </w:p>
+    <w:p>
+      <w:pPr>
+        <w:numPr>
+          <w:ilvl w:val="0"/>
+          <w:numId w:val="9"/>
+        </w:numPr>
+        <w:spacing w:line="240" w:lineRule="auto"/>
+        <w:jc w:val="both"/>
+      </w:pPr>
+      <w:r>
+        <w:t>apiUrl(/booking/my): Membuat link lengkap ke bagian pemesanan milik pengguna yang sedang login.</w:t>
+      </w:r>
+    </w:p>
+    <w:p>
+      <w:pPr>
+        <w:numPr>
+          <w:ilvl w:val="0"/>
+          <w:numId w:val="9"/>
+        </w:numPr>
+        <w:spacing w:line="240" w:lineRule="auto"/>
+        <w:jc w:val="both"/>
+      </w:pPr>
+      <w:r>
+        <w:t xml:space="preserve">Authorization: </w:t>
+      </w:r>
+      <w:r>
+        <w:t>K</w:t>
+      </w:r>
+      <w:r>
+        <w:t>ode Bearer ${token}. Server tidak akan memberikan data booking kalau tidak menunjukkan token (bukti login) ini.</w:t>
+      </w:r>
+    </w:p>
+    <w:p>
+      <w:pPr>
+        <w:spacing w:line="240" w:lineRule="auto"/>
+        <w:jc w:val="both"/>
+      </w:pPr>
+    </w:p>
+    <w:p>
+      <w:pPr>
+        <w:spacing w:line="240" w:lineRule="auto"/>
+        <w:jc w:val="both"/>
+      </w:pPr>
+      <w:r>
+        <w:t xml:space="preserve">3. fetch(apiUrl(/booking/${id}), </w:t>
+      </w:r>
+    </w:p>
+    <w:p>
+      <w:pPr>
+        <w:spacing w:line="240" w:lineRule="auto"/>
+        <w:jc w:val="both"/>
+      </w:pPr>
+      <w:r>
+        <w:t>Penjelasan:</w:t>
+      </w:r>
+      <w:r>
+        <w:br/>
+      </w:r>
+      <w:r>
+        <w:t>F</w:t>
+      </w:r>
+      <w:r>
+        <w:t>ungsinya untuk menghapus data booking tertentu.</w:t>
+      </w:r>
+    </w:p>
+    <w:p>
+      <w:pPr>
+        <w:numPr>
+          <w:ilvl w:val="0"/>
+          <w:numId w:val="10"/>
+        </w:numPr>
+        <w:spacing w:line="240" w:lineRule="auto"/>
+        <w:jc w:val="both"/>
+      </w:pPr>
+      <w:r>
+        <w:t xml:space="preserve">${id}: </w:t>
+      </w:r>
+      <w:r>
+        <w:t>N</w:t>
+      </w:r>
+      <w:r>
+        <w:t>omor identitas booking-nya. Jadi server tahu persis booking mana yang mau dihapus (misal: booking nomor 10).</w:t>
+      </w:r>
+    </w:p>
+    <w:p>
+      <w:pPr>
+        <w:numPr>
+          <w:ilvl w:val="0"/>
+          <w:numId w:val="10"/>
+        </w:numPr>
+        <w:spacing w:line="240" w:lineRule="auto"/>
+        <w:jc w:val="both"/>
+      </w:pPr>
+      <w:r>
+        <w:lastRenderedPageBreak/>
+        <w:t xml:space="preserve">method: DELETE: </w:t>
+      </w:r>
+      <w:r>
+        <w:t>P</w:t>
+      </w:r>
+      <w:r>
+        <w:t>erintah kepada server bahwa ingin membuang/menghapus data tersebut, bukan cuma melihat saja.</w:t>
+      </w:r>
+    </w:p>
+    <w:p>
+      <w:pPr>
+        <w:spacing w:line="240" w:lineRule="auto"/>
+      </w:pPr>
+    </w:p>
     <w:sectPr>
       <w:pgSz w:w="11906" w:h="16838"/>
       <w:pgMar w:top="1440" w:right="1440" w:bottom="1440" w:left="1440" w:header="708" w:footer="708" w:gutter="0"/>
@@ -2016,6 +2346,155 @@
     </w:lvl>
   </w:abstractNum>
   <w:abstractNum w:abstractNumId="2" w15:restartNumberingAfterBreak="0">
+    <w:nsid w:val="2E3E310D"/>
+    <w:multiLevelType w:val="multilevel"/>
+    <w:tmpl w:val="0FE2CECE"/>
+    <w:lvl w:ilvl="0">
+      <w:start w:val="1"/>
+      <w:numFmt w:val="bullet"/>
+      <w:lvlText w:val=""/>
+      <w:lvlJc w:val="left"/>
+      <w:pPr>
+        <w:tabs>
+          <w:tab w:val="num" w:pos="720"/>
+        </w:tabs>
+        <w:ind w:left="720" w:hanging="360"/>
+      </w:pPr>
+      <w:rPr>
+        <w:rFonts w:ascii="Symbol" w:hAnsi="Symbol" w:hint="default"/>
+        <w:sz w:val="20"/>
+      </w:rPr>
+    </w:lvl>
+    <w:lvl w:ilvl="1" w:tentative="1">
+      <w:start w:val="1"/>
+      <w:numFmt w:val="bullet"/>
+      <w:lvlText w:val="o"/>
+      <w:lvlJc w:val="left"/>
+      <w:pPr>
+        <w:tabs>
+          <w:tab w:val="num" w:pos="1440"/>
+        </w:tabs>
+        <w:ind w:left="1440" w:hanging="360"/>
+      </w:pPr>
+      <w:rPr>
+        <w:rFonts w:ascii="Courier New" w:hAnsi="Courier New" w:hint="default"/>
+        <w:sz w:val="20"/>
+      </w:rPr>
+    </w:lvl>
+    <w:lvl w:ilvl="2" w:tentative="1">
+      <w:start w:val="1"/>
+      <w:numFmt w:val="bullet"/>
+      <w:lvlText w:val=""/>
+      <w:lvlJc w:val="left"/>
+      <w:pPr>
+        <w:tabs>
+          <w:tab w:val="num" w:pos="2160"/>
+        </w:tabs>
+        <w:ind w:left="2160" w:hanging="360"/>
+      </w:pPr>
+      <w:rPr>
+        <w:rFonts w:ascii="Wingdings" w:hAnsi="Wingdings" w:hint="default"/>
+        <w:sz w:val="20"/>
+      </w:rPr>
+    </w:lvl>
+    <w:lvl w:ilvl="3" w:tentative="1">
+      <w:start w:val="1"/>
+      <w:numFmt w:val="bullet"/>
+      <w:lvlText w:val=""/>
+      <w:lvlJc w:val="left"/>
+      <w:pPr>
+        <w:tabs>
+          <w:tab w:val="num" w:pos="2880"/>
+        </w:tabs>
+        <w:ind w:left="2880" w:hanging="360"/>
+      </w:pPr>
+      <w:rPr>
+        <w:rFonts w:ascii="Wingdings" w:hAnsi="Wingdings" w:hint="default"/>
+        <w:sz w:val="20"/>
+      </w:rPr>
+    </w:lvl>
+    <w:lvl w:ilvl="4" w:tentative="1">
+      <w:start w:val="1"/>
+      <w:numFmt w:val="bullet"/>
+      <w:lvlText w:val=""/>
+      <w:lvlJc w:val="left"/>
+      <w:pPr>
+        <w:tabs>
+          <w:tab w:val="num" w:pos="3600"/>
+        </w:tabs>
+        <w:ind w:left="3600" w:hanging="360"/>
+      </w:pPr>
+      <w:rPr>
+        <w:rFonts w:ascii="Wingdings" w:hAnsi="Wingdings" w:hint="default"/>
+        <w:sz w:val="20"/>
+      </w:rPr>
+    </w:lvl>
+    <w:lvl w:ilvl="5" w:tentative="1">
+      <w:start w:val="1"/>
+      <w:numFmt w:val="bullet"/>
+      <w:lvlText w:val=""/>
+      <w:lvlJc w:val="left"/>
+      <w:pPr>
+        <w:tabs>
+          <w:tab w:val="num" w:pos="4320"/>
+        </w:tabs>
+        <w:ind w:left="4320" w:hanging="360"/>
+      </w:pPr>
+      <w:rPr>
+        <w:rFonts w:ascii="Wingdings" w:hAnsi="Wingdings" w:hint="default"/>
+        <w:sz w:val="20"/>
+      </w:rPr>
+    </w:lvl>
+    <w:lvl w:ilvl="6" w:tentative="1">
+      <w:start w:val="1"/>
+      <w:numFmt w:val="bullet"/>
+      <w:lvlText w:val=""/>
+      <w:lvlJc w:val="left"/>
+      <w:pPr>
+        <w:tabs>
+          <w:tab w:val="num" w:pos="5040"/>
+        </w:tabs>
+        <w:ind w:left="5040" w:hanging="360"/>
+      </w:pPr>
+      <w:rPr>
+        <w:rFonts w:ascii="Wingdings" w:hAnsi="Wingdings" w:hint="default"/>
+        <w:sz w:val="20"/>
+      </w:rPr>
+    </w:lvl>
+    <w:lvl w:ilvl="7" w:tentative="1">
+      <w:start w:val="1"/>
+      <w:numFmt w:val="bullet"/>
+      <w:lvlText w:val=""/>
+      <w:lvlJc w:val="left"/>
+      <w:pPr>
+        <w:tabs>
+          <w:tab w:val="num" w:pos="5760"/>
+        </w:tabs>
+        <w:ind w:left="5760" w:hanging="360"/>
+      </w:pPr>
+      <w:rPr>
+        <w:rFonts w:ascii="Wingdings" w:hAnsi="Wingdings" w:hint="default"/>
+        <w:sz w:val="20"/>
+      </w:rPr>
+    </w:lvl>
+    <w:lvl w:ilvl="8" w:tentative="1">
+      <w:start w:val="1"/>
+      <w:numFmt w:val="bullet"/>
+      <w:lvlText w:val=""/>
+      <w:lvlJc w:val="left"/>
+      <w:pPr>
+        <w:tabs>
+          <w:tab w:val="num" w:pos="6480"/>
+        </w:tabs>
+        <w:ind w:left="6480" w:hanging="360"/>
+      </w:pPr>
+      <w:rPr>
+        <w:rFonts w:ascii="Wingdings" w:hAnsi="Wingdings" w:hint="default"/>
+        <w:sz w:val="20"/>
+      </w:rPr>
+    </w:lvl>
+  </w:abstractNum>
+  <w:abstractNum w:abstractNumId="3" w15:restartNumberingAfterBreak="0">
     <w:nsid w:val="4E280CE5"/>
     <w:multiLevelType w:val="hybridMultilevel"/>
     <w:tmpl w:val="C5944EFA"/>
@@ -2128,7 +2607,7 @@
       </w:rPr>
     </w:lvl>
   </w:abstractNum>
-  <w:abstractNum w:abstractNumId="3" w15:restartNumberingAfterBreak="0">
+  <w:abstractNum w:abstractNumId="4" w15:restartNumberingAfterBreak="0">
     <w:nsid w:val="52B2306A"/>
     <w:multiLevelType w:val="multilevel"/>
     <w:tmpl w:val="28BC2570"/>
@@ -2245,7 +2724,7 @@
       </w:pPr>
     </w:lvl>
   </w:abstractNum>
-  <w:abstractNum w:abstractNumId="4" w15:restartNumberingAfterBreak="0">
+  <w:abstractNum w:abstractNumId="5" w15:restartNumberingAfterBreak="0">
     <w:nsid w:val="59AC64DE"/>
     <w:multiLevelType w:val="hybridMultilevel"/>
     <w:tmpl w:val="D556FF78"/>
@@ -2358,7 +2837,7 @@
       </w:rPr>
     </w:lvl>
   </w:abstractNum>
-  <w:abstractNum w:abstractNumId="5" w15:restartNumberingAfterBreak="0">
+  <w:abstractNum w:abstractNumId="6" w15:restartNumberingAfterBreak="0">
     <w:nsid w:val="6BA85B18"/>
     <w:multiLevelType w:val="multilevel"/>
     <w:tmpl w:val="C93CBC46"/>
@@ -2507,7 +2986,7 @@
       </w:rPr>
     </w:lvl>
   </w:abstractNum>
-  <w:abstractNum w:abstractNumId="6" w15:restartNumberingAfterBreak="0">
+  <w:abstractNum w:abstractNumId="7" w15:restartNumberingAfterBreak="0">
     <w:nsid w:val="7B92578F"/>
     <w:multiLevelType w:val="hybridMultilevel"/>
     <w:tmpl w:val="B804E9B8"/>
@@ -2620,7 +3099,156 @@
       </w:rPr>
     </w:lvl>
   </w:abstractNum>
-  <w:abstractNum w:abstractNumId="7" w15:restartNumberingAfterBreak="0">
+  <w:abstractNum w:abstractNumId="8" w15:restartNumberingAfterBreak="0">
+    <w:nsid w:val="7BE726BE"/>
+    <w:multiLevelType w:val="multilevel"/>
+    <w:tmpl w:val="14AE9B48"/>
+    <w:lvl w:ilvl="0">
+      <w:start w:val="1"/>
+      <w:numFmt w:val="bullet"/>
+      <w:lvlText w:val=""/>
+      <w:lvlJc w:val="left"/>
+      <w:pPr>
+        <w:tabs>
+          <w:tab w:val="num" w:pos="720"/>
+        </w:tabs>
+        <w:ind w:left="720" w:hanging="360"/>
+      </w:pPr>
+      <w:rPr>
+        <w:rFonts w:ascii="Symbol" w:hAnsi="Symbol" w:hint="default"/>
+        <w:sz w:val="20"/>
+      </w:rPr>
+    </w:lvl>
+    <w:lvl w:ilvl="1" w:tentative="1">
+      <w:start w:val="1"/>
+      <w:numFmt w:val="bullet"/>
+      <w:lvlText w:val="o"/>
+      <w:lvlJc w:val="left"/>
+      <w:pPr>
+        <w:tabs>
+          <w:tab w:val="num" w:pos="1440"/>
+        </w:tabs>
+        <w:ind w:left="1440" w:hanging="360"/>
+      </w:pPr>
+      <w:rPr>
+        <w:rFonts w:ascii="Courier New" w:hAnsi="Courier New" w:hint="default"/>
+        <w:sz w:val="20"/>
+      </w:rPr>
+    </w:lvl>
+    <w:lvl w:ilvl="2" w:tentative="1">
+      <w:start w:val="1"/>
+      <w:numFmt w:val="bullet"/>
+      <w:lvlText w:val=""/>
+      <w:lvlJc w:val="left"/>
+      <w:pPr>
+        <w:tabs>
+          <w:tab w:val="num" w:pos="2160"/>
+        </w:tabs>
+        <w:ind w:left="2160" w:hanging="360"/>
+      </w:pPr>
+      <w:rPr>
+        <w:rFonts w:ascii="Wingdings" w:hAnsi="Wingdings" w:hint="default"/>
+        <w:sz w:val="20"/>
+      </w:rPr>
+    </w:lvl>
+    <w:lvl w:ilvl="3" w:tentative="1">
+      <w:start w:val="1"/>
+      <w:numFmt w:val="bullet"/>
+      <w:lvlText w:val=""/>
+      <w:lvlJc w:val="left"/>
+      <w:pPr>
+        <w:tabs>
+          <w:tab w:val="num" w:pos="2880"/>
+        </w:tabs>
+        <w:ind w:left="2880" w:hanging="360"/>
+      </w:pPr>
+      <w:rPr>
+        <w:rFonts w:ascii="Wingdings" w:hAnsi="Wingdings" w:hint="default"/>
+        <w:sz w:val="20"/>
+      </w:rPr>
+    </w:lvl>
+    <w:lvl w:ilvl="4" w:tentative="1">
+      <w:start w:val="1"/>
+      <w:numFmt w:val="bullet"/>
+      <w:lvlText w:val=""/>
+      <w:lvlJc w:val="left"/>
+      <w:pPr>
+        <w:tabs>
+          <w:tab w:val="num" w:pos="3600"/>
+        </w:tabs>
+        <w:ind w:left="3600" w:hanging="360"/>
+      </w:pPr>
+      <w:rPr>
+        <w:rFonts w:ascii="Wingdings" w:hAnsi="Wingdings" w:hint="default"/>
+        <w:sz w:val="20"/>
+      </w:rPr>
+    </w:lvl>
+    <w:lvl w:ilvl="5" w:tentative="1">
+      <w:start w:val="1"/>
+      <w:numFmt w:val="bullet"/>
+      <w:lvlText w:val=""/>
+      <w:lvlJc w:val="left"/>
+      <w:pPr>
+        <w:tabs>
+          <w:tab w:val="num" w:pos="4320"/>
+        </w:tabs>
+        <w:ind w:left="4320" w:hanging="360"/>
+      </w:pPr>
+      <w:rPr>
+        <w:rFonts w:ascii="Wingdings" w:hAnsi="Wingdings" w:hint="default"/>
+        <w:sz w:val="20"/>
+      </w:rPr>
+    </w:lvl>
+    <w:lvl w:ilvl="6" w:tentative="1">
+      <w:start w:val="1"/>
+      <w:numFmt w:val="bullet"/>
+      <w:lvlText w:val=""/>
+      <w:lvlJc w:val="left"/>
+      <w:pPr>
+        <w:tabs>
+          <w:tab w:val="num" w:pos="5040"/>
+        </w:tabs>
+        <w:ind w:left="5040" w:hanging="360"/>
+      </w:pPr>
+      <w:rPr>
+        <w:rFonts w:ascii="Wingdings" w:hAnsi="Wingdings" w:hint="default"/>
+        <w:sz w:val="20"/>
+      </w:rPr>
+    </w:lvl>
+    <w:lvl w:ilvl="7" w:tentative="1">
+      <w:start w:val="1"/>
+      <w:numFmt w:val="bullet"/>
+      <w:lvlText w:val=""/>
+      <w:lvlJc w:val="left"/>
+      <w:pPr>
+        <w:tabs>
+          <w:tab w:val="num" w:pos="5760"/>
+        </w:tabs>
+        <w:ind w:left="5760" w:hanging="360"/>
+      </w:pPr>
+      <w:rPr>
+        <w:rFonts w:ascii="Wingdings" w:hAnsi="Wingdings" w:hint="default"/>
+        <w:sz w:val="20"/>
+      </w:rPr>
+    </w:lvl>
+    <w:lvl w:ilvl="8" w:tentative="1">
+      <w:start w:val="1"/>
+      <w:numFmt w:val="bullet"/>
+      <w:lvlText w:val=""/>
+      <w:lvlJc w:val="left"/>
+      <w:pPr>
+        <w:tabs>
+          <w:tab w:val="num" w:pos="6480"/>
+        </w:tabs>
+        <w:ind w:left="6480" w:hanging="360"/>
+      </w:pPr>
+      <w:rPr>
+        <w:rFonts w:ascii="Wingdings" w:hAnsi="Wingdings" w:hint="default"/>
+        <w:sz w:val="20"/>
+      </w:rPr>
+    </w:lvl>
+  </w:abstractNum>
+  <w:abstractNum w:abstractNumId="9" w15:restartNumberingAfterBreak="0">
     <w:nsid w:val="7DD5389E"/>
     <w:multiLevelType w:val="hybridMultilevel"/>
     <w:tmpl w:val="6840CD52"/>
@@ -2734,28 +3362,34 @@
     </w:lvl>
   </w:abstractNum>
   <w:num w:numId="1" w16cid:durableId="775180286">
-    <w:abstractNumId w:val="6"/>
+    <w:abstractNumId w:val="7"/>
   </w:num>
   <w:num w:numId="2" w16cid:durableId="1579442916">
-    <w:abstractNumId w:val="7"/>
+    <w:abstractNumId w:val="9"/>
   </w:num>
   <w:num w:numId="3" w16cid:durableId="1996445871">
     <w:abstractNumId w:val="0"/>
   </w:num>
   <w:num w:numId="4" w16cid:durableId="982202006">
-    <w:abstractNumId w:val="4"/>
+    <w:abstractNumId w:val="5"/>
   </w:num>
   <w:num w:numId="5" w16cid:durableId="2119370406">
-    <w:abstractNumId w:val="2"/>
+    <w:abstractNumId w:val="3"/>
   </w:num>
   <w:num w:numId="6" w16cid:durableId="1063062556">
-    <w:abstractNumId w:val="5"/>
+    <w:abstractNumId w:val="6"/>
   </w:num>
   <w:num w:numId="7" w16cid:durableId="1353610240">
-    <w:abstractNumId w:val="3"/>
+    <w:abstractNumId w:val="4"/>
   </w:num>
   <w:num w:numId="8" w16cid:durableId="905185883">
     <w:abstractNumId w:val="1"/>
+  </w:num>
+  <w:num w:numId="9" w16cid:durableId="671614104">
+    <w:abstractNumId w:val="2"/>
+  </w:num>
+  <w:num w:numId="10" w16cid:durableId="1140342277">
+    <w:abstractNumId w:val="8"/>
   </w:num>
 </w:numbering>
 </file>

</xml_diff>

<commit_message>
Update koding wisata.ts. pada File : wisata-CPMApp\user\app\lib\wisata\utils\wisata.ts
</commit_message>
<xml_diff>
--- a/Dokumentasi/24382001P_Lorensius Firngadi_Dokumentasi Sesi 3.docx
+++ b/Dokumentasi/24382001P_Lorensius Firngadi_Dokumentasi Sesi 3.docx
@@ -6317,6 +6317,545 @@
         <w:spacing w:line="240" w:lineRule="auto"/>
       </w:pPr>
     </w:p>
+    <w:p>
+      <w:pPr>
+        <w:spacing w:line="240" w:lineRule="auto"/>
+      </w:pPr>
+      <w:r>
+        <w:lastRenderedPageBreak/>
+        <w:t xml:space="preserve">12. </w:t>
+      </w:r>
+    </w:p>
+    <w:p>
+      <w:pPr>
+        <w:spacing w:line="240" w:lineRule="auto"/>
+      </w:pPr>
+      <w:proofErr w:type="gramStart"/>
+      <w:r>
+        <w:t>File :</w:t>
+      </w:r>
+      <w:proofErr w:type="gramEnd"/>
+    </w:p>
+    <w:p>
+      <w:pPr>
+        <w:spacing w:line="240" w:lineRule="auto"/>
+      </w:pPr>
+      <w:r>
+        <w:rPr>
+          <w:noProof/>
+        </w:rPr>
+        <w:drawing>
+          <wp:inline distT="0" distB="0" distL="0" distR="0" wp14:anchorId="56803D8D" wp14:editId="2C81AC6F">
+            <wp:extent cx="5731510" cy="3222625"/>
+            <wp:effectExtent l="0" t="0" r="2540" b="0"/>
+            <wp:docPr id="876772842" name="Picture 1"/>
+            <wp:cNvGraphicFramePr>
+              <a:graphicFrameLocks xmlns:a="http://schemas.openxmlformats.org/drawingml/2006/main" noChangeAspect="1"/>
+            </wp:cNvGraphicFramePr>
+            <a:graphic xmlns:a="http://schemas.openxmlformats.org/drawingml/2006/main">
+              <a:graphicData uri="http://schemas.openxmlformats.org/drawingml/2006/picture">
+                <pic:pic xmlns:pic="http://schemas.openxmlformats.org/drawingml/2006/picture">
+                  <pic:nvPicPr>
+                    <pic:cNvPr id="876772842" name=""/>
+                    <pic:cNvPicPr/>
+                  </pic:nvPicPr>
+                  <pic:blipFill>
+                    <a:blip r:embed="rId17"/>
+                    <a:stretch>
+                      <a:fillRect/>
+                    </a:stretch>
+                  </pic:blipFill>
+                  <pic:spPr>
+                    <a:xfrm>
+                      <a:off x="0" y="0"/>
+                      <a:ext cx="5731510" cy="3222625"/>
+                    </a:xfrm>
+                    <a:prstGeom prst="rect">
+                      <a:avLst/>
+                    </a:prstGeom>
+                  </pic:spPr>
+                </pic:pic>
+              </a:graphicData>
+            </a:graphic>
+          </wp:inline>
+        </w:drawing>
+      </w:r>
+    </w:p>
+    <w:p>
+      <w:pPr>
+        <w:spacing w:line="240" w:lineRule="auto"/>
+      </w:pPr>
+      <w:r>
+        <w:br/>
+      </w:r>
+    </w:p>
+    <w:p>
+      <w:pPr>
+        <w:spacing w:line="240" w:lineRule="auto"/>
+      </w:pPr>
+      <w:r>
+        <w:t xml:space="preserve">import </w:t>
+      </w:r>
+      <w:proofErr w:type="gramStart"/>
+      <w:r>
+        <w:t xml:space="preserve">{ </w:t>
+      </w:r>
+      <w:proofErr w:type="spellStart"/>
+      <w:r>
+        <w:t>apiUrl</w:t>
+      </w:r>
+      <w:proofErr w:type="spellEnd"/>
+      <w:proofErr w:type="gramEnd"/>
+      <w:r>
+        <w:t xml:space="preserve"> } from '@/app/lib/</w:t>
+      </w:r>
+      <w:proofErr w:type="spellStart"/>
+      <w:r>
+        <w:t>api</w:t>
+      </w:r>
+      <w:proofErr w:type="spellEnd"/>
+      <w:r>
+        <w:t>';</w:t>
+      </w:r>
+    </w:p>
+    <w:p>
+      <w:pPr>
+        <w:spacing w:line="240" w:lineRule="auto"/>
+      </w:pPr>
+      <w:proofErr w:type="spellStart"/>
+      <w:r>
+        <w:t>M</w:t>
+      </w:r>
+      <w:r>
+        <w:t>emanggil</w:t>
+      </w:r>
+      <w:proofErr w:type="spellEnd"/>
+      <w:r>
+        <w:t> </w:t>
+      </w:r>
+      <w:proofErr w:type="spellStart"/>
+      <w:r>
+        <w:t>Mesin</w:t>
+      </w:r>
+      <w:proofErr w:type="spellEnd"/>
+      <w:r>
+        <w:t xml:space="preserve"> </w:t>
+      </w:r>
+      <w:proofErr w:type="spellStart"/>
+      <w:r>
+        <w:t>Pembuat</w:t>
+      </w:r>
+      <w:proofErr w:type="spellEnd"/>
+      <w:r>
+        <w:t xml:space="preserve"> Alamat yang </w:t>
+      </w:r>
+      <w:proofErr w:type="spellStart"/>
+      <w:r>
+        <w:t>sudah</w:t>
+      </w:r>
+      <w:proofErr w:type="spellEnd"/>
+      <w:r>
+        <w:t xml:space="preserve"> </w:t>
+      </w:r>
+      <w:r>
+        <w:t>di</w:t>
+      </w:r>
+      <w:r>
+        <w:t xml:space="preserve"> buat </w:t>
+      </w:r>
+      <w:proofErr w:type="spellStart"/>
+      <w:r>
+        <w:t>sebelumnya</w:t>
+      </w:r>
+      <w:proofErr w:type="spellEnd"/>
+      <w:r>
+        <w:t xml:space="preserve"> </w:t>
+      </w:r>
+      <w:r>
+        <w:t>pada</w:t>
+      </w:r>
+      <w:r>
+        <w:t xml:space="preserve"> file </w:t>
+      </w:r>
+      <w:proofErr w:type="spellStart"/>
+      <w:r>
+        <w:t>api.ts</w:t>
+      </w:r>
+      <w:proofErr w:type="spellEnd"/>
+      <w:r>
+        <w:t xml:space="preserve">. </w:t>
+      </w:r>
+      <w:proofErr w:type="spellStart"/>
+      <w:r>
+        <w:t>Tanpa</w:t>
+      </w:r>
+      <w:proofErr w:type="spellEnd"/>
+      <w:r>
+        <w:t xml:space="preserve"> baris </w:t>
+      </w:r>
+      <w:proofErr w:type="spellStart"/>
+      <w:r>
+        <w:t>ini</w:t>
+      </w:r>
+      <w:proofErr w:type="spellEnd"/>
+      <w:r>
+        <w:t xml:space="preserve">, </w:t>
+      </w:r>
+      <w:proofErr w:type="spellStart"/>
+      <w:r>
+        <w:t>aplikasi</w:t>
+      </w:r>
+      <w:proofErr w:type="spellEnd"/>
+      <w:r>
+        <w:t xml:space="preserve"> </w:t>
+      </w:r>
+      <w:proofErr w:type="spellStart"/>
+      <w:r>
+        <w:t>tidak</w:t>
+      </w:r>
+      <w:proofErr w:type="spellEnd"/>
+      <w:r>
+        <w:t xml:space="preserve"> </w:t>
+      </w:r>
+      <w:proofErr w:type="spellStart"/>
+      <w:r>
+        <w:t>akan</w:t>
+      </w:r>
+      <w:proofErr w:type="spellEnd"/>
+      <w:r>
+        <w:t xml:space="preserve"> </w:t>
+      </w:r>
+      <w:proofErr w:type="spellStart"/>
+      <w:r>
+        <w:t>tahu</w:t>
+      </w:r>
+      <w:proofErr w:type="spellEnd"/>
+      <w:r>
+        <w:t xml:space="preserve"> di mana </w:t>
+      </w:r>
+      <w:proofErr w:type="spellStart"/>
+      <w:r>
+        <w:t>alamat</w:t>
+      </w:r>
+      <w:proofErr w:type="spellEnd"/>
+      <w:r>
+        <w:t xml:space="preserve"> server </w:t>
+      </w:r>
+      <w:proofErr w:type="spellStart"/>
+      <w:r>
+        <w:t>berada</w:t>
+      </w:r>
+      <w:proofErr w:type="spellEnd"/>
+      <w:r>
+        <w:t>.</w:t>
+      </w:r>
+    </w:p>
+    <w:p>
+      <w:pPr>
+        <w:spacing w:line="240" w:lineRule="auto"/>
+      </w:pPr>
+    </w:p>
+    <w:p>
+      <w:pPr>
+        <w:spacing w:line="240" w:lineRule="auto"/>
+      </w:pPr>
+      <w:proofErr w:type="spellStart"/>
+      <w:r>
+        <w:t>apiUrl</w:t>
+      </w:r>
+      <w:proofErr w:type="spellEnd"/>
+      <w:r>
+        <w:t>(/</w:t>
+      </w:r>
+      <w:proofErr w:type="spellStart"/>
+      <w:r>
+        <w:t>wisata</w:t>
+      </w:r>
+      <w:proofErr w:type="spellEnd"/>
+      <w:r>
+        <w:t>/${id})</w:t>
+      </w:r>
+    </w:p>
+    <w:p>
+      <w:pPr>
+        <w:spacing w:line="240" w:lineRule="auto"/>
+      </w:pPr>
+      <w:r>
+        <w:t>C</w:t>
+      </w:r>
+      <w:r>
+        <w:t xml:space="preserve">ara </w:t>
+      </w:r>
+      <w:proofErr w:type="spellStart"/>
+      <w:r>
+        <w:t>untuk</w:t>
+      </w:r>
+      <w:proofErr w:type="spellEnd"/>
+      <w:r>
+        <w:t> </w:t>
+      </w:r>
+      <w:proofErr w:type="spellStart"/>
+      <w:r>
+        <w:t>membuat</w:t>
+      </w:r>
+      <w:proofErr w:type="spellEnd"/>
+      <w:r>
+        <w:t xml:space="preserve"> </w:t>
+      </w:r>
+      <w:proofErr w:type="spellStart"/>
+      <w:r>
+        <w:t>alamat</w:t>
+      </w:r>
+      <w:proofErr w:type="spellEnd"/>
+      <w:r>
+        <w:t xml:space="preserve"> </w:t>
+      </w:r>
+      <w:proofErr w:type="spellStart"/>
+      <w:r>
+        <w:t>lengkap</w:t>
+      </w:r>
+      <w:proofErr w:type="spellEnd"/>
+      <w:r>
+        <w:t xml:space="preserve"> </w:t>
+      </w:r>
+      <w:proofErr w:type="spellStart"/>
+      <w:r>
+        <w:t>menuju</w:t>
+      </w:r>
+      <w:proofErr w:type="spellEnd"/>
+      <w:r>
+        <w:t xml:space="preserve"> </w:t>
+      </w:r>
+      <w:proofErr w:type="spellStart"/>
+      <w:r>
+        <w:t>satu</w:t>
+      </w:r>
+      <w:proofErr w:type="spellEnd"/>
+      <w:r>
+        <w:t xml:space="preserve"> </w:t>
+      </w:r>
+      <w:proofErr w:type="spellStart"/>
+      <w:r>
+        <w:t>tempat</w:t>
+      </w:r>
+      <w:proofErr w:type="spellEnd"/>
+      <w:r>
+        <w:t xml:space="preserve"> </w:t>
+      </w:r>
+      <w:proofErr w:type="spellStart"/>
+      <w:r>
+        <w:t>wisata</w:t>
+      </w:r>
+      <w:proofErr w:type="spellEnd"/>
+      <w:r>
+        <w:t xml:space="preserve"> </w:t>
+      </w:r>
+      <w:proofErr w:type="spellStart"/>
+      <w:r>
+        <w:t>secara</w:t>
+      </w:r>
+      <w:proofErr w:type="spellEnd"/>
+      <w:r>
+        <w:t xml:space="preserve"> </w:t>
+      </w:r>
+      <w:proofErr w:type="spellStart"/>
+      <w:r>
+        <w:t>spesifik</w:t>
+      </w:r>
+      <w:proofErr w:type="spellEnd"/>
+      <w:r>
+        <w:t>.</w:t>
+      </w:r>
+    </w:p>
+    <w:p>
+      <w:pPr>
+        <w:numPr>
+          <w:ilvl w:val="0"/>
+          <w:numId w:val="14"/>
+        </w:numPr>
+        <w:spacing w:line="240" w:lineRule="auto"/>
+      </w:pPr>
+      <w:r>
+        <w:t xml:space="preserve">${id}: </w:t>
+      </w:r>
+      <w:proofErr w:type="spellStart"/>
+      <w:r>
+        <w:t>Nomor</w:t>
+      </w:r>
+      <w:proofErr w:type="spellEnd"/>
+      <w:r>
+        <w:t xml:space="preserve"> KTP </w:t>
+      </w:r>
+      <w:proofErr w:type="spellStart"/>
+      <w:r>
+        <w:t>atau</w:t>
+      </w:r>
+      <w:proofErr w:type="spellEnd"/>
+      <w:r>
+        <w:t xml:space="preserve"> ID </w:t>
+      </w:r>
+      <w:proofErr w:type="spellStart"/>
+      <w:r>
+        <w:t>unik</w:t>
+      </w:r>
+      <w:proofErr w:type="spellEnd"/>
+      <w:r>
+        <w:t xml:space="preserve"> </w:t>
+      </w:r>
+      <w:proofErr w:type="spellStart"/>
+      <w:r>
+        <w:t>dari</w:t>
+      </w:r>
+      <w:proofErr w:type="spellEnd"/>
+      <w:r>
+        <w:t xml:space="preserve"> </w:t>
+      </w:r>
+      <w:proofErr w:type="spellStart"/>
+      <w:r>
+        <w:t>tempat</w:t>
+      </w:r>
+      <w:proofErr w:type="spellEnd"/>
+      <w:r>
+        <w:t xml:space="preserve"> </w:t>
+      </w:r>
+      <w:proofErr w:type="spellStart"/>
+      <w:r>
+        <w:t>wisata</w:t>
+      </w:r>
+      <w:proofErr w:type="spellEnd"/>
+      <w:r>
+        <w:t xml:space="preserve">. </w:t>
+      </w:r>
+      <w:proofErr w:type="spellStart"/>
+      <w:r>
+        <w:t>Misalnya</w:t>
+      </w:r>
+      <w:proofErr w:type="spellEnd"/>
+      <w:r>
+        <w:t>, Borobudur ID-</w:t>
+      </w:r>
+      <w:proofErr w:type="spellStart"/>
+      <w:r>
+        <w:t>nya</w:t>
+      </w:r>
+      <w:proofErr w:type="spellEnd"/>
+      <w:r>
+        <w:t xml:space="preserve"> </w:t>
+      </w:r>
+      <w:proofErr w:type="spellStart"/>
+      <w:r>
+        <w:t>adalah</w:t>
+      </w:r>
+      <w:proofErr w:type="spellEnd"/>
+      <w:r>
+        <w:t xml:space="preserve"> 5, </w:t>
+      </w:r>
+      <w:proofErr w:type="spellStart"/>
+      <w:r>
+        <w:t>maka</w:t>
+      </w:r>
+      <w:proofErr w:type="spellEnd"/>
+      <w:r>
+        <w:t xml:space="preserve"> </w:t>
+      </w:r>
+      <w:proofErr w:type="spellStart"/>
+      <w:r>
+        <w:t>kodingannya</w:t>
+      </w:r>
+      <w:proofErr w:type="spellEnd"/>
+      <w:r>
+        <w:t xml:space="preserve"> </w:t>
+      </w:r>
+      <w:proofErr w:type="spellStart"/>
+      <w:r>
+        <w:t>menjadi</w:t>
+      </w:r>
+      <w:proofErr w:type="spellEnd"/>
+      <w:r>
+        <w:t> /</w:t>
+      </w:r>
+      <w:proofErr w:type="spellStart"/>
+      <w:r>
+        <w:t>wisata</w:t>
+      </w:r>
+      <w:proofErr w:type="spellEnd"/>
+      <w:r>
+        <w:t>/5.</w:t>
+      </w:r>
+    </w:p>
+    <w:p>
+      <w:pPr>
+        <w:numPr>
+          <w:ilvl w:val="0"/>
+          <w:numId w:val="14"/>
+        </w:numPr>
+        <w:spacing w:line="240" w:lineRule="auto"/>
+      </w:pPr>
+      <w:proofErr w:type="spellStart"/>
+      <w:r>
+        <w:t>apiUrl</w:t>
+      </w:r>
+      <w:proofErr w:type="spellEnd"/>
+      <w:r>
+        <w:t xml:space="preserve">: </w:t>
+      </w:r>
+      <w:proofErr w:type="spellStart"/>
+      <w:r>
+        <w:t>M</w:t>
+      </w:r>
+      <w:r>
+        <w:t>enempelkan</w:t>
+      </w:r>
+      <w:proofErr w:type="spellEnd"/>
+      <w:r>
+        <w:t xml:space="preserve"> </w:t>
+      </w:r>
+      <w:proofErr w:type="spellStart"/>
+      <w:r>
+        <w:t>alamat</w:t>
+      </w:r>
+      <w:proofErr w:type="spellEnd"/>
+      <w:r>
+        <w:t xml:space="preserve"> </w:t>
+      </w:r>
+      <w:proofErr w:type="spellStart"/>
+      <w:r>
+        <w:t>pusat</w:t>
+      </w:r>
+      <w:proofErr w:type="spellEnd"/>
+      <w:r>
+        <w:t xml:space="preserve"> di </w:t>
+      </w:r>
+      <w:proofErr w:type="spellStart"/>
+      <w:r>
+        <w:t>depannya</w:t>
+      </w:r>
+      <w:proofErr w:type="spellEnd"/>
+      <w:r>
+        <w:t xml:space="preserve"> </w:t>
+      </w:r>
+      <w:proofErr w:type="spellStart"/>
+      <w:r>
+        <w:t>secara</w:t>
+      </w:r>
+      <w:proofErr w:type="spellEnd"/>
+      <w:r>
+        <w:t xml:space="preserve"> </w:t>
+      </w:r>
+      <w:proofErr w:type="spellStart"/>
+      <w:r>
+        <w:t>otomatis</w:t>
+      </w:r>
+      <w:proofErr w:type="spellEnd"/>
+      <w:r>
+        <w:t>.</w:t>
+      </w:r>
+    </w:p>
+    <w:p>
+      <w:pPr>
+        <w:spacing w:line="240" w:lineRule="auto"/>
+      </w:pPr>
+    </w:p>
     <w:sectPr>
       <w:pgSz w:w="11906" w:h="16838"/>
       <w:pgMar w:top="1440" w:right="1440" w:bottom="1440" w:left="1440" w:header="708" w:footer="708" w:gutter="0"/>
@@ -6741,6 +7280,155 @@
     </w:lvl>
   </w:abstractNum>
   <w:abstractNum w:abstractNumId="3" w15:restartNumberingAfterBreak="0">
+    <w:nsid w:val="3B2651EE"/>
+    <w:multiLevelType w:val="multilevel"/>
+    <w:tmpl w:val="A9B64842"/>
+    <w:lvl w:ilvl="0">
+      <w:start w:val="1"/>
+      <w:numFmt w:val="bullet"/>
+      <w:lvlText w:val=""/>
+      <w:lvlJc w:val="left"/>
+      <w:pPr>
+        <w:tabs>
+          <w:tab w:val="num" w:pos="720"/>
+        </w:tabs>
+        <w:ind w:left="720" w:hanging="360"/>
+      </w:pPr>
+      <w:rPr>
+        <w:rFonts w:ascii="Symbol" w:hAnsi="Symbol" w:hint="default"/>
+        <w:sz w:val="20"/>
+      </w:rPr>
+    </w:lvl>
+    <w:lvl w:ilvl="1" w:tentative="1">
+      <w:start w:val="1"/>
+      <w:numFmt w:val="bullet"/>
+      <w:lvlText w:val="o"/>
+      <w:lvlJc w:val="left"/>
+      <w:pPr>
+        <w:tabs>
+          <w:tab w:val="num" w:pos="1440"/>
+        </w:tabs>
+        <w:ind w:left="1440" w:hanging="360"/>
+      </w:pPr>
+      <w:rPr>
+        <w:rFonts w:ascii="Courier New" w:hAnsi="Courier New" w:hint="default"/>
+        <w:sz w:val="20"/>
+      </w:rPr>
+    </w:lvl>
+    <w:lvl w:ilvl="2" w:tentative="1">
+      <w:start w:val="1"/>
+      <w:numFmt w:val="bullet"/>
+      <w:lvlText w:val=""/>
+      <w:lvlJc w:val="left"/>
+      <w:pPr>
+        <w:tabs>
+          <w:tab w:val="num" w:pos="2160"/>
+        </w:tabs>
+        <w:ind w:left="2160" w:hanging="360"/>
+      </w:pPr>
+      <w:rPr>
+        <w:rFonts w:ascii="Wingdings" w:hAnsi="Wingdings" w:hint="default"/>
+        <w:sz w:val="20"/>
+      </w:rPr>
+    </w:lvl>
+    <w:lvl w:ilvl="3" w:tentative="1">
+      <w:start w:val="1"/>
+      <w:numFmt w:val="bullet"/>
+      <w:lvlText w:val=""/>
+      <w:lvlJc w:val="left"/>
+      <w:pPr>
+        <w:tabs>
+          <w:tab w:val="num" w:pos="2880"/>
+        </w:tabs>
+        <w:ind w:left="2880" w:hanging="360"/>
+      </w:pPr>
+      <w:rPr>
+        <w:rFonts w:ascii="Wingdings" w:hAnsi="Wingdings" w:hint="default"/>
+        <w:sz w:val="20"/>
+      </w:rPr>
+    </w:lvl>
+    <w:lvl w:ilvl="4" w:tentative="1">
+      <w:start w:val="1"/>
+      <w:numFmt w:val="bullet"/>
+      <w:lvlText w:val=""/>
+      <w:lvlJc w:val="left"/>
+      <w:pPr>
+        <w:tabs>
+          <w:tab w:val="num" w:pos="3600"/>
+        </w:tabs>
+        <w:ind w:left="3600" w:hanging="360"/>
+      </w:pPr>
+      <w:rPr>
+        <w:rFonts w:ascii="Wingdings" w:hAnsi="Wingdings" w:hint="default"/>
+        <w:sz w:val="20"/>
+      </w:rPr>
+    </w:lvl>
+    <w:lvl w:ilvl="5" w:tentative="1">
+      <w:start w:val="1"/>
+      <w:numFmt w:val="bullet"/>
+      <w:lvlText w:val=""/>
+      <w:lvlJc w:val="left"/>
+      <w:pPr>
+        <w:tabs>
+          <w:tab w:val="num" w:pos="4320"/>
+        </w:tabs>
+        <w:ind w:left="4320" w:hanging="360"/>
+      </w:pPr>
+      <w:rPr>
+        <w:rFonts w:ascii="Wingdings" w:hAnsi="Wingdings" w:hint="default"/>
+        <w:sz w:val="20"/>
+      </w:rPr>
+    </w:lvl>
+    <w:lvl w:ilvl="6" w:tentative="1">
+      <w:start w:val="1"/>
+      <w:numFmt w:val="bullet"/>
+      <w:lvlText w:val=""/>
+      <w:lvlJc w:val="left"/>
+      <w:pPr>
+        <w:tabs>
+          <w:tab w:val="num" w:pos="5040"/>
+        </w:tabs>
+        <w:ind w:left="5040" w:hanging="360"/>
+      </w:pPr>
+      <w:rPr>
+        <w:rFonts w:ascii="Wingdings" w:hAnsi="Wingdings" w:hint="default"/>
+        <w:sz w:val="20"/>
+      </w:rPr>
+    </w:lvl>
+    <w:lvl w:ilvl="7" w:tentative="1">
+      <w:start w:val="1"/>
+      <w:numFmt w:val="bullet"/>
+      <w:lvlText w:val=""/>
+      <w:lvlJc w:val="left"/>
+      <w:pPr>
+        <w:tabs>
+          <w:tab w:val="num" w:pos="5760"/>
+        </w:tabs>
+        <w:ind w:left="5760" w:hanging="360"/>
+      </w:pPr>
+      <w:rPr>
+        <w:rFonts w:ascii="Wingdings" w:hAnsi="Wingdings" w:hint="default"/>
+        <w:sz w:val="20"/>
+      </w:rPr>
+    </w:lvl>
+    <w:lvl w:ilvl="8" w:tentative="1">
+      <w:start w:val="1"/>
+      <w:numFmt w:val="bullet"/>
+      <w:lvlText w:val=""/>
+      <w:lvlJc w:val="left"/>
+      <w:pPr>
+        <w:tabs>
+          <w:tab w:val="num" w:pos="6480"/>
+        </w:tabs>
+        <w:ind w:left="6480" w:hanging="360"/>
+      </w:pPr>
+      <w:rPr>
+        <w:rFonts w:ascii="Wingdings" w:hAnsi="Wingdings" w:hint="default"/>
+        <w:sz w:val="20"/>
+      </w:rPr>
+    </w:lvl>
+  </w:abstractNum>
+  <w:abstractNum w:abstractNumId="4" w15:restartNumberingAfterBreak="0">
     <w:nsid w:val="4E280CE5"/>
     <w:multiLevelType w:val="hybridMultilevel"/>
     <w:tmpl w:val="C5944EFA"/>
@@ -6853,7 +7541,7 @@
       </w:rPr>
     </w:lvl>
   </w:abstractNum>
-  <w:abstractNum w:abstractNumId="4" w15:restartNumberingAfterBreak="0">
+  <w:abstractNum w:abstractNumId="5" w15:restartNumberingAfterBreak="0">
     <w:nsid w:val="52B2306A"/>
     <w:multiLevelType w:val="multilevel"/>
     <w:tmpl w:val="28BC2570"/>
@@ -6970,7 +7658,7 @@
       </w:pPr>
     </w:lvl>
   </w:abstractNum>
-  <w:abstractNum w:abstractNumId="5" w15:restartNumberingAfterBreak="0">
+  <w:abstractNum w:abstractNumId="6" w15:restartNumberingAfterBreak="0">
     <w:nsid w:val="59AC64DE"/>
     <w:multiLevelType w:val="hybridMultilevel"/>
     <w:tmpl w:val="D556FF78"/>
@@ -7083,7 +7771,7 @@
       </w:rPr>
     </w:lvl>
   </w:abstractNum>
-  <w:abstractNum w:abstractNumId="6" w15:restartNumberingAfterBreak="0">
+  <w:abstractNum w:abstractNumId="7" w15:restartNumberingAfterBreak="0">
     <w:nsid w:val="5ECA440E"/>
     <w:multiLevelType w:val="multilevel"/>
     <w:tmpl w:val="39086EF2"/>
@@ -7232,7 +7920,7 @@
       </w:rPr>
     </w:lvl>
   </w:abstractNum>
-  <w:abstractNum w:abstractNumId="7" w15:restartNumberingAfterBreak="0">
+  <w:abstractNum w:abstractNumId="8" w15:restartNumberingAfterBreak="0">
     <w:nsid w:val="6BA85B18"/>
     <w:multiLevelType w:val="multilevel"/>
     <w:tmpl w:val="C93CBC46"/>
@@ -7381,7 +8069,7 @@
       </w:rPr>
     </w:lvl>
   </w:abstractNum>
-  <w:abstractNum w:abstractNumId="8" w15:restartNumberingAfterBreak="0">
+  <w:abstractNum w:abstractNumId="9" w15:restartNumberingAfterBreak="0">
     <w:nsid w:val="725901CB"/>
     <w:multiLevelType w:val="multilevel"/>
     <w:tmpl w:val="E8F6E3B2"/>
@@ -7530,7 +8218,7 @@
       </w:rPr>
     </w:lvl>
   </w:abstractNum>
-  <w:abstractNum w:abstractNumId="9" w15:restartNumberingAfterBreak="0">
+  <w:abstractNum w:abstractNumId="10" w15:restartNumberingAfterBreak="0">
     <w:nsid w:val="7AA0268F"/>
     <w:multiLevelType w:val="multilevel"/>
     <w:tmpl w:val="E2486BC0"/>
@@ -7679,7 +8367,7 @@
       </w:rPr>
     </w:lvl>
   </w:abstractNum>
-  <w:abstractNum w:abstractNumId="10" w15:restartNumberingAfterBreak="0">
+  <w:abstractNum w:abstractNumId="11" w15:restartNumberingAfterBreak="0">
     <w:nsid w:val="7B92578F"/>
     <w:multiLevelType w:val="hybridMultilevel"/>
     <w:tmpl w:val="B804E9B8"/>
@@ -7792,7 +8480,7 @@
       </w:rPr>
     </w:lvl>
   </w:abstractNum>
-  <w:abstractNum w:abstractNumId="11" w15:restartNumberingAfterBreak="0">
+  <w:abstractNum w:abstractNumId="12" w15:restartNumberingAfterBreak="0">
     <w:nsid w:val="7BE726BE"/>
     <w:multiLevelType w:val="multilevel"/>
     <w:tmpl w:val="14AE9B48"/>
@@ -7941,7 +8629,7 @@
       </w:rPr>
     </w:lvl>
   </w:abstractNum>
-  <w:abstractNum w:abstractNumId="12" w15:restartNumberingAfterBreak="0">
+  <w:abstractNum w:abstractNumId="13" w15:restartNumberingAfterBreak="0">
     <w:nsid w:val="7DD5389E"/>
     <w:multiLevelType w:val="hybridMultilevel"/>
     <w:tmpl w:val="6840CD52"/>
@@ -8055,25 +8743,25 @@
     </w:lvl>
   </w:abstractNum>
   <w:num w:numId="1" w16cid:durableId="775180286">
-    <w:abstractNumId w:val="10"/>
+    <w:abstractNumId w:val="11"/>
   </w:num>
   <w:num w:numId="2" w16cid:durableId="1579442916">
-    <w:abstractNumId w:val="12"/>
+    <w:abstractNumId w:val="13"/>
   </w:num>
   <w:num w:numId="3" w16cid:durableId="1996445871">
     <w:abstractNumId w:val="0"/>
   </w:num>
   <w:num w:numId="4" w16cid:durableId="982202006">
-    <w:abstractNumId w:val="5"/>
+    <w:abstractNumId w:val="6"/>
   </w:num>
   <w:num w:numId="5" w16cid:durableId="2119370406">
-    <w:abstractNumId w:val="3"/>
+    <w:abstractNumId w:val="4"/>
   </w:num>
   <w:num w:numId="6" w16cid:durableId="1063062556">
-    <w:abstractNumId w:val="7"/>
+    <w:abstractNumId w:val="8"/>
   </w:num>
   <w:num w:numId="7" w16cid:durableId="1353610240">
-    <w:abstractNumId w:val="4"/>
+    <w:abstractNumId w:val="5"/>
   </w:num>
   <w:num w:numId="8" w16cid:durableId="905185883">
     <w:abstractNumId w:val="1"/>
@@ -8082,16 +8770,19 @@
     <w:abstractNumId w:val="2"/>
   </w:num>
   <w:num w:numId="10" w16cid:durableId="1140342277">
-    <w:abstractNumId w:val="11"/>
+    <w:abstractNumId w:val="12"/>
   </w:num>
   <w:num w:numId="11" w16cid:durableId="279798585">
+    <w:abstractNumId w:val="10"/>
+  </w:num>
+  <w:num w:numId="12" w16cid:durableId="1854026150">
+    <w:abstractNumId w:val="7"/>
+  </w:num>
+  <w:num w:numId="13" w16cid:durableId="1603954273">
     <w:abstractNumId w:val="9"/>
   </w:num>
-  <w:num w:numId="12" w16cid:durableId="1854026150">
-    <w:abstractNumId w:val="6"/>
-  </w:num>
-  <w:num w:numId="13" w16cid:durableId="1603954273">
-    <w:abstractNumId w:val="8"/>
+  <w:num w:numId="14" w16cid:durableId="775751699">
+    <w:abstractNumId w:val="3"/>
   </w:num>
 </w:numbering>
 </file>

</xml_diff>

<commit_message>
Update koding  wisata.ts. pada File : wisata-CPMApp\user\app\lib\admin\utils\wisata.ts
</commit_message>
<xml_diff>
--- a/Dokumentasi/24382001P_Lorensius Firngadi_Dokumentasi Sesi 3.docx
+++ b/Dokumentasi/24382001P_Lorensius Firngadi_Dokumentasi Sesi 3.docx
@@ -6325,6 +6325,25 @@
         <w:lastRenderedPageBreak/>
         <w:t xml:space="preserve">12. </w:t>
       </w:r>
+      <w:r>
+        <w:t xml:space="preserve">Update </w:t>
+      </w:r>
+      <w:proofErr w:type="spellStart"/>
+      <w:r>
+        <w:t>koding</w:t>
+      </w:r>
+      <w:proofErr w:type="spellEnd"/>
+      <w:r>
+        <w:t xml:space="preserve"> file </w:t>
+      </w:r>
+      <w:proofErr w:type="spellStart"/>
+      <w:r>
+        <w:t>wisata.ts</w:t>
+      </w:r>
+      <w:proofErr w:type="spellEnd"/>
+      <w:r>
+        <w:t>.</w:t>
+      </w:r>
     </w:p>
     <w:p>
       <w:pPr>
@@ -6335,6 +6354,30 @@
         <w:t>File :</w:t>
       </w:r>
       <w:proofErr w:type="gramEnd"/>
+      <w:r>
+        <w:t xml:space="preserve"> </w:t>
+      </w:r>
+      <w:proofErr w:type="spellStart"/>
+      <w:r>
+        <w:t>wisata-CPMApp</w:t>
+      </w:r>
+      <w:proofErr w:type="spellEnd"/>
+      <w:r>
+        <w:t>\user\app\lib\</w:t>
+      </w:r>
+      <w:proofErr w:type="spellStart"/>
+      <w:r>
+        <w:t>wisata</w:t>
+      </w:r>
+      <w:proofErr w:type="spellEnd"/>
+      <w:r>
+        <w:t>\utils\</w:t>
+      </w:r>
+      <w:proofErr w:type="spellStart"/>
+      <w:r>
+        <w:t>wisata.ts</w:t>
+      </w:r>
+      <w:proofErr w:type="spellEnd"/>
     </w:p>
     <w:p>
       <w:pPr>
@@ -6856,6 +6899,322 @@
         <w:spacing w:line="240" w:lineRule="auto"/>
       </w:pPr>
     </w:p>
+    <w:p>
+      <w:pPr>
+        <w:spacing w:line="240" w:lineRule="auto"/>
+      </w:pPr>
+    </w:p>
+    <w:p>
+      <w:pPr>
+        <w:spacing w:line="240" w:lineRule="auto"/>
+      </w:pPr>
+    </w:p>
+    <w:p>
+      <w:pPr>
+        <w:spacing w:line="240" w:lineRule="auto"/>
+      </w:pPr>
+    </w:p>
+    <w:p>
+      <w:pPr>
+        <w:spacing w:line="240" w:lineRule="auto"/>
+      </w:pPr>
+    </w:p>
+    <w:p>
+      <w:pPr>
+        <w:spacing w:line="240" w:lineRule="auto"/>
+      </w:pPr>
+    </w:p>
+    <w:p>
+      <w:pPr>
+        <w:spacing w:line="240" w:lineRule="auto"/>
+      </w:pPr>
+    </w:p>
+    <w:p>
+      <w:pPr>
+        <w:spacing w:line="240" w:lineRule="auto"/>
+      </w:pPr>
+      <w:r>
+        <w:lastRenderedPageBreak/>
+        <w:t xml:space="preserve">13. Update </w:t>
+      </w:r>
+      <w:proofErr w:type="spellStart"/>
+      <w:r>
+        <w:t>koding</w:t>
+      </w:r>
+      <w:proofErr w:type="spellEnd"/>
+      <w:r>
+        <w:t xml:space="preserve"> file</w:t>
+      </w:r>
+      <w:r>
+        <w:t xml:space="preserve"> </w:t>
+      </w:r>
+      <w:proofErr w:type="spellStart"/>
+      <w:r>
+        <w:t>wisata.ts</w:t>
+      </w:r>
+      <w:proofErr w:type="spellEnd"/>
+      <w:r>
+        <w:t>.</w:t>
+      </w:r>
+    </w:p>
+    <w:p>
+      <w:pPr>
+        <w:spacing w:line="240" w:lineRule="auto"/>
+      </w:pPr>
+      <w:proofErr w:type="gramStart"/>
+      <w:r>
+        <w:t>File :</w:t>
+      </w:r>
+      <w:proofErr w:type="gramEnd"/>
+      <w:r>
+        <w:t xml:space="preserve"> </w:t>
+      </w:r>
+      <w:proofErr w:type="spellStart"/>
+      <w:r>
+        <w:t>wisata-CPMApp</w:t>
+      </w:r>
+      <w:proofErr w:type="spellEnd"/>
+      <w:r>
+        <w:t>\user\app\lib\admin\utils\</w:t>
+      </w:r>
+      <w:proofErr w:type="spellStart"/>
+      <w:r>
+        <w:t>wisata.ts</w:t>
+      </w:r>
+      <w:proofErr w:type="spellEnd"/>
+    </w:p>
+    <w:p>
+      <w:pPr>
+        <w:spacing w:line="240" w:lineRule="auto"/>
+      </w:pPr>
+      <w:r>
+        <w:rPr>
+          <w:noProof/>
+        </w:rPr>
+        <w:drawing>
+          <wp:inline distT="0" distB="0" distL="0" distR="0" wp14:anchorId="23AC06A6" wp14:editId="27C1E099">
+            <wp:extent cx="5731510" cy="3222625"/>
+            <wp:effectExtent l="0" t="0" r="2540" b="0"/>
+            <wp:docPr id="1022258213" name="Picture 1"/>
+            <wp:cNvGraphicFramePr>
+              <a:graphicFrameLocks xmlns:a="http://schemas.openxmlformats.org/drawingml/2006/main" noChangeAspect="1"/>
+            </wp:cNvGraphicFramePr>
+            <a:graphic xmlns:a="http://schemas.openxmlformats.org/drawingml/2006/main">
+              <a:graphicData uri="http://schemas.openxmlformats.org/drawingml/2006/picture">
+                <pic:pic xmlns:pic="http://schemas.openxmlformats.org/drawingml/2006/picture">
+                  <pic:nvPicPr>
+                    <pic:cNvPr id="1022258213" name=""/>
+                    <pic:cNvPicPr/>
+                  </pic:nvPicPr>
+                  <pic:blipFill>
+                    <a:blip r:embed="rId18"/>
+                    <a:stretch>
+                      <a:fillRect/>
+                    </a:stretch>
+                  </pic:blipFill>
+                  <pic:spPr>
+                    <a:xfrm>
+                      <a:off x="0" y="0"/>
+                      <a:ext cx="5731510" cy="3222625"/>
+                    </a:xfrm>
+                    <a:prstGeom prst="rect">
+                      <a:avLst/>
+                    </a:prstGeom>
+                  </pic:spPr>
+                </pic:pic>
+              </a:graphicData>
+            </a:graphic>
+          </wp:inline>
+        </w:drawing>
+      </w:r>
+    </w:p>
+    <w:p>
+      <w:pPr>
+        <w:numPr>
+          <w:ilvl w:val="0"/>
+          <w:numId w:val="15"/>
+        </w:numPr>
+        <w:spacing w:line="240" w:lineRule="auto"/>
+      </w:pPr>
+      <w:proofErr w:type="spellStart"/>
+      <w:r>
+        <w:t>Sebelumnya</w:t>
+      </w:r>
+      <w:proofErr w:type="spellEnd"/>
+      <w:r>
+        <w:t xml:space="preserve"> (Pakai BASE_URL manual): </w:t>
+      </w:r>
+      <w:r>
+        <w:t>H</w:t>
+      </w:r>
+      <w:r>
+        <w:t xml:space="preserve">arus </w:t>
+      </w:r>
+      <w:proofErr w:type="spellStart"/>
+      <w:r>
+        <w:t>menulis</w:t>
+      </w:r>
+      <w:proofErr w:type="spellEnd"/>
+      <w:r>
+        <w:t xml:space="preserve"> </w:t>
+      </w:r>
+      <w:proofErr w:type="spellStart"/>
+      <w:r>
+        <w:t>alamat</w:t>
+      </w:r>
+      <w:proofErr w:type="spellEnd"/>
+      <w:r>
+        <w:t xml:space="preserve"> </w:t>
+      </w:r>
+      <w:proofErr w:type="spellStart"/>
+      <w:r>
+        <w:t>lengkap</w:t>
+      </w:r>
+      <w:proofErr w:type="spellEnd"/>
+      <w:r>
+        <w:t>.</w:t>
+      </w:r>
+    </w:p>
+    <w:p>
+      <w:pPr>
+        <w:numPr>
+          <w:ilvl w:val="0"/>
+          <w:numId w:val="15"/>
+        </w:numPr>
+        <w:spacing w:line="240" w:lineRule="auto"/>
+        <w:jc w:val="both"/>
+      </w:pPr>
+      <w:proofErr w:type="spellStart"/>
+      <w:r>
+        <w:t>Fungsi</w:t>
+      </w:r>
+      <w:proofErr w:type="spellEnd"/>
+      <w:r>
+        <w:t> </w:t>
+      </w:r>
+      <w:proofErr w:type="spellStart"/>
+      <w:r>
+        <w:t>apiUrl</w:t>
+      </w:r>
+      <w:proofErr w:type="spellEnd"/>
+      <w:r>
+        <w:t xml:space="preserve"> di sana </w:t>
+      </w:r>
+      <w:proofErr w:type="spellStart"/>
+      <w:r>
+        <w:t>memastikan</w:t>
+      </w:r>
+      <w:proofErr w:type="spellEnd"/>
+      <w:r>
+        <w:t xml:space="preserve"> </w:t>
+      </w:r>
+      <w:proofErr w:type="spellStart"/>
+      <w:r>
+        <w:t>perintah</w:t>
+      </w:r>
+      <w:proofErr w:type="spellEnd"/>
+      <w:r>
+        <w:t> Ambil Data (Get), Hapus Data (Delete), dan Ganti Status (Patch) </w:t>
+      </w:r>
+      <w:proofErr w:type="spellStart"/>
+      <w:r>
+        <w:t>dikirim</w:t>
+      </w:r>
+      <w:proofErr w:type="spellEnd"/>
+      <w:r>
+        <w:t xml:space="preserve"> </w:t>
+      </w:r>
+      <w:proofErr w:type="spellStart"/>
+      <w:r>
+        <w:t>ke</w:t>
+      </w:r>
+      <w:proofErr w:type="spellEnd"/>
+      <w:r>
+        <w:t xml:space="preserve"> </w:t>
+      </w:r>
+      <w:proofErr w:type="spellStart"/>
+      <w:r>
+        <w:t>alamat</w:t>
+      </w:r>
+      <w:proofErr w:type="spellEnd"/>
+      <w:r>
+        <w:t xml:space="preserve"> server yang </w:t>
+      </w:r>
+      <w:proofErr w:type="spellStart"/>
+      <w:r>
+        <w:t>tepat</w:t>
+      </w:r>
+      <w:proofErr w:type="spellEnd"/>
+      <w:r>
+        <w:t xml:space="preserve">, </w:t>
+      </w:r>
+      <w:proofErr w:type="spellStart"/>
+      <w:r>
+        <w:t>sesuai</w:t>
+      </w:r>
+      <w:proofErr w:type="spellEnd"/>
+      <w:r>
+        <w:t xml:space="preserve"> </w:t>
+      </w:r>
+      <w:proofErr w:type="spellStart"/>
+      <w:r>
+        <w:t>dengan</w:t>
+      </w:r>
+      <w:proofErr w:type="spellEnd"/>
+      <w:r>
+        <w:t xml:space="preserve"> di mana </w:t>
+      </w:r>
+      <w:proofErr w:type="spellStart"/>
+      <w:r>
+        <w:t>aplikasi</w:t>
+      </w:r>
+      <w:proofErr w:type="spellEnd"/>
+      <w:r>
+        <w:t xml:space="preserve"> </w:t>
+      </w:r>
+      <w:proofErr w:type="spellStart"/>
+      <w:r>
+        <w:t>itu</w:t>
+      </w:r>
+      <w:proofErr w:type="spellEnd"/>
+      <w:r>
+        <w:t xml:space="preserve"> </w:t>
+      </w:r>
+      <w:proofErr w:type="spellStart"/>
+      <w:r>
+        <w:t>dijalankan</w:t>
+      </w:r>
+      <w:proofErr w:type="spellEnd"/>
+      <w:r>
+        <w:t xml:space="preserve"> (HP Android </w:t>
+      </w:r>
+      <w:proofErr w:type="spellStart"/>
+      <w:r>
+        <w:t>atau</w:t>
+      </w:r>
+      <w:proofErr w:type="spellEnd"/>
+      <w:r>
+        <w:t xml:space="preserve"> Laptop).</w:t>
+      </w:r>
+    </w:p>
+    <w:p>
+      <w:pPr>
+        <w:spacing w:line="240" w:lineRule="auto"/>
+      </w:pPr>
+    </w:p>
+    <w:p>
+      <w:pPr>
+        <w:spacing w:line="240" w:lineRule="auto"/>
+      </w:pPr>
+      <w:r>
+        <w:t xml:space="preserve">14. </w:t>
+      </w:r>
+    </w:p>
+    <w:p>
+      <w:pPr>
+        <w:spacing w:line="240" w:lineRule="auto"/>
+      </w:pPr>
+    </w:p>
     <w:sectPr>
       <w:pgSz w:w="11906" w:h="16838"/>
       <w:pgMar w:top="1440" w:right="1440" w:bottom="1440" w:left="1440" w:header="708" w:footer="708" w:gutter="0"/>
@@ -7921,6 +8280,155 @@
     </w:lvl>
   </w:abstractNum>
   <w:abstractNum w:abstractNumId="8" w15:restartNumberingAfterBreak="0">
+    <w:nsid w:val="6AF63B54"/>
+    <w:multiLevelType w:val="multilevel"/>
+    <w:tmpl w:val="AD621050"/>
+    <w:lvl w:ilvl="0">
+      <w:start w:val="1"/>
+      <w:numFmt w:val="bullet"/>
+      <w:lvlText w:val=""/>
+      <w:lvlJc w:val="left"/>
+      <w:pPr>
+        <w:tabs>
+          <w:tab w:val="num" w:pos="720"/>
+        </w:tabs>
+        <w:ind w:left="720" w:hanging="360"/>
+      </w:pPr>
+      <w:rPr>
+        <w:rFonts w:ascii="Symbol" w:hAnsi="Symbol" w:hint="default"/>
+        <w:sz w:val="20"/>
+      </w:rPr>
+    </w:lvl>
+    <w:lvl w:ilvl="1" w:tentative="1">
+      <w:start w:val="1"/>
+      <w:numFmt w:val="bullet"/>
+      <w:lvlText w:val="o"/>
+      <w:lvlJc w:val="left"/>
+      <w:pPr>
+        <w:tabs>
+          <w:tab w:val="num" w:pos="1440"/>
+        </w:tabs>
+        <w:ind w:left="1440" w:hanging="360"/>
+      </w:pPr>
+      <w:rPr>
+        <w:rFonts w:ascii="Courier New" w:hAnsi="Courier New" w:hint="default"/>
+        <w:sz w:val="20"/>
+      </w:rPr>
+    </w:lvl>
+    <w:lvl w:ilvl="2" w:tentative="1">
+      <w:start w:val="1"/>
+      <w:numFmt w:val="bullet"/>
+      <w:lvlText w:val=""/>
+      <w:lvlJc w:val="left"/>
+      <w:pPr>
+        <w:tabs>
+          <w:tab w:val="num" w:pos="2160"/>
+        </w:tabs>
+        <w:ind w:left="2160" w:hanging="360"/>
+      </w:pPr>
+      <w:rPr>
+        <w:rFonts w:ascii="Wingdings" w:hAnsi="Wingdings" w:hint="default"/>
+        <w:sz w:val="20"/>
+      </w:rPr>
+    </w:lvl>
+    <w:lvl w:ilvl="3" w:tentative="1">
+      <w:start w:val="1"/>
+      <w:numFmt w:val="bullet"/>
+      <w:lvlText w:val=""/>
+      <w:lvlJc w:val="left"/>
+      <w:pPr>
+        <w:tabs>
+          <w:tab w:val="num" w:pos="2880"/>
+        </w:tabs>
+        <w:ind w:left="2880" w:hanging="360"/>
+      </w:pPr>
+      <w:rPr>
+        <w:rFonts w:ascii="Wingdings" w:hAnsi="Wingdings" w:hint="default"/>
+        <w:sz w:val="20"/>
+      </w:rPr>
+    </w:lvl>
+    <w:lvl w:ilvl="4" w:tentative="1">
+      <w:start w:val="1"/>
+      <w:numFmt w:val="bullet"/>
+      <w:lvlText w:val=""/>
+      <w:lvlJc w:val="left"/>
+      <w:pPr>
+        <w:tabs>
+          <w:tab w:val="num" w:pos="3600"/>
+        </w:tabs>
+        <w:ind w:left="3600" w:hanging="360"/>
+      </w:pPr>
+      <w:rPr>
+        <w:rFonts w:ascii="Wingdings" w:hAnsi="Wingdings" w:hint="default"/>
+        <w:sz w:val="20"/>
+      </w:rPr>
+    </w:lvl>
+    <w:lvl w:ilvl="5" w:tentative="1">
+      <w:start w:val="1"/>
+      <w:numFmt w:val="bullet"/>
+      <w:lvlText w:val=""/>
+      <w:lvlJc w:val="left"/>
+      <w:pPr>
+        <w:tabs>
+          <w:tab w:val="num" w:pos="4320"/>
+        </w:tabs>
+        <w:ind w:left="4320" w:hanging="360"/>
+      </w:pPr>
+      <w:rPr>
+        <w:rFonts w:ascii="Wingdings" w:hAnsi="Wingdings" w:hint="default"/>
+        <w:sz w:val="20"/>
+      </w:rPr>
+    </w:lvl>
+    <w:lvl w:ilvl="6" w:tentative="1">
+      <w:start w:val="1"/>
+      <w:numFmt w:val="bullet"/>
+      <w:lvlText w:val=""/>
+      <w:lvlJc w:val="left"/>
+      <w:pPr>
+        <w:tabs>
+          <w:tab w:val="num" w:pos="5040"/>
+        </w:tabs>
+        <w:ind w:left="5040" w:hanging="360"/>
+      </w:pPr>
+      <w:rPr>
+        <w:rFonts w:ascii="Wingdings" w:hAnsi="Wingdings" w:hint="default"/>
+        <w:sz w:val="20"/>
+      </w:rPr>
+    </w:lvl>
+    <w:lvl w:ilvl="7" w:tentative="1">
+      <w:start w:val="1"/>
+      <w:numFmt w:val="bullet"/>
+      <w:lvlText w:val=""/>
+      <w:lvlJc w:val="left"/>
+      <w:pPr>
+        <w:tabs>
+          <w:tab w:val="num" w:pos="5760"/>
+        </w:tabs>
+        <w:ind w:left="5760" w:hanging="360"/>
+      </w:pPr>
+      <w:rPr>
+        <w:rFonts w:ascii="Wingdings" w:hAnsi="Wingdings" w:hint="default"/>
+        <w:sz w:val="20"/>
+      </w:rPr>
+    </w:lvl>
+    <w:lvl w:ilvl="8" w:tentative="1">
+      <w:start w:val="1"/>
+      <w:numFmt w:val="bullet"/>
+      <w:lvlText w:val=""/>
+      <w:lvlJc w:val="left"/>
+      <w:pPr>
+        <w:tabs>
+          <w:tab w:val="num" w:pos="6480"/>
+        </w:tabs>
+        <w:ind w:left="6480" w:hanging="360"/>
+      </w:pPr>
+      <w:rPr>
+        <w:rFonts w:ascii="Wingdings" w:hAnsi="Wingdings" w:hint="default"/>
+        <w:sz w:val="20"/>
+      </w:rPr>
+    </w:lvl>
+  </w:abstractNum>
+  <w:abstractNum w:abstractNumId="9" w15:restartNumberingAfterBreak="0">
     <w:nsid w:val="6BA85B18"/>
     <w:multiLevelType w:val="multilevel"/>
     <w:tmpl w:val="C93CBC46"/>
@@ -8069,7 +8577,7 @@
       </w:rPr>
     </w:lvl>
   </w:abstractNum>
-  <w:abstractNum w:abstractNumId="9" w15:restartNumberingAfterBreak="0">
+  <w:abstractNum w:abstractNumId="10" w15:restartNumberingAfterBreak="0">
     <w:nsid w:val="725901CB"/>
     <w:multiLevelType w:val="multilevel"/>
     <w:tmpl w:val="E8F6E3B2"/>
@@ -8218,7 +8726,7 @@
       </w:rPr>
     </w:lvl>
   </w:abstractNum>
-  <w:abstractNum w:abstractNumId="10" w15:restartNumberingAfterBreak="0">
+  <w:abstractNum w:abstractNumId="11" w15:restartNumberingAfterBreak="0">
     <w:nsid w:val="7AA0268F"/>
     <w:multiLevelType w:val="multilevel"/>
     <w:tmpl w:val="E2486BC0"/>
@@ -8367,7 +8875,7 @@
       </w:rPr>
     </w:lvl>
   </w:abstractNum>
-  <w:abstractNum w:abstractNumId="11" w15:restartNumberingAfterBreak="0">
+  <w:abstractNum w:abstractNumId="12" w15:restartNumberingAfterBreak="0">
     <w:nsid w:val="7B92578F"/>
     <w:multiLevelType w:val="hybridMultilevel"/>
     <w:tmpl w:val="B804E9B8"/>
@@ -8480,7 +8988,7 @@
       </w:rPr>
     </w:lvl>
   </w:abstractNum>
-  <w:abstractNum w:abstractNumId="12" w15:restartNumberingAfterBreak="0">
+  <w:abstractNum w:abstractNumId="13" w15:restartNumberingAfterBreak="0">
     <w:nsid w:val="7BE726BE"/>
     <w:multiLevelType w:val="multilevel"/>
     <w:tmpl w:val="14AE9B48"/>
@@ -8629,7 +9137,7 @@
       </w:rPr>
     </w:lvl>
   </w:abstractNum>
-  <w:abstractNum w:abstractNumId="13" w15:restartNumberingAfterBreak="0">
+  <w:abstractNum w:abstractNumId="14" w15:restartNumberingAfterBreak="0">
     <w:nsid w:val="7DD5389E"/>
     <w:multiLevelType w:val="hybridMultilevel"/>
     <w:tmpl w:val="6840CD52"/>
@@ -8743,10 +9251,10 @@
     </w:lvl>
   </w:abstractNum>
   <w:num w:numId="1" w16cid:durableId="775180286">
-    <w:abstractNumId w:val="11"/>
+    <w:abstractNumId w:val="12"/>
   </w:num>
   <w:num w:numId="2" w16cid:durableId="1579442916">
-    <w:abstractNumId w:val="13"/>
+    <w:abstractNumId w:val="14"/>
   </w:num>
   <w:num w:numId="3" w16cid:durableId="1996445871">
     <w:abstractNumId w:val="0"/>
@@ -8758,7 +9266,7 @@
     <w:abstractNumId w:val="4"/>
   </w:num>
   <w:num w:numId="6" w16cid:durableId="1063062556">
-    <w:abstractNumId w:val="8"/>
+    <w:abstractNumId w:val="9"/>
   </w:num>
   <w:num w:numId="7" w16cid:durableId="1353610240">
     <w:abstractNumId w:val="5"/>
@@ -8770,19 +9278,22 @@
     <w:abstractNumId w:val="2"/>
   </w:num>
   <w:num w:numId="10" w16cid:durableId="1140342277">
-    <w:abstractNumId w:val="12"/>
+    <w:abstractNumId w:val="13"/>
   </w:num>
   <w:num w:numId="11" w16cid:durableId="279798585">
-    <w:abstractNumId w:val="10"/>
+    <w:abstractNumId w:val="11"/>
   </w:num>
   <w:num w:numId="12" w16cid:durableId="1854026150">
     <w:abstractNumId w:val="7"/>
   </w:num>
   <w:num w:numId="13" w16cid:durableId="1603954273">
-    <w:abstractNumId w:val="9"/>
+    <w:abstractNumId w:val="10"/>
   </w:num>
   <w:num w:numId="14" w16cid:durableId="775751699">
     <w:abstractNumId w:val="3"/>
+  </w:num>
+  <w:num w:numId="15" w16cid:durableId="435755312">
+    <w:abstractNumId w:val="8"/>
   </w:num>
 </w:numbering>
 </file>

</xml_diff>

<commit_message>
Update koding edit.ts pada File : wisata-CPMApp\user\app\lib\admin\utils\edit.ts
</commit_message>
<xml_diff>
--- a/Dokumentasi/24382001P_Lorensius Firngadi_Dokumentasi Sesi 3.docx
+++ b/Dokumentasi/24382001P_Lorensius Firngadi_Dokumentasi Sesi 3.docx
@@ -44,23 +44,7 @@
           <w:b/>
           <w:bCs/>
         </w:rPr>
-        <w:t xml:space="preserve">Mata </w:t>
-      </w:r>
-      <w:proofErr w:type="gramStart"/>
-      <w:r>
-        <w:rPr>
-          <w:b/>
-          <w:bCs/>
-        </w:rPr>
-        <w:t>Kuliah :</w:t>
-      </w:r>
-      <w:proofErr w:type="gramEnd"/>
-      <w:r>
-        <w:rPr>
-          <w:b/>
-          <w:bCs/>
-        </w:rPr>
-        <w:t xml:space="preserve"> </w:t>
+        <w:t xml:space="preserve">Mata Kuliah : </w:t>
       </w:r>
       <w:proofErr w:type="spellStart"/>
       <w:r>
@@ -110,14 +94,9 @@
       <w:r>
         <w:t>Nama</w:t>
       </w:r>
-      <w:proofErr w:type="gramStart"/>
       <w:r>
         <w:tab/>
-        <w:t xml:space="preserve"> :</w:t>
-      </w:r>
-      <w:proofErr w:type="gramEnd"/>
-      <w:r>
-        <w:t xml:space="preserve"> </w:t>
+        <w:t xml:space="preserve"> : </w:t>
       </w:r>
       <w:proofErr w:type="spellStart"/>
       <w:r>
@@ -137,14 +116,9 @@
       <w:r>
         <w:t>NPM</w:t>
       </w:r>
-      <w:proofErr w:type="gramStart"/>
       <w:r>
         <w:tab/>
-        <w:t xml:space="preserve"> :</w:t>
-      </w:r>
-      <w:proofErr w:type="gramEnd"/>
-      <w:r>
-        <w:t xml:space="preserve"> 24382001P</w:t>
+        <w:t xml:space="preserve"> : 24382001P</w:t>
       </w:r>
     </w:p>
     <w:p>
@@ -158,14 +132,9 @@
         <w:t>Kelas</w:t>
       </w:r>
       <w:proofErr w:type="spellEnd"/>
-      <w:proofErr w:type="gramStart"/>
       <w:r>
         <w:tab/>
-        <w:t xml:space="preserve"> :</w:t>
-      </w:r>
-      <w:proofErr w:type="gramEnd"/>
-      <w:r>
-        <w:t xml:space="preserve"> IF 23 E</w:t>
+        <w:t xml:space="preserve"> : IF 23 E</w:t>
       </w:r>
     </w:p>
     <w:p>
@@ -182,17 +151,12 @@
         <w:jc w:val="both"/>
       </w:pPr>
       <w:proofErr w:type="spellStart"/>
-      <w:proofErr w:type="gramStart"/>
       <w:r>
         <w:t>Kelompok</w:t>
       </w:r>
       <w:proofErr w:type="spellEnd"/>
       <w:r>
-        <w:t xml:space="preserve"> :</w:t>
-      </w:r>
-      <w:proofErr w:type="gramEnd"/>
-      <w:r>
-        <w:t xml:space="preserve"> Ferdi, </w:t>
+        <w:t xml:space="preserve"> : Ferdi, </w:t>
       </w:r>
       <w:proofErr w:type="spellStart"/>
       <w:r>
@@ -211,7 +175,6 @@
         <w:t xml:space="preserve"> </w:t>
       </w:r>
       <w:proofErr w:type="spellStart"/>
-      <w:proofErr w:type="gramStart"/>
       <w:r>
         <w:t>dulu</w:t>
       </w:r>
@@ -219,7 +182,6 @@
       <w:r>
         <w:t xml:space="preserve"> !</w:t>
       </w:r>
-      <w:proofErr w:type="gramEnd"/>
     </w:p>
     <w:p>
       <w:pPr>
@@ -243,7 +205,6 @@
         <w:t xml:space="preserve"> </w:t>
       </w:r>
       <w:proofErr w:type="spellStart"/>
-      <w:proofErr w:type="gramStart"/>
       <w:r>
         <w:t>Kelompok</w:t>
       </w:r>
@@ -251,7 +212,6 @@
       <w:r>
         <w:t xml:space="preserve"> :</w:t>
       </w:r>
-      <w:proofErr w:type="gramEnd"/>
     </w:p>
     <w:p>
       <w:pPr>
@@ -353,15 +313,7 @@
       </w:r>
       <w:proofErr w:type="spellEnd"/>
       <w:r>
-        <w:t xml:space="preserve"> </w:t>
-      </w:r>
-      <w:proofErr w:type="gramStart"/>
-      <w:r>
-        <w:t>Project :</w:t>
-      </w:r>
-      <w:proofErr w:type="gramEnd"/>
-      <w:r>
-        <w:t xml:space="preserve"> </w:t>
+        <w:t xml:space="preserve"> Project : </w:t>
       </w:r>
       <w:proofErr w:type="spellStart"/>
       <w:r>
@@ -388,13 +340,8 @@
       </w:r>
       <w:proofErr w:type="spellEnd"/>
       <w:r>
-        <w:t xml:space="preserve"> </w:t>
-      </w:r>
-      <w:proofErr w:type="gramStart"/>
-      <w:r>
-        <w:t>Project :</w:t>
-      </w:r>
-      <w:proofErr w:type="gramEnd"/>
+        <w:t xml:space="preserve"> Project :</w:t>
+      </w:r>
     </w:p>
     <w:p>
       <w:pPr>
@@ -613,15 +560,7 @@
         <w:t xml:space="preserve">1. </w:t>
       </w:r>
       <w:r>
-        <w:t xml:space="preserve">Membuat </w:t>
-      </w:r>
-      <w:proofErr w:type="gramStart"/>
-      <w:r>
-        <w:t>file :</w:t>
-      </w:r>
-      <w:proofErr w:type="gramEnd"/>
-      <w:r>
-        <w:t xml:space="preserve"> .</w:t>
+        <w:t>Membuat file : .</w:t>
       </w:r>
       <w:proofErr w:type="spellStart"/>
       <w:r>
@@ -759,15 +698,7 @@
       </w:r>
       <w:proofErr w:type="spellEnd"/>
       <w:r>
-        <w:t xml:space="preserve"> di push </w:t>
-      </w:r>
-      <w:proofErr w:type="gramStart"/>
-      <w:r>
-        <w:t>dan .env</w:t>
-      </w:r>
-      <w:proofErr w:type="gramEnd"/>
-      <w:r>
-        <w:t xml:space="preserve"> yang </w:t>
+        <w:t xml:space="preserve"> di push dan .env yang </w:t>
       </w:r>
       <w:proofErr w:type="spellStart"/>
       <w:r>
@@ -811,14 +742,9 @@
         </w:numPr>
         <w:spacing w:line="240" w:lineRule="auto"/>
       </w:pPr>
-      <w:proofErr w:type="gramStart"/>
       <w:r>
         <w:lastRenderedPageBreak/>
-        <w:t>.env</w:t>
-      </w:r>
-      <w:proofErr w:type="gramEnd"/>
-      <w:r>
-        <w:t xml:space="preserve"> : file </w:t>
+        <w:t xml:space="preserve">.env : file </w:t>
       </w:r>
       <w:proofErr w:type="spellStart"/>
       <w:r>
@@ -846,29 +772,16 @@
         </w:numPr>
         <w:spacing w:line="240" w:lineRule="auto"/>
       </w:pPr>
-      <w:proofErr w:type="gramStart"/>
       <w:r>
         <w:t>.</w:t>
       </w:r>
       <w:proofErr w:type="spellStart"/>
       <w:r>
-        <w:t>env</w:t>
-      </w:r>
-      <w:proofErr w:type="gramEnd"/>
-      <w:r>
-        <w:t>.</w:t>
-      </w:r>
-      <w:proofErr w:type="gramStart"/>
-      <w:r>
-        <w:t>example</w:t>
-      </w:r>
-      <w:proofErr w:type="spellEnd"/>
-      <w:r>
-        <w:t xml:space="preserve"> :</w:t>
-      </w:r>
-      <w:proofErr w:type="gramEnd"/>
-      <w:r>
-        <w:t xml:space="preserve"> template (di-push)</w:t>
+        <w:t>env.example</w:t>
+      </w:r>
+      <w:proofErr w:type="spellEnd"/>
+      <w:r>
+        <w:t xml:space="preserve"> : template (di-push)</w:t>
       </w:r>
     </w:p>
     <w:p>
@@ -926,12 +839,10 @@
         <w:t xml:space="preserve"> file pada </w:t>
       </w:r>
       <w:proofErr w:type="spellStart"/>
-      <w:proofErr w:type="gramStart"/>
       <w:r>
         <w:t>message.utils</w:t>
       </w:r>
       <w:proofErr w:type="spellEnd"/>
-      <w:proofErr w:type="gramEnd"/>
     </w:p>
     <w:p>
       <w:pPr>
@@ -1004,12 +915,10 @@
         <w:t xml:space="preserve"> file pada </w:t>
       </w:r>
       <w:proofErr w:type="spellStart"/>
-      <w:proofErr w:type="gramStart"/>
       <w:r>
         <w:t>message.utils</w:t>
       </w:r>
       <w:proofErr w:type="spellEnd"/>
-      <w:proofErr w:type="gramEnd"/>
       <w:r>
         <w:t xml:space="preserve"> </w:t>
       </w:r>
@@ -1046,13 +955,8 @@
         <w:t xml:space="preserve"> </w:t>
       </w:r>
       <w:proofErr w:type="spellStart"/>
-      <w:proofErr w:type="gramStart"/>
-      <w:r>
-        <w:t>message.utils</w:t>
-      </w:r>
-      <w:proofErr w:type="gramEnd"/>
-      <w:r>
-        <w:t>.ts</w:t>
+      <w:r>
+        <w:t>message.utils.ts</w:t>
       </w:r>
       <w:proofErr w:type="spellEnd"/>
     </w:p>
@@ -1124,12 +1028,10 @@
         <w:t xml:space="preserve">3. Update </w:t>
       </w:r>
       <w:proofErr w:type="spellStart"/>
-      <w:proofErr w:type="gramStart"/>
       <w:r>
         <w:t>tsconfig.json</w:t>
       </w:r>
       <w:proofErr w:type="spellEnd"/>
-      <w:proofErr w:type="gramEnd"/>
     </w:p>
     <w:p>
       <w:pPr>
@@ -1229,14 +1131,9 @@
       </w:r>
       <w:proofErr w:type="spellEnd"/>
       <w:r>
-        <w:t xml:space="preserve">": </w:t>
-      </w:r>
-      <w:proofErr w:type="gramStart"/>
-      <w:r>
-        <w:t>"./</w:t>
-      </w:r>
-      <w:proofErr w:type="spellStart"/>
-      <w:proofErr w:type="gramEnd"/>
+        <w:t>": "./</w:t>
+      </w:r>
+      <w:proofErr w:type="spellStart"/>
       <w:r>
         <w:t>dist</w:t>
       </w:r>
@@ -1454,13 +1351,8 @@
       <w:pPr>
         <w:spacing w:line="240" w:lineRule="auto"/>
       </w:pPr>
-      <w:proofErr w:type="gramStart"/>
-      <w:r>
-        <w:t>File :</w:t>
-      </w:r>
-      <w:proofErr w:type="gramEnd"/>
-      <w:r>
-        <w:t xml:space="preserve"> </w:t>
+      <w:r>
+        <w:t xml:space="preserve">File : </w:t>
       </w:r>
       <w:proofErr w:type="spellStart"/>
       <w:r>
@@ -1572,30 +1464,20 @@
         <w:t xml:space="preserve">] = </w:t>
       </w:r>
       <w:proofErr w:type="spellStart"/>
-      <w:proofErr w:type="gramStart"/>
       <w:r>
         <w:t>useState</w:t>
       </w:r>
       <w:proofErr w:type="spellEnd"/>
       <w:r>
-        <w:t>(</w:t>
-      </w:r>
-      <w:proofErr w:type="gramEnd"/>
-      <w:r>
-        <w:t xml:space="preserve">() =&gt; </w:t>
-      </w:r>
-      <w:proofErr w:type="spellStart"/>
-      <w:proofErr w:type="gramStart"/>
+        <w:t xml:space="preserve">(() =&gt; </w:t>
+      </w:r>
+      <w:proofErr w:type="spellStart"/>
       <w:r>
         <w:t>getRole</w:t>
       </w:r>
       <w:proofErr w:type="spellEnd"/>
       <w:r>
-        <w:t>(</w:t>
-      </w:r>
-      <w:proofErr w:type="gramEnd"/>
-      <w:r>
-        <w:t>));</w:t>
+        <w:t>());</w:t>
       </w:r>
     </w:p>
     <w:p>
@@ -2451,7 +2333,6 @@
         <w:t xml:space="preserve"> </w:t>
       </w:r>
       <w:proofErr w:type="spellStart"/>
-      <w:proofErr w:type="gramStart"/>
       <w:r>
         <w:t>konflik</w:t>
       </w:r>
@@ -2459,7 +2340,6 @@
       <w:r>
         <w:t xml:space="preserve"> :</w:t>
       </w:r>
-      <w:proofErr w:type="gramEnd"/>
     </w:p>
     <w:p>
       <w:pPr>
@@ -2615,7 +2495,6 @@
         <w:t xml:space="preserve">Solusi yang </w:t>
       </w:r>
       <w:proofErr w:type="spellStart"/>
-      <w:proofErr w:type="gramStart"/>
       <w:r>
         <w:t>dilakukan</w:t>
       </w:r>
@@ -2623,7 +2502,6 @@
       <w:r>
         <w:t xml:space="preserve"> :</w:t>
       </w:r>
-      <w:proofErr w:type="gramEnd"/>
     </w:p>
     <w:p>
       <w:pPr>
@@ -2709,13 +2587,8 @@
         <w:ind w:left="1440"/>
       </w:pPr>
       <w:r>
-        <w:t xml:space="preserve">git </w:t>
-      </w:r>
-      <w:proofErr w:type="gramStart"/>
-      <w:r>
-        <w:t>add .</w:t>
-      </w:r>
-      <w:proofErr w:type="gramEnd"/>
+        <w:t>git add .</w:t>
+      </w:r>
     </w:p>
     <w:p>
       <w:pPr>
@@ -2811,13 +2684,8 @@
       <w:pPr>
         <w:spacing w:line="240" w:lineRule="auto"/>
       </w:pPr>
-      <w:proofErr w:type="gramStart"/>
-      <w:r>
-        <w:t>File :</w:t>
-      </w:r>
-      <w:proofErr w:type="gramEnd"/>
-      <w:r>
-        <w:t xml:space="preserve"> </w:t>
+      <w:r>
+        <w:t xml:space="preserve">File : </w:t>
       </w:r>
       <w:proofErr w:type="spellStart"/>
       <w:r>
@@ -3588,13 +3456,8 @@
       <w:pPr>
         <w:spacing w:line="240" w:lineRule="auto"/>
       </w:pPr>
-      <w:proofErr w:type="gramStart"/>
-      <w:r>
-        <w:t>File :</w:t>
-      </w:r>
-      <w:proofErr w:type="gramEnd"/>
-      <w:r>
-        <w:t xml:space="preserve"> </w:t>
+      <w:r>
+        <w:t xml:space="preserve">File : </w:t>
       </w:r>
       <w:proofErr w:type="spellStart"/>
       <w:r>
@@ -4270,13 +4133,8 @@
       <w:pPr>
         <w:spacing w:line="240" w:lineRule="auto"/>
       </w:pPr>
-      <w:proofErr w:type="gramStart"/>
-      <w:r>
-        <w:t>File :</w:t>
-      </w:r>
-      <w:proofErr w:type="gramEnd"/>
-      <w:r>
-        <w:t xml:space="preserve"> </w:t>
+      <w:r>
+        <w:t xml:space="preserve">File : </w:t>
       </w:r>
       <w:proofErr w:type="spellStart"/>
       <w:r>
@@ -4632,13 +4490,8 @@
       <w:pPr>
         <w:spacing w:line="240" w:lineRule="auto"/>
       </w:pPr>
-      <w:proofErr w:type="gramStart"/>
-      <w:r>
-        <w:t>File :</w:t>
-      </w:r>
-      <w:proofErr w:type="gramEnd"/>
-      <w:r>
-        <w:t xml:space="preserve"> </w:t>
+      <w:r>
+        <w:t xml:space="preserve">File : </w:t>
       </w:r>
       <w:proofErr w:type="spellStart"/>
       <w:r>
@@ -4705,18 +4558,13 @@
         <w:contextualSpacing/>
       </w:pPr>
       <w:r>
-        <w:t xml:space="preserve">import </w:t>
-      </w:r>
-      <w:proofErr w:type="gramStart"/>
-      <w:r>
-        <w:t xml:space="preserve">{ </w:t>
+        <w:t xml:space="preserve">import { </w:t>
       </w:r>
       <w:proofErr w:type="spellStart"/>
       <w:r>
         <w:t>apiUrl</w:t>
       </w:r>
       <w:proofErr w:type="spellEnd"/>
-      <w:proofErr w:type="gramEnd"/>
       <w:r>
         <w:t xml:space="preserve"> } from @/app/lib/api;</w:t>
       </w:r>
@@ -5447,13 +5295,8 @@
       <w:pPr>
         <w:spacing w:line="240" w:lineRule="auto"/>
       </w:pPr>
-      <w:proofErr w:type="gramStart"/>
-      <w:r>
-        <w:t>File :</w:t>
-      </w:r>
-      <w:proofErr w:type="gramEnd"/>
-      <w:r>
-        <w:t xml:space="preserve"> </w:t>
+      <w:r>
+        <w:t xml:space="preserve">File : </w:t>
       </w:r>
       <w:proofErr w:type="spellStart"/>
       <w:r>
@@ -5519,18 +5362,13 @@
         <w:spacing w:line="240" w:lineRule="auto"/>
       </w:pPr>
       <w:r>
-        <w:t xml:space="preserve">import </w:t>
-      </w:r>
-      <w:proofErr w:type="gramStart"/>
-      <w:r>
-        <w:t xml:space="preserve">{ </w:t>
+        <w:t xml:space="preserve">import { </w:t>
       </w:r>
       <w:proofErr w:type="spellStart"/>
       <w:r>
         <w:t>apiUrl</w:t>
       </w:r>
       <w:proofErr w:type="spellEnd"/>
-      <w:proofErr w:type="gramEnd"/>
       <w:r>
         <w:t xml:space="preserve"> } from @/app/lib/api;</w:t>
       </w:r>
@@ -6151,21 +5989,13 @@
       </w:r>
       <w:proofErr w:type="spellEnd"/>
       <w:r>
-        <w:t>(\/review/${id</w:t>
-      </w:r>
-      <w:proofErr w:type="gramStart"/>
-      <w:r>
-        <w:t>}</w:t>
-      </w:r>
-      <w:r>
-        <w:t xml:space="preserve"> </w:t>
-      </w:r>
-      <w:r>
-        <w:t>:</w:t>
-      </w:r>
-      <w:proofErr w:type="gramEnd"/>
-      <w:r>
-        <w:t xml:space="preserve"> </w:t>
+        <w:t>(\/review/${id}</w:t>
+      </w:r>
+      <w:r>
+        <w:t xml:space="preserve"> </w:t>
+      </w:r>
+      <w:r>
+        <w:t xml:space="preserve">: </w:t>
       </w:r>
       <w:r>
         <w:t>M</w:t>
@@ -6247,21 +6077,13 @@
         <w:spacing w:line="240" w:lineRule="auto"/>
       </w:pPr>
       <w:r>
-        <w:t xml:space="preserve">method: </w:t>
-      </w:r>
-      <w:proofErr w:type="gramStart"/>
-      <w:r>
-        <w:t>DELETE</w:t>
-      </w:r>
-      <w:r>
-        <w:t xml:space="preserve"> </w:t>
-      </w:r>
-      <w:r>
-        <w:t>:</w:t>
-      </w:r>
-      <w:proofErr w:type="gramEnd"/>
-      <w:r>
-        <w:t xml:space="preserve"> </w:t>
+        <w:t>method: DELETE</w:t>
+      </w:r>
+      <w:r>
+        <w:t xml:space="preserve"> </w:t>
+      </w:r>
+      <w:r>
+        <w:t xml:space="preserve">: </w:t>
       </w:r>
       <w:proofErr w:type="spellStart"/>
       <w:r>
@@ -6349,11 +6171,9 @@
       <w:pPr>
         <w:spacing w:line="240" w:lineRule="auto"/>
       </w:pPr>
-      <w:proofErr w:type="gramStart"/>
       <w:r>
         <w:t>File :</w:t>
       </w:r>
-      <w:proofErr w:type="gramEnd"/>
       <w:r>
         <w:t xml:space="preserve"> </w:t>
       </w:r>
@@ -6437,18 +6257,13 @@
         <w:spacing w:line="240" w:lineRule="auto"/>
       </w:pPr>
       <w:r>
-        <w:t xml:space="preserve">import </w:t>
-      </w:r>
-      <w:proofErr w:type="gramStart"/>
-      <w:r>
-        <w:t xml:space="preserve">{ </w:t>
+        <w:t xml:space="preserve">import { </w:t>
       </w:r>
       <w:proofErr w:type="spellStart"/>
       <w:r>
         <w:t>apiUrl</w:t>
       </w:r>
       <w:proofErr w:type="spellEnd"/>
-      <w:proofErr w:type="gramEnd"/>
       <w:r>
         <w:t xml:space="preserve"> } from '@/app/lib/</w:t>
       </w:r>
@@ -6961,13 +6776,8 @@
       <w:pPr>
         <w:spacing w:line="240" w:lineRule="auto"/>
       </w:pPr>
-      <w:proofErr w:type="gramStart"/>
-      <w:r>
-        <w:t>File :</w:t>
-      </w:r>
-      <w:proofErr w:type="gramEnd"/>
-      <w:r>
-        <w:t xml:space="preserve"> </w:t>
+      <w:r>
+        <w:t xml:space="preserve">File : </w:t>
       </w:r>
       <w:proofErr w:type="spellStart"/>
       <w:r>
@@ -7206,14 +7016,302 @@
       <w:pPr>
         <w:spacing w:line="240" w:lineRule="auto"/>
       </w:pPr>
-      <w:r>
+    </w:p>
+    <w:p>
+      <w:pPr>
+        <w:spacing w:line="240" w:lineRule="auto"/>
+      </w:pPr>
+    </w:p>
+    <w:p>
+      <w:pPr>
+        <w:spacing w:line="240" w:lineRule="auto"/>
+      </w:pPr>
+    </w:p>
+    <w:p>
+      <w:pPr>
+        <w:spacing w:line="240" w:lineRule="auto"/>
+      </w:pPr>
+    </w:p>
+    <w:p>
+      <w:pPr>
+        <w:spacing w:line="240" w:lineRule="auto"/>
+      </w:pPr>
+    </w:p>
+    <w:p>
+      <w:pPr>
+        <w:spacing w:line="240" w:lineRule="auto"/>
+      </w:pPr>
+    </w:p>
+    <w:p>
+      <w:pPr>
+        <w:spacing w:line="240" w:lineRule="auto"/>
+      </w:pPr>
+    </w:p>
+    <w:p>
+      <w:pPr>
+        <w:spacing w:line="240" w:lineRule="auto"/>
+      </w:pPr>
+    </w:p>
+    <w:p>
+      <w:pPr>
+        <w:spacing w:line="240" w:lineRule="auto"/>
+      </w:pPr>
+    </w:p>
+    <w:p>
+      <w:pPr>
+        <w:spacing w:line="240" w:lineRule="auto"/>
+      </w:pPr>
+    </w:p>
+    <w:p>
+      <w:pPr>
+        <w:spacing w:line="240" w:lineRule="auto"/>
+      </w:pPr>
+    </w:p>
+    <w:p>
+      <w:pPr>
+        <w:spacing w:line="240" w:lineRule="auto"/>
+      </w:pPr>
+    </w:p>
+    <w:p>
+      <w:pPr>
+        <w:spacing w:line="240" w:lineRule="auto"/>
+      </w:pPr>
+    </w:p>
+    <w:p>
+      <w:pPr>
+        <w:spacing w:line="240" w:lineRule="auto"/>
+      </w:pPr>
+      <w:r>
+        <w:lastRenderedPageBreak/>
         <w:t xml:space="preserve">14. </w:t>
       </w:r>
-    </w:p>
-    <w:p>
-      <w:pPr>
-        <w:spacing w:line="240" w:lineRule="auto"/>
-      </w:pPr>
+      <w:r>
+        <w:t xml:space="preserve">Update </w:t>
+      </w:r>
+      <w:proofErr w:type="spellStart"/>
+      <w:r>
+        <w:t>koding</w:t>
+      </w:r>
+      <w:proofErr w:type="spellEnd"/>
+      <w:r>
+        <w:t xml:space="preserve"> file </w:t>
+      </w:r>
+      <w:proofErr w:type="spellStart"/>
+      <w:r>
+        <w:t>edit.ts</w:t>
+      </w:r>
+      <w:proofErr w:type="spellEnd"/>
+    </w:p>
+    <w:p>
+      <w:pPr>
+        <w:spacing w:line="240" w:lineRule="auto"/>
+      </w:pPr>
+      <w:r>
+        <w:t>File :</w:t>
+      </w:r>
+      <w:r>
+        <w:t xml:space="preserve"> </w:t>
+      </w:r>
+      <w:proofErr w:type="spellStart"/>
+      <w:r>
+        <w:t>wisata-CPMApp</w:t>
+      </w:r>
+      <w:proofErr w:type="spellEnd"/>
+      <w:r>
+        <w:t>\user\app\lib\admin\utils\</w:t>
+      </w:r>
+      <w:proofErr w:type="spellStart"/>
+      <w:r>
+        <w:t>edit.ts</w:t>
+      </w:r>
+      <w:proofErr w:type="spellEnd"/>
+    </w:p>
+    <w:p>
+      <w:pPr>
+        <w:spacing w:line="240" w:lineRule="auto"/>
+      </w:pPr>
+      <w:r>
+        <w:rPr>
+          <w:noProof/>
+        </w:rPr>
+        <w:drawing>
+          <wp:inline distT="0" distB="0" distL="0" distR="0" wp14:anchorId="06594C54" wp14:editId="06F6559E">
+            <wp:extent cx="5731510" cy="3222625"/>
+            <wp:effectExtent l="0" t="0" r="2540" b="0"/>
+            <wp:docPr id="188324249" name="Picture 1"/>
+            <wp:cNvGraphicFramePr>
+              <a:graphicFrameLocks xmlns:a="http://schemas.openxmlformats.org/drawingml/2006/main" noChangeAspect="1"/>
+            </wp:cNvGraphicFramePr>
+            <a:graphic xmlns:a="http://schemas.openxmlformats.org/drawingml/2006/main">
+              <a:graphicData uri="http://schemas.openxmlformats.org/drawingml/2006/picture">
+                <pic:pic xmlns:pic="http://schemas.openxmlformats.org/drawingml/2006/picture">
+                  <pic:nvPicPr>
+                    <pic:cNvPr id="188324249" name=""/>
+                    <pic:cNvPicPr/>
+                  </pic:nvPicPr>
+                  <pic:blipFill>
+                    <a:blip r:embed="rId19"/>
+                    <a:stretch>
+                      <a:fillRect/>
+                    </a:stretch>
+                  </pic:blipFill>
+                  <pic:spPr>
+                    <a:xfrm>
+                      <a:off x="0" y="0"/>
+                      <a:ext cx="5731510" cy="3222625"/>
+                    </a:xfrm>
+                    <a:prstGeom prst="rect">
+                      <a:avLst/>
+                    </a:prstGeom>
+                  </pic:spPr>
+                </pic:pic>
+              </a:graphicData>
+            </a:graphic>
+          </wp:inline>
+        </w:drawing>
+      </w:r>
+    </w:p>
+    <w:p>
+      <w:pPr>
+        <w:spacing w:line="240" w:lineRule="auto"/>
+      </w:pPr>
+    </w:p>
+    <w:p>
+      <w:pPr>
+        <w:spacing w:line="240" w:lineRule="auto"/>
+      </w:pPr>
+      <w:proofErr w:type="spellStart"/>
+      <w:r>
+        <w:t>const</w:t>
+      </w:r>
+      <w:proofErr w:type="spellEnd"/>
+      <w:r>
+        <w:t xml:space="preserve"> BASE_URL = 'http://10.0.2.2:3000';</w:t>
+      </w:r>
+    </w:p>
+    <w:p>
+      <w:pPr>
+        <w:spacing w:line="240" w:lineRule="auto"/>
+      </w:pPr>
+      <w:r>
+        <w:t xml:space="preserve">di </w:t>
+      </w:r>
+      <w:proofErr w:type="spellStart"/>
+      <w:r>
+        <w:t>rubah</w:t>
+      </w:r>
+      <w:proofErr w:type="spellEnd"/>
+      <w:r>
+        <w:t xml:space="preserve"> </w:t>
+      </w:r>
+      <w:proofErr w:type="spellStart"/>
+      <w:r>
+        <w:t>menjadi</w:t>
+      </w:r>
+      <w:proofErr w:type="spellEnd"/>
+      <w:r>
+        <w:t xml:space="preserve"> :</w:t>
+      </w:r>
+    </w:p>
+    <w:p>
+      <w:pPr>
+        <w:spacing w:line="240" w:lineRule="auto"/>
+      </w:pPr>
+      <w:r>
+        <w:t xml:space="preserve">import { </w:t>
+      </w:r>
+      <w:proofErr w:type="spellStart"/>
+      <w:r>
+        <w:t>apiUrl</w:t>
+      </w:r>
+      <w:proofErr w:type="spellEnd"/>
+      <w:r>
+        <w:t xml:space="preserve"> } from '@/app/lib/</w:t>
+      </w:r>
+      <w:proofErr w:type="spellStart"/>
+      <w:r>
+        <w:t>api</w:t>
+      </w:r>
+      <w:proofErr w:type="spellEnd"/>
+      <w:r>
+        <w:t>';</w:t>
+      </w:r>
+    </w:p>
+    <w:p>
+      <w:pPr>
+        <w:spacing w:line="240" w:lineRule="auto"/>
+      </w:pPr>
+    </w:p>
+    <w:p>
+      <w:pPr>
+        <w:spacing w:line="240" w:lineRule="auto"/>
+      </w:pPr>
+      <w:r>
+        <w:t>`${BASE_URL</w:t>
+      </w:r>
+    </w:p>
+    <w:p>
+      <w:pPr>
+        <w:spacing w:line="240" w:lineRule="auto"/>
+      </w:pPr>
+      <w:proofErr w:type="spellStart"/>
+      <w:r>
+        <w:t>Semuanya</w:t>
+      </w:r>
+      <w:proofErr w:type="spellEnd"/>
+      <w:r>
+        <w:t xml:space="preserve"> </w:t>
+      </w:r>
+      <w:proofErr w:type="spellStart"/>
+      <w:r>
+        <w:t>diganti</w:t>
+      </w:r>
+      <w:proofErr w:type="spellEnd"/>
+      <w:r>
+        <w:t xml:space="preserve"> </w:t>
+      </w:r>
+      <w:proofErr w:type="spellStart"/>
+      <w:r>
+        <w:t>dengan</w:t>
+      </w:r>
+      <w:proofErr w:type="spellEnd"/>
+      <w:r>
+        <w:t xml:space="preserve"> :</w:t>
+      </w:r>
+    </w:p>
+    <w:p>
+      <w:pPr>
+        <w:spacing w:line="240" w:lineRule="auto"/>
+      </w:pPr>
+      <w:proofErr w:type="spellStart"/>
+      <w:r>
+        <w:t>apiUrl</w:t>
+      </w:r>
+      <w:proofErr w:type="spellEnd"/>
+      <w:r>
+        <w:t>(`</w:t>
+      </w:r>
+    </w:p>
+    <w:p>
+      <w:pPr>
+        <w:spacing w:line="240" w:lineRule="auto"/>
+      </w:pPr>
+    </w:p>
+    <w:p>
+      <w:pPr>
+        <w:spacing w:line="240" w:lineRule="auto"/>
+      </w:pPr>
+      <w:r>
+        <w:t xml:space="preserve">15. </w:t>
+      </w:r>
+    </w:p>
+    <w:p>
+      <w:pPr>
+        <w:spacing w:line="240" w:lineRule="auto"/>
+      </w:pPr>
+      <w:r>
+        <w:t xml:space="preserve">File : </w:t>
+      </w:r>
     </w:p>
     <w:sectPr>
       <w:pgSz w:w="11906" w:h="16838"/>

</xml_diff>

<commit_message>
Update koding index.tsx. pada File : wisata-CPMApp\user\app\customer\tabs\index.tsx
</commit_message>
<xml_diff>
--- a/Dokumentasi/24382001P_Lorensius Firngadi_Dokumentasi Sesi 3.docx
+++ b/Dokumentasi/24382001P_Lorensius Firngadi_Dokumentasi Sesi 3.docx
@@ -7800,6 +7800,496 @@
         <w:spacing w:line="240" w:lineRule="auto"/>
       </w:pPr>
     </w:p>
+    <w:p>
+      <w:pPr>
+        <w:spacing w:line="240" w:lineRule="auto"/>
+      </w:pPr>
+    </w:p>
+    <w:p>
+      <w:pPr>
+        <w:spacing w:line="240" w:lineRule="auto"/>
+      </w:pPr>
+    </w:p>
+    <w:p>
+      <w:pPr>
+        <w:spacing w:line="240" w:lineRule="auto"/>
+      </w:pPr>
+    </w:p>
+    <w:p>
+      <w:pPr>
+        <w:spacing w:line="240" w:lineRule="auto"/>
+      </w:pPr>
+    </w:p>
+    <w:p>
+      <w:pPr>
+        <w:spacing w:line="240" w:lineRule="auto"/>
+      </w:pPr>
+    </w:p>
+    <w:p>
+      <w:pPr>
+        <w:spacing w:line="240" w:lineRule="auto"/>
+      </w:pPr>
+    </w:p>
+    <w:p>
+      <w:pPr>
+        <w:spacing w:line="240" w:lineRule="auto"/>
+      </w:pPr>
+    </w:p>
+    <w:p>
+      <w:pPr>
+        <w:spacing w:line="240" w:lineRule="auto"/>
+      </w:pPr>
+    </w:p>
+    <w:p>
+      <w:pPr>
+        <w:spacing w:line="240" w:lineRule="auto"/>
+      </w:pPr>
+      <w:r>
+        <w:lastRenderedPageBreak/>
+        <w:t xml:space="preserve">17. Update </w:t>
+      </w:r>
+      <w:proofErr w:type="spellStart"/>
+      <w:r>
+        <w:t>kosing</w:t>
+      </w:r>
+      <w:proofErr w:type="spellEnd"/>
+      <w:r>
+        <w:t xml:space="preserve"> file </w:t>
+      </w:r>
+      <w:proofErr w:type="spellStart"/>
+      <w:r>
+        <w:t>index.tsx</w:t>
+      </w:r>
+      <w:proofErr w:type="spellEnd"/>
+      <w:r>
+        <w:t>.</w:t>
+      </w:r>
+    </w:p>
+    <w:p>
+      <w:pPr>
+        <w:spacing w:line="240" w:lineRule="auto"/>
+      </w:pPr>
+      <w:r>
+        <w:t xml:space="preserve">File : </w:t>
+      </w:r>
+      <w:proofErr w:type="spellStart"/>
+      <w:r>
+        <w:t>wisata-CPMApp</w:t>
+      </w:r>
+      <w:proofErr w:type="spellEnd"/>
+      <w:r>
+        <w:t>\user\app\customer\tabs\</w:t>
+      </w:r>
+      <w:proofErr w:type="spellStart"/>
+      <w:r>
+        <w:t>index.tsx</w:t>
+      </w:r>
+      <w:proofErr w:type="spellEnd"/>
+    </w:p>
+    <w:p>
+      <w:pPr>
+        <w:spacing w:line="240" w:lineRule="auto"/>
+      </w:pPr>
+      <w:r>
+        <w:rPr>
+          <w:noProof/>
+        </w:rPr>
+        <w:drawing>
+          <wp:inline distT="0" distB="0" distL="0" distR="0" wp14:anchorId="782432A9" wp14:editId="70EA62DD">
+            <wp:extent cx="5731510" cy="3222625"/>
+            <wp:effectExtent l="0" t="0" r="2540" b="0"/>
+            <wp:docPr id="1015065271" name="Picture 1"/>
+            <wp:cNvGraphicFramePr>
+              <a:graphicFrameLocks xmlns:a="http://schemas.openxmlformats.org/drawingml/2006/main" noChangeAspect="1"/>
+            </wp:cNvGraphicFramePr>
+            <a:graphic xmlns:a="http://schemas.openxmlformats.org/drawingml/2006/main">
+              <a:graphicData uri="http://schemas.openxmlformats.org/drawingml/2006/picture">
+                <pic:pic xmlns:pic="http://schemas.openxmlformats.org/drawingml/2006/picture">
+                  <pic:nvPicPr>
+                    <pic:cNvPr id="1015065271" name=""/>
+                    <pic:cNvPicPr/>
+                  </pic:nvPicPr>
+                  <pic:blipFill>
+                    <a:blip r:embed="rId22"/>
+                    <a:stretch>
+                      <a:fillRect/>
+                    </a:stretch>
+                  </pic:blipFill>
+                  <pic:spPr>
+                    <a:xfrm>
+                      <a:off x="0" y="0"/>
+                      <a:ext cx="5731510" cy="3222625"/>
+                    </a:xfrm>
+                    <a:prstGeom prst="rect">
+                      <a:avLst/>
+                    </a:prstGeom>
+                  </pic:spPr>
+                </pic:pic>
+              </a:graphicData>
+            </a:graphic>
+          </wp:inline>
+        </w:drawing>
+      </w:r>
+    </w:p>
+    <w:p>
+      <w:pPr>
+        <w:spacing w:after="0" w:line="240" w:lineRule="auto"/>
+        <w:contextualSpacing/>
+      </w:pPr>
+      <w:r>
+        <w:t xml:space="preserve">import { </w:t>
+      </w:r>
+      <w:proofErr w:type="spellStart"/>
+      <w:r>
+        <w:t>apiImageUrl</w:t>
+      </w:r>
+      <w:proofErr w:type="spellEnd"/>
+      <w:r>
+        <w:t xml:space="preserve"> } from "@/app/lib/</w:t>
+      </w:r>
+      <w:proofErr w:type="spellStart"/>
+      <w:r>
+        <w:t>api</w:t>
+      </w:r>
+      <w:proofErr w:type="spellEnd"/>
+      <w:r>
+        <w:t>";</w:t>
+      </w:r>
+    </w:p>
+    <w:p>
+      <w:pPr>
+        <w:spacing w:after="0" w:line="240" w:lineRule="auto"/>
+        <w:contextualSpacing/>
+      </w:pPr>
+      <w:proofErr w:type="spellStart"/>
+      <w:r>
+        <w:t>Fungsinya</w:t>
+      </w:r>
+      <w:proofErr w:type="spellEnd"/>
+      <w:r>
+        <w:t xml:space="preserve"> </w:t>
+      </w:r>
+      <w:r>
+        <w:t>:</w:t>
+      </w:r>
+      <w:r>
+        <w:t xml:space="preserve"> </w:t>
+      </w:r>
+      <w:proofErr w:type="spellStart"/>
+      <w:r>
+        <w:t>adalah</w:t>
+      </w:r>
+      <w:proofErr w:type="spellEnd"/>
+      <w:r>
+        <w:t xml:space="preserve"> </w:t>
+      </w:r>
+      <w:proofErr w:type="spellStart"/>
+      <w:r>
+        <w:t>langkah</w:t>
+      </w:r>
+      <w:proofErr w:type="spellEnd"/>
+      <w:r>
+        <w:t xml:space="preserve"> </w:t>
+      </w:r>
+      <w:proofErr w:type="spellStart"/>
+      <w:r>
+        <w:t>untuk</w:t>
+      </w:r>
+      <w:proofErr w:type="spellEnd"/>
+      <w:r>
+        <w:t xml:space="preserve"> </w:t>
+      </w:r>
+      <w:proofErr w:type="spellStart"/>
+      <w:r>
+        <w:t>memanggil</w:t>
+      </w:r>
+      <w:proofErr w:type="spellEnd"/>
+      <w:r>
+        <w:t> </w:t>
+      </w:r>
+      <w:proofErr w:type="spellStart"/>
+      <w:r>
+        <w:t>Mesin</w:t>
+      </w:r>
+      <w:proofErr w:type="spellEnd"/>
+      <w:r>
+        <w:t xml:space="preserve"> </w:t>
+      </w:r>
+      <w:proofErr w:type="spellStart"/>
+      <w:r>
+        <w:t>Pengatur</w:t>
+      </w:r>
+      <w:proofErr w:type="spellEnd"/>
+      <w:r>
+        <w:t xml:space="preserve"> Link Gambar</w:t>
+      </w:r>
+      <w:r>
+        <w:t xml:space="preserve"> </w:t>
+      </w:r>
+      <w:proofErr w:type="spellStart"/>
+      <w:r>
+        <w:t>dalam</w:t>
+      </w:r>
+      <w:proofErr w:type="spellEnd"/>
+      <w:r>
+        <w:t xml:space="preserve"> database</w:t>
+      </w:r>
+      <w:r>
+        <w:t>.</w:t>
+      </w:r>
+    </w:p>
+    <w:p>
+      <w:pPr>
+        <w:spacing w:after="0" w:line="240" w:lineRule="auto"/>
+        <w:contextualSpacing/>
+      </w:pPr>
+    </w:p>
+    <w:p>
+      <w:pPr>
+        <w:spacing w:after="0" w:line="240" w:lineRule="auto"/>
+        <w:contextualSpacing/>
+      </w:pPr>
+      <w:proofErr w:type="spellStart"/>
+      <w:r>
+        <w:t>uri</w:t>
+      </w:r>
+      <w:proofErr w:type="spellEnd"/>
+      <w:r>
+        <w:t xml:space="preserve">: </w:t>
+      </w:r>
+      <w:proofErr w:type="spellStart"/>
+      <w:r>
+        <w:t>apiImageUrl</w:t>
+      </w:r>
+      <w:proofErr w:type="spellEnd"/>
+      <w:r>
+        <w:t>(</w:t>
+      </w:r>
+      <w:proofErr w:type="spellStart"/>
+      <w:r>
+        <w:t>item.galeri</w:t>
+      </w:r>
+      <w:proofErr w:type="spellEnd"/>
+      <w:r>
+        <w:t>?.[0]?.</w:t>
+      </w:r>
+      <w:proofErr w:type="spellStart"/>
+      <w:r>
+        <w:t>url</w:t>
+      </w:r>
+      <w:proofErr w:type="spellEnd"/>
+      <w:r>
+        <w:t>) || ...</w:t>
+      </w:r>
+    </w:p>
+    <w:p>
+      <w:pPr>
+        <w:spacing w:after="0" w:line="240" w:lineRule="auto"/>
+        <w:contextualSpacing/>
+      </w:pPr>
+      <w:proofErr w:type="spellStart"/>
+      <w:r>
+        <w:t>U</w:t>
+      </w:r>
+      <w:r>
+        <w:t>ntuk</w:t>
+      </w:r>
+      <w:proofErr w:type="spellEnd"/>
+      <w:r>
+        <w:t xml:space="preserve"> </w:t>
+      </w:r>
+      <w:proofErr w:type="spellStart"/>
+      <w:r>
+        <w:t>menampilkan</w:t>
+      </w:r>
+      <w:proofErr w:type="spellEnd"/>
+      <w:r>
+        <w:t xml:space="preserve"> </w:t>
+      </w:r>
+      <w:proofErr w:type="spellStart"/>
+      <w:r>
+        <w:t>gambar</w:t>
+      </w:r>
+      <w:proofErr w:type="spellEnd"/>
+      <w:r>
+        <w:t xml:space="preserve"> pada </w:t>
+      </w:r>
+      <w:proofErr w:type="spellStart"/>
+      <w:r>
+        <w:t>layar</w:t>
+      </w:r>
+      <w:proofErr w:type="spellEnd"/>
+      <w:r>
+        <w:t xml:space="preserve"> HP. </w:t>
+      </w:r>
+    </w:p>
+    <w:p>
+      <w:pPr>
+        <w:spacing w:line="240" w:lineRule="auto"/>
+      </w:pPr>
+    </w:p>
+    <w:p>
+      <w:pPr>
+        <w:spacing w:line="240" w:lineRule="auto"/>
+      </w:pPr>
+      <w:proofErr w:type="spellStart"/>
+      <w:r>
+        <w:t>B</w:t>
+      </w:r>
+      <w:r>
+        <w:t>erfungsi</w:t>
+      </w:r>
+      <w:proofErr w:type="spellEnd"/>
+      <w:r>
+        <w:t xml:space="preserve"> </w:t>
+      </w:r>
+      <w:proofErr w:type="spellStart"/>
+      <w:r>
+        <w:t>untuk</w:t>
+      </w:r>
+      <w:proofErr w:type="spellEnd"/>
+      <w:r>
+        <w:t xml:space="preserve"> </w:t>
+      </w:r>
+      <w:proofErr w:type="spellStart"/>
+      <w:r>
+        <w:t>Mencari</w:t>
+      </w:r>
+      <w:proofErr w:type="spellEnd"/>
+      <w:r>
+        <w:t xml:space="preserve"> </w:t>
+      </w:r>
+      <w:proofErr w:type="spellStart"/>
+      <w:r>
+        <w:t>foto</w:t>
+      </w:r>
+      <w:proofErr w:type="spellEnd"/>
+      <w:r>
+        <w:t xml:space="preserve"> </w:t>
+      </w:r>
+      <w:proofErr w:type="spellStart"/>
+      <w:r>
+        <w:t>wisata</w:t>
+      </w:r>
+      <w:proofErr w:type="spellEnd"/>
+      <w:r>
+        <w:t xml:space="preserve">, </w:t>
+      </w:r>
+      <w:proofErr w:type="spellStart"/>
+      <w:r>
+        <w:t>mengubahnya</w:t>
+      </w:r>
+      <w:proofErr w:type="spellEnd"/>
+      <w:r>
+        <w:t xml:space="preserve"> </w:t>
+      </w:r>
+      <w:proofErr w:type="spellStart"/>
+      <w:r>
+        <w:t>menjadi</w:t>
+      </w:r>
+      <w:proofErr w:type="spellEnd"/>
+      <w:r>
+        <w:t xml:space="preserve"> </w:t>
+      </w:r>
+      <w:proofErr w:type="spellStart"/>
+      <w:r>
+        <w:t>alamat</w:t>
+      </w:r>
+      <w:proofErr w:type="spellEnd"/>
+      <w:r>
+        <w:t xml:space="preserve"> yang </w:t>
+      </w:r>
+      <w:proofErr w:type="spellStart"/>
+      <w:r>
+        <w:t>bisa</w:t>
+      </w:r>
+      <w:proofErr w:type="spellEnd"/>
+      <w:r>
+        <w:t xml:space="preserve"> </w:t>
+      </w:r>
+      <w:proofErr w:type="spellStart"/>
+      <w:r>
+        <w:t>dibuka</w:t>
+      </w:r>
+      <w:proofErr w:type="spellEnd"/>
+      <w:r>
+        <w:t xml:space="preserve"> HP, dan </w:t>
+      </w:r>
+      <w:proofErr w:type="spellStart"/>
+      <w:r>
+        <w:t>menyiapkan</w:t>
+      </w:r>
+      <w:proofErr w:type="spellEnd"/>
+      <w:r>
+        <w:t xml:space="preserve"> </w:t>
+      </w:r>
+      <w:proofErr w:type="spellStart"/>
+      <w:r>
+        <w:t>foto</w:t>
+      </w:r>
+      <w:proofErr w:type="spellEnd"/>
+      <w:r>
+        <w:t xml:space="preserve"> </w:t>
+      </w:r>
+      <w:proofErr w:type="spellStart"/>
+      <w:r>
+        <w:t>cadangan</w:t>
+      </w:r>
+      <w:proofErr w:type="spellEnd"/>
+      <w:r>
+        <w:t xml:space="preserve"> </w:t>
+      </w:r>
+      <w:proofErr w:type="spellStart"/>
+      <w:r>
+        <w:t>jika</w:t>
+      </w:r>
+      <w:proofErr w:type="spellEnd"/>
+      <w:r>
+        <w:t xml:space="preserve"> </w:t>
+      </w:r>
+      <w:proofErr w:type="spellStart"/>
+      <w:r>
+        <w:t>fotonya</w:t>
+      </w:r>
+      <w:proofErr w:type="spellEnd"/>
+      <w:r>
+        <w:t xml:space="preserve"> </w:t>
+      </w:r>
+      <w:proofErr w:type="spellStart"/>
+      <w:r>
+        <w:t>tidak</w:t>
+      </w:r>
+      <w:proofErr w:type="spellEnd"/>
+      <w:r>
+        <w:t xml:space="preserve"> </w:t>
+      </w:r>
+      <w:proofErr w:type="spellStart"/>
+      <w:r>
+        <w:t>ditemukan</w:t>
+      </w:r>
+      <w:proofErr w:type="spellEnd"/>
+      <w:r>
+        <w:t>.</w:t>
+      </w:r>
+    </w:p>
+    <w:p>
+      <w:pPr>
+        <w:spacing w:line="240" w:lineRule="auto"/>
+      </w:pPr>
+    </w:p>
+    <w:p>
+      <w:pPr>
+        <w:spacing w:line="240" w:lineRule="auto"/>
+      </w:pPr>
+    </w:p>
+    <w:p>
+      <w:pPr>
+        <w:spacing w:line="240" w:lineRule="auto"/>
+      </w:pPr>
+      <w:r>
+        <w:t xml:space="preserve">18. </w:t>
+      </w:r>
+    </w:p>
     <w:sectPr>
       <w:pgSz w:w="11906" w:h="16838"/>
       <w:pgMar w:top="1440" w:right="1440" w:bottom="1440" w:left="1440" w:header="708" w:footer="708" w:gutter="0"/>
@@ -7926,6 +8416,155 @@
     </w:lvl>
   </w:abstractNum>
   <w:abstractNum w:abstractNumId="1" w15:restartNumberingAfterBreak="0">
+    <w:nsid w:val="1E500F48"/>
+    <w:multiLevelType w:val="multilevel"/>
+    <w:tmpl w:val="EDA0A814"/>
+    <w:lvl w:ilvl="0">
+      <w:start w:val="1"/>
+      <w:numFmt w:val="bullet"/>
+      <w:lvlText w:val=""/>
+      <w:lvlJc w:val="left"/>
+      <w:pPr>
+        <w:tabs>
+          <w:tab w:val="num" w:pos="720"/>
+        </w:tabs>
+        <w:ind w:left="720" w:hanging="360"/>
+      </w:pPr>
+      <w:rPr>
+        <w:rFonts w:ascii="Symbol" w:hAnsi="Symbol" w:hint="default"/>
+        <w:sz w:val="20"/>
+      </w:rPr>
+    </w:lvl>
+    <w:lvl w:ilvl="1">
+      <w:start w:val="1"/>
+      <w:numFmt w:val="bullet"/>
+      <w:lvlText w:val="o"/>
+      <w:lvlJc w:val="left"/>
+      <w:pPr>
+        <w:tabs>
+          <w:tab w:val="num" w:pos="1440"/>
+        </w:tabs>
+        <w:ind w:left="1440" w:hanging="360"/>
+      </w:pPr>
+      <w:rPr>
+        <w:rFonts w:ascii="Courier New" w:hAnsi="Courier New" w:hint="default"/>
+        <w:sz w:val="20"/>
+      </w:rPr>
+    </w:lvl>
+    <w:lvl w:ilvl="2" w:tentative="1">
+      <w:start w:val="1"/>
+      <w:numFmt w:val="bullet"/>
+      <w:lvlText w:val=""/>
+      <w:lvlJc w:val="left"/>
+      <w:pPr>
+        <w:tabs>
+          <w:tab w:val="num" w:pos="2160"/>
+        </w:tabs>
+        <w:ind w:left="2160" w:hanging="360"/>
+      </w:pPr>
+      <w:rPr>
+        <w:rFonts w:ascii="Wingdings" w:hAnsi="Wingdings" w:hint="default"/>
+        <w:sz w:val="20"/>
+      </w:rPr>
+    </w:lvl>
+    <w:lvl w:ilvl="3" w:tentative="1">
+      <w:start w:val="1"/>
+      <w:numFmt w:val="bullet"/>
+      <w:lvlText w:val=""/>
+      <w:lvlJc w:val="left"/>
+      <w:pPr>
+        <w:tabs>
+          <w:tab w:val="num" w:pos="2880"/>
+        </w:tabs>
+        <w:ind w:left="2880" w:hanging="360"/>
+      </w:pPr>
+      <w:rPr>
+        <w:rFonts w:ascii="Wingdings" w:hAnsi="Wingdings" w:hint="default"/>
+        <w:sz w:val="20"/>
+      </w:rPr>
+    </w:lvl>
+    <w:lvl w:ilvl="4" w:tentative="1">
+      <w:start w:val="1"/>
+      <w:numFmt w:val="bullet"/>
+      <w:lvlText w:val=""/>
+      <w:lvlJc w:val="left"/>
+      <w:pPr>
+        <w:tabs>
+          <w:tab w:val="num" w:pos="3600"/>
+        </w:tabs>
+        <w:ind w:left="3600" w:hanging="360"/>
+      </w:pPr>
+      <w:rPr>
+        <w:rFonts w:ascii="Wingdings" w:hAnsi="Wingdings" w:hint="default"/>
+        <w:sz w:val="20"/>
+      </w:rPr>
+    </w:lvl>
+    <w:lvl w:ilvl="5" w:tentative="1">
+      <w:start w:val="1"/>
+      <w:numFmt w:val="bullet"/>
+      <w:lvlText w:val=""/>
+      <w:lvlJc w:val="left"/>
+      <w:pPr>
+        <w:tabs>
+          <w:tab w:val="num" w:pos="4320"/>
+        </w:tabs>
+        <w:ind w:left="4320" w:hanging="360"/>
+      </w:pPr>
+      <w:rPr>
+        <w:rFonts w:ascii="Wingdings" w:hAnsi="Wingdings" w:hint="default"/>
+        <w:sz w:val="20"/>
+      </w:rPr>
+    </w:lvl>
+    <w:lvl w:ilvl="6" w:tentative="1">
+      <w:start w:val="1"/>
+      <w:numFmt w:val="bullet"/>
+      <w:lvlText w:val=""/>
+      <w:lvlJc w:val="left"/>
+      <w:pPr>
+        <w:tabs>
+          <w:tab w:val="num" w:pos="5040"/>
+        </w:tabs>
+        <w:ind w:left="5040" w:hanging="360"/>
+      </w:pPr>
+      <w:rPr>
+        <w:rFonts w:ascii="Wingdings" w:hAnsi="Wingdings" w:hint="default"/>
+        <w:sz w:val="20"/>
+      </w:rPr>
+    </w:lvl>
+    <w:lvl w:ilvl="7" w:tentative="1">
+      <w:start w:val="1"/>
+      <w:numFmt w:val="bullet"/>
+      <w:lvlText w:val=""/>
+      <w:lvlJc w:val="left"/>
+      <w:pPr>
+        <w:tabs>
+          <w:tab w:val="num" w:pos="5760"/>
+        </w:tabs>
+        <w:ind w:left="5760" w:hanging="360"/>
+      </w:pPr>
+      <w:rPr>
+        <w:rFonts w:ascii="Wingdings" w:hAnsi="Wingdings" w:hint="default"/>
+        <w:sz w:val="20"/>
+      </w:rPr>
+    </w:lvl>
+    <w:lvl w:ilvl="8" w:tentative="1">
+      <w:start w:val="1"/>
+      <w:numFmt w:val="bullet"/>
+      <w:lvlText w:val=""/>
+      <w:lvlJc w:val="left"/>
+      <w:pPr>
+        <w:tabs>
+          <w:tab w:val="num" w:pos="6480"/>
+        </w:tabs>
+        <w:ind w:left="6480" w:hanging="360"/>
+      </w:pPr>
+      <w:rPr>
+        <w:rFonts w:ascii="Wingdings" w:hAnsi="Wingdings" w:hint="default"/>
+        <w:sz w:val="20"/>
+      </w:rPr>
+    </w:lvl>
+  </w:abstractNum>
+  <w:abstractNum w:abstractNumId="2" w15:restartNumberingAfterBreak="0">
     <w:nsid w:val="255737F4"/>
     <w:multiLevelType w:val="multilevel"/>
     <w:tmpl w:val="89C6081C"/>
@@ -8074,7 +8713,7 @@
       </w:rPr>
     </w:lvl>
   </w:abstractNum>
-  <w:abstractNum w:abstractNumId="2" w15:restartNumberingAfterBreak="0">
+  <w:abstractNum w:abstractNumId="3" w15:restartNumberingAfterBreak="0">
     <w:nsid w:val="2E3E310D"/>
     <w:multiLevelType w:val="multilevel"/>
     <w:tmpl w:val="0FE2CECE"/>
@@ -8223,7 +8862,7 @@
       </w:rPr>
     </w:lvl>
   </w:abstractNum>
-  <w:abstractNum w:abstractNumId="3" w15:restartNumberingAfterBreak="0">
+  <w:abstractNum w:abstractNumId="4" w15:restartNumberingAfterBreak="0">
     <w:nsid w:val="3B2651EE"/>
     <w:multiLevelType w:val="multilevel"/>
     <w:tmpl w:val="A9B64842"/>
@@ -8372,7 +9011,7 @@
       </w:rPr>
     </w:lvl>
   </w:abstractNum>
-  <w:abstractNum w:abstractNumId="4" w15:restartNumberingAfterBreak="0">
+  <w:abstractNum w:abstractNumId="5" w15:restartNumberingAfterBreak="0">
     <w:nsid w:val="4E280CE5"/>
     <w:multiLevelType w:val="hybridMultilevel"/>
     <w:tmpl w:val="C5944EFA"/>
@@ -8485,7 +9124,7 @@
       </w:rPr>
     </w:lvl>
   </w:abstractNum>
-  <w:abstractNum w:abstractNumId="5" w15:restartNumberingAfterBreak="0">
+  <w:abstractNum w:abstractNumId="6" w15:restartNumberingAfterBreak="0">
     <w:nsid w:val="52B2306A"/>
     <w:multiLevelType w:val="multilevel"/>
     <w:tmpl w:val="28BC2570"/>
@@ -8602,7 +9241,7 @@
       </w:pPr>
     </w:lvl>
   </w:abstractNum>
-  <w:abstractNum w:abstractNumId="6" w15:restartNumberingAfterBreak="0">
+  <w:abstractNum w:abstractNumId="7" w15:restartNumberingAfterBreak="0">
     <w:nsid w:val="59AC64DE"/>
     <w:multiLevelType w:val="hybridMultilevel"/>
     <w:tmpl w:val="D556FF78"/>
@@ -8715,7 +9354,7 @@
       </w:rPr>
     </w:lvl>
   </w:abstractNum>
-  <w:abstractNum w:abstractNumId="7" w15:restartNumberingAfterBreak="0">
+  <w:abstractNum w:abstractNumId="8" w15:restartNumberingAfterBreak="0">
     <w:nsid w:val="5ECA440E"/>
     <w:multiLevelType w:val="multilevel"/>
     <w:tmpl w:val="39086EF2"/>
@@ -8864,7 +9503,7 @@
       </w:rPr>
     </w:lvl>
   </w:abstractNum>
-  <w:abstractNum w:abstractNumId="8" w15:restartNumberingAfterBreak="0">
+  <w:abstractNum w:abstractNumId="9" w15:restartNumberingAfterBreak="0">
     <w:nsid w:val="6AF63B54"/>
     <w:multiLevelType w:val="multilevel"/>
     <w:tmpl w:val="AD621050"/>
@@ -9013,7 +9652,7 @@
       </w:rPr>
     </w:lvl>
   </w:abstractNum>
-  <w:abstractNum w:abstractNumId="9" w15:restartNumberingAfterBreak="0">
+  <w:abstractNum w:abstractNumId="10" w15:restartNumberingAfterBreak="0">
     <w:nsid w:val="6BA85B18"/>
     <w:multiLevelType w:val="multilevel"/>
     <w:tmpl w:val="C93CBC46"/>
@@ -9162,7 +9801,7 @@
       </w:rPr>
     </w:lvl>
   </w:abstractNum>
-  <w:abstractNum w:abstractNumId="10" w15:restartNumberingAfterBreak="0">
+  <w:abstractNum w:abstractNumId="11" w15:restartNumberingAfterBreak="0">
     <w:nsid w:val="725901CB"/>
     <w:multiLevelType w:val="multilevel"/>
     <w:tmpl w:val="E8F6E3B2"/>
@@ -9311,7 +9950,7 @@
       </w:rPr>
     </w:lvl>
   </w:abstractNum>
-  <w:abstractNum w:abstractNumId="11" w15:restartNumberingAfterBreak="0">
+  <w:abstractNum w:abstractNumId="12" w15:restartNumberingAfterBreak="0">
     <w:nsid w:val="7AA0268F"/>
     <w:multiLevelType w:val="multilevel"/>
     <w:tmpl w:val="E2486BC0"/>
@@ -9460,7 +10099,7 @@
       </w:rPr>
     </w:lvl>
   </w:abstractNum>
-  <w:abstractNum w:abstractNumId="12" w15:restartNumberingAfterBreak="0">
+  <w:abstractNum w:abstractNumId="13" w15:restartNumberingAfterBreak="0">
     <w:nsid w:val="7B92578F"/>
     <w:multiLevelType w:val="hybridMultilevel"/>
     <w:tmpl w:val="B804E9B8"/>
@@ -9573,7 +10212,7 @@
       </w:rPr>
     </w:lvl>
   </w:abstractNum>
-  <w:abstractNum w:abstractNumId="13" w15:restartNumberingAfterBreak="0">
+  <w:abstractNum w:abstractNumId="14" w15:restartNumberingAfterBreak="0">
     <w:nsid w:val="7BE726BE"/>
     <w:multiLevelType w:val="multilevel"/>
     <w:tmpl w:val="14AE9B48"/>
@@ -9722,7 +10361,7 @@
       </w:rPr>
     </w:lvl>
   </w:abstractNum>
-  <w:abstractNum w:abstractNumId="14" w15:restartNumberingAfterBreak="0">
+  <w:abstractNum w:abstractNumId="15" w15:restartNumberingAfterBreak="0">
     <w:nsid w:val="7DD5389E"/>
     <w:multiLevelType w:val="hybridMultilevel"/>
     <w:tmpl w:val="6840CD52"/>
@@ -9836,49 +10475,52 @@
     </w:lvl>
   </w:abstractNum>
   <w:num w:numId="1" w16cid:durableId="775180286">
-    <w:abstractNumId w:val="12"/>
+    <w:abstractNumId w:val="13"/>
   </w:num>
   <w:num w:numId="2" w16cid:durableId="1579442916">
-    <w:abstractNumId w:val="14"/>
+    <w:abstractNumId w:val="15"/>
   </w:num>
   <w:num w:numId="3" w16cid:durableId="1996445871">
     <w:abstractNumId w:val="0"/>
   </w:num>
   <w:num w:numId="4" w16cid:durableId="982202006">
+    <w:abstractNumId w:val="7"/>
+  </w:num>
+  <w:num w:numId="5" w16cid:durableId="2119370406">
+    <w:abstractNumId w:val="5"/>
+  </w:num>
+  <w:num w:numId="6" w16cid:durableId="1063062556">
+    <w:abstractNumId w:val="10"/>
+  </w:num>
+  <w:num w:numId="7" w16cid:durableId="1353610240">
     <w:abstractNumId w:val="6"/>
   </w:num>
-  <w:num w:numId="5" w16cid:durableId="2119370406">
+  <w:num w:numId="8" w16cid:durableId="905185883">
+    <w:abstractNumId w:val="2"/>
+  </w:num>
+  <w:num w:numId="9" w16cid:durableId="671614104">
+    <w:abstractNumId w:val="3"/>
+  </w:num>
+  <w:num w:numId="10" w16cid:durableId="1140342277">
+    <w:abstractNumId w:val="14"/>
+  </w:num>
+  <w:num w:numId="11" w16cid:durableId="279798585">
+    <w:abstractNumId w:val="12"/>
+  </w:num>
+  <w:num w:numId="12" w16cid:durableId="1854026150">
+    <w:abstractNumId w:val="8"/>
+  </w:num>
+  <w:num w:numId="13" w16cid:durableId="1603954273">
+    <w:abstractNumId w:val="11"/>
+  </w:num>
+  <w:num w:numId="14" w16cid:durableId="775751699">
     <w:abstractNumId w:val="4"/>
   </w:num>
-  <w:num w:numId="6" w16cid:durableId="1063062556">
+  <w:num w:numId="15" w16cid:durableId="435755312">
     <w:abstractNumId w:val="9"/>
   </w:num>
-  <w:num w:numId="7" w16cid:durableId="1353610240">
-    <w:abstractNumId w:val="5"/>
-  </w:num>
-  <w:num w:numId="8" w16cid:durableId="905185883">
+  <w:num w:numId="16" w16cid:durableId="952900939">
     <w:abstractNumId w:val="1"/>
-  </w:num>
-  <w:num w:numId="9" w16cid:durableId="671614104">
-    <w:abstractNumId w:val="2"/>
-  </w:num>
-  <w:num w:numId="10" w16cid:durableId="1140342277">
-    <w:abstractNumId w:val="13"/>
-  </w:num>
-  <w:num w:numId="11" w16cid:durableId="279798585">
-    <w:abstractNumId w:val="11"/>
-  </w:num>
-  <w:num w:numId="12" w16cid:durableId="1854026150">
-    <w:abstractNumId w:val="7"/>
-  </w:num>
-  <w:num w:numId="13" w16cid:durableId="1603954273">
-    <w:abstractNumId w:val="10"/>
-  </w:num>
-  <w:num w:numId="14" w16cid:durableId="775751699">
-    <w:abstractNumId w:val="3"/>
-  </w:num>
-  <w:num w:numId="15" w16cid:durableId="435755312">
-    <w:abstractNumId w:val="8"/>
   </w:num>
 </w:numbering>
 </file>

</xml_diff>